<commit_message>
feat: scrub weapons defense, add 5-meal buff system, fix menu tooltips and layout, rebuild cookbook docs
</commit_message>
<xml_diff>
--- a/Potaria_Cookbook.docx
+++ b/Potaria_Cookbook.docx
@@ -135,10 +135,10 @@
       </w:tblPr>
       <w:tblGrid>
         <w:gridCol w:w="648"/>
-        <w:gridCol w:w="1944"/>
-        <w:gridCol w:w="1512"/>
-        <w:gridCol w:w="936"/>
-        <w:gridCol w:w="1080"/>
+        <w:gridCol w:w="1872"/>
+        <w:gridCol w:w="1368"/>
+        <w:gridCol w:w="1224"/>
+        <w:gridCol w:w="1008"/>
         <w:gridCol w:w="2376"/>
         <w:gridCol w:w="1728"/>
       </w:tblGrid>
@@ -175,7 +175,7 @@
         </w:tc>
         <w:tc>
           <w:tcPr>
-            <w:tcW w:type="dxa" w:w="1944"/>
+            <w:tcW w:type="dxa" w:w="1872"/>
             <w:shd w:fill="7B1113"/>
             <w:tcMar>
               <w:top w:w="110" w:type="dxa"/>
@@ -202,7 +202,7 @@
         </w:tc>
         <w:tc>
           <w:tcPr>
-            <w:tcW w:type="dxa" w:w="1512"/>
+            <w:tcW w:type="dxa" w:w="1368"/>
             <w:shd w:fill="7B1113"/>
             <w:tcMar>
               <w:top w:w="110" w:type="dxa"/>
@@ -229,7 +229,7 @@
         </w:tc>
         <w:tc>
           <w:tcPr>
-            <w:tcW w:type="dxa" w:w="936"/>
+            <w:tcW w:type="dxa" w:w="1224"/>
             <w:shd w:fill="7B1113"/>
             <w:tcMar>
               <w:top w:w="110" w:type="dxa"/>
@@ -256,7 +256,7 @@
         </w:tc>
         <w:tc>
           <w:tcPr>
-            <w:tcW w:type="dxa" w:w="1080"/>
+            <w:tcW w:type="dxa" w:w="1008"/>
             <w:shd w:fill="7B1113"/>
             <w:tcMar>
               <w:top w:w="110" w:type="dxa"/>
@@ -395,7 +395,7 @@
         </w:tc>
         <w:tc>
           <w:tcPr>
-            <w:tcW w:type="dxa" w:w="1944"/>
+            <w:tcW w:type="dxa" w:w="1872"/>
             <w:shd w:fill="FFFFFF"/>
             <w:tcMar>
               <w:top w:w="80" w:type="dxa"/>
@@ -423,7 +423,7 @@
         </w:tc>
         <w:tc>
           <w:tcPr>
-            <w:tcW w:type="dxa" w:w="1512"/>
+            <w:tcW w:type="dxa" w:w="1368"/>
             <w:shd w:fill="FFFFFF"/>
             <w:tcMar>
               <w:top w:w="80" w:type="dxa"/>
@@ -451,7 +451,7 @@
         </w:tc>
         <w:tc>
           <w:tcPr>
-            <w:tcW w:type="dxa" w:w="936"/>
+            <w:tcW w:type="dxa" w:w="1224"/>
             <w:shd w:fill="FFFFFF"/>
             <w:tcMar>
               <w:top w:w="80" w:type="dxa"/>
@@ -471,15 +471,17 @@
                 <w:rFonts w:ascii="Calibri" w:hAnsi="Calibri"/>
                 <w:b/>
                 <w:color w:val="228B22"/>
-                <w:sz w:val="17"/>
+                <w:sz w:val="15"/>
               </w:rPr>
               <w:t>+90 HP</w:t>
-            </w:r>
-          </w:p>
-        </w:tc>
-        <w:tc>
-          <w:tcPr>
-            <w:tcW w:type="dxa" w:w="1080"/>
+              <w:br/>
+              <w:t>[OFFENSE] +6% Physical Damage (3m)</w:t>
+            </w:r>
+          </w:p>
+        </w:tc>
+        <w:tc>
+          <w:tcPr>
+            <w:tcW w:type="dxa" w:w="1008"/>
             <w:shd w:fill="FFFFFF"/>
             <w:tcMar>
               <w:top w:w="80" w:type="dxa"/>
@@ -558,7 +560,7 @@
                 <w:color w:val="505050"/>
                 <w:sz w:val="16"/>
               </w:rPr>
-              <w:t>Simmered native chicken in vinegar, soy sauce, garlic, and cracked pepper. Restores 90 HP.</w:t>
+              <w:t>Native chicken cuts slowly braised in cane vinegar, dark soy sauce, crushed garlic, whole black peppercorns, and bay leaves until savory and tender.</w:t>
             </w:r>
           </w:p>
         </w:tc>
@@ -622,7 +624,7 @@
         </w:tc>
         <w:tc>
           <w:tcPr>
-            <w:tcW w:type="dxa" w:w="1944"/>
+            <w:tcW w:type="dxa" w:w="1872"/>
             <w:shd w:fill="FAF6F0"/>
             <w:tcMar>
               <w:top w:w="80" w:type="dxa"/>
@@ -650,7 +652,7 @@
         </w:tc>
         <w:tc>
           <w:tcPr>
-            <w:tcW w:type="dxa" w:w="1512"/>
+            <w:tcW w:type="dxa" w:w="1368"/>
             <w:shd w:fill="FAF6F0"/>
             <w:tcMar>
               <w:top w:w="80" w:type="dxa"/>
@@ -678,7 +680,7 @@
         </w:tc>
         <w:tc>
           <w:tcPr>
-            <w:tcW w:type="dxa" w:w="936"/>
+            <w:tcW w:type="dxa" w:w="1224"/>
             <w:shd w:fill="FAF6F0"/>
             <w:tcMar>
               <w:top w:w="80" w:type="dxa"/>
@@ -698,15 +700,17 @@
                 <w:rFonts w:ascii="Calibri" w:hAnsi="Calibri"/>
                 <w:b/>
                 <w:color w:val="228B22"/>
-                <w:sz w:val="17"/>
+                <w:sz w:val="15"/>
               </w:rPr>
               <w:t>+95 HP</w:t>
-            </w:r>
-          </w:p>
-        </w:tc>
-        <w:tc>
-          <w:tcPr>
-            <w:tcW w:type="dxa" w:w="1080"/>
+              <w:br/>
+              <w:t>[OFFENSE] +8% Physical Damage (3m), -3% Movement Speed (3m)</w:t>
+            </w:r>
+          </w:p>
+        </w:tc>
+        <w:tc>
+          <w:tcPr>
+            <w:tcW w:type="dxa" w:w="1008"/>
             <w:shd w:fill="FAF6F0"/>
             <w:tcMar>
               <w:top w:w="80" w:type="dxa"/>
@@ -785,7 +789,7 @@
                 <w:color w:val="505050"/>
                 <w:sz w:val="16"/>
               </w:rPr>
-              <w:t>Tender pork cubes braised with garlic, bay leaves, and tangy soy vinegar sauce. Restores 95 HP.</w:t>
+              <w:t>Succulent pork belly braised gently in aged sugarcane vinegar and aromatic garlic, producing a rich, unctuous sauce that intensifies overnight.</w:t>
             </w:r>
           </w:p>
         </w:tc>
@@ -849,7 +853,7 @@
         </w:tc>
         <w:tc>
           <w:tcPr>
-            <w:tcW w:type="dxa" w:w="1944"/>
+            <w:tcW w:type="dxa" w:w="1872"/>
             <w:shd w:fill="FFFFFF"/>
             <w:tcMar>
               <w:top w:w="80" w:type="dxa"/>
@@ -877,7 +881,7 @@
         </w:tc>
         <w:tc>
           <w:tcPr>
-            <w:tcW w:type="dxa" w:w="1512"/>
+            <w:tcW w:type="dxa" w:w="1368"/>
             <w:shd w:fill="FFFFFF"/>
             <w:tcMar>
               <w:top w:w="80" w:type="dxa"/>
@@ -905,7 +909,7 @@
         </w:tc>
         <w:tc>
           <w:tcPr>
-            <w:tcW w:type="dxa" w:w="936"/>
+            <w:tcW w:type="dxa" w:w="1224"/>
             <w:shd w:fill="FFFFFF"/>
             <w:tcMar>
               <w:top w:w="80" w:type="dxa"/>
@@ -925,15 +929,17 @@
                 <w:rFonts w:ascii="Calibri" w:hAnsi="Calibri"/>
                 <w:b/>
                 <w:color w:val="228B22"/>
-                <w:sz w:val="17"/>
+                <w:sz w:val="15"/>
               </w:rPr>
               <w:t>+105 HP</w:t>
-            </w:r>
-          </w:p>
-        </w:tc>
-        <w:tc>
-          <w:tcPr>
-            <w:tcW w:type="dxa" w:w="1080"/>
+              <w:br/>
+              <w:t>[DEFENSE] +4% Damage Reduction (3m)</w:t>
+            </w:r>
+          </w:p>
+        </w:tc>
+        <w:tc>
+          <w:tcPr>
+            <w:tcW w:type="dxa" w:w="1008"/>
             <w:shd w:fill="FFFFFF"/>
             <w:tcMar>
               <w:top w:w="80" w:type="dxa"/>
@@ -1012,7 +1018,7 @@
                 <w:color w:val="505050"/>
                 <w:sz w:val="16"/>
               </w:rPr>
-              <w:t>Tamarind-sour savory soup with tender pork and crisp vegetables. Restores 105 HP.</w:t>
+              <w:t>Tender pork ribs simmered in an invigorating crushed green tamarind broth with crisp water spinach, radish, and finger peppers for a sour, cleansing finish.</w:t>
             </w:r>
           </w:p>
         </w:tc>
@@ -1076,7 +1082,7 @@
         </w:tc>
         <w:tc>
           <w:tcPr>
-            <w:tcW w:type="dxa" w:w="1944"/>
+            <w:tcW w:type="dxa" w:w="1872"/>
             <w:shd w:fill="FAF6F0"/>
             <w:tcMar>
               <w:top w:w="80" w:type="dxa"/>
@@ -1104,7 +1110,7 @@
         </w:tc>
         <w:tc>
           <w:tcPr>
-            <w:tcW w:type="dxa" w:w="1512"/>
+            <w:tcW w:type="dxa" w:w="1368"/>
             <w:shd w:fill="FAF6F0"/>
             <w:tcMar>
               <w:top w:w="80" w:type="dxa"/>
@@ -1132,7 +1138,7 @@
         </w:tc>
         <w:tc>
           <w:tcPr>
-            <w:tcW w:type="dxa" w:w="936"/>
+            <w:tcW w:type="dxa" w:w="1224"/>
             <w:shd w:fill="FAF6F0"/>
             <w:tcMar>
               <w:top w:w="80" w:type="dxa"/>
@@ -1152,15 +1158,17 @@
                 <w:rFonts w:ascii="Calibri" w:hAnsi="Calibri"/>
                 <w:b/>
                 <w:color w:val="228B22"/>
-                <w:sz w:val="17"/>
+                <w:sz w:val="15"/>
               </w:rPr>
               <w:t>+115 HP</w:t>
-            </w:r>
-          </w:p>
-        </w:tc>
-        <w:tc>
-          <w:tcPr>
-            <w:tcW w:type="dxa" w:w="1080"/>
+              <w:br/>
+              <w:t>[DEFENSE] +3 Flat Defense (4m)</w:t>
+            </w:r>
+          </w:p>
+        </w:tc>
+        <w:tc>
+          <w:tcPr>
+            <w:tcW w:type="dxa" w:w="1008"/>
             <w:shd w:fill="FAF6F0"/>
             <w:tcMar>
               <w:top w:w="80" w:type="dxa"/>
@@ -1239,7 +1247,7 @@
                 <w:color w:val="505050"/>
                 <w:sz w:val="16"/>
               </w:rPr>
-              <w:t>Savory peanut stew with tender beef shank, eggplant, and string beans. Restores 115 HP.</w:t>
+              <w:t>Rich, velvety peanut and toasted rice stew colored with annatto oil, loaded with tender braised beef shank, banana blossom, and long beans.</w:t>
             </w:r>
           </w:p>
         </w:tc>
@@ -1303,7 +1311,7 @@
         </w:tc>
         <w:tc>
           <w:tcPr>
-            <w:tcW w:type="dxa" w:w="1944"/>
+            <w:tcW w:type="dxa" w:w="1872"/>
             <w:shd w:fill="FFFFFF"/>
             <w:tcMar>
               <w:top w:w="80" w:type="dxa"/>
@@ -1331,7 +1339,7 @@
         </w:tc>
         <w:tc>
           <w:tcPr>
-            <w:tcW w:type="dxa" w:w="1512"/>
+            <w:tcW w:type="dxa" w:w="1368"/>
             <w:shd w:fill="FFFFFF"/>
             <w:tcMar>
               <w:top w:w="80" w:type="dxa"/>
@@ -1359,7 +1367,7 @@
         </w:tc>
         <w:tc>
           <w:tcPr>
-            <w:tcW w:type="dxa" w:w="936"/>
+            <w:tcW w:type="dxa" w:w="1224"/>
             <w:shd w:fill="FFFFFF"/>
             <w:tcMar>
               <w:top w:w="80" w:type="dxa"/>
@@ -1379,15 +1387,17 @@
                 <w:rFonts w:ascii="Calibri" w:hAnsi="Calibri"/>
                 <w:b/>
                 <w:color w:val="228B22"/>
-                <w:sz w:val="17"/>
+                <w:sz w:val="15"/>
               </w:rPr>
               <w:t>+120 HP</w:t>
-            </w:r>
-          </w:p>
-        </w:tc>
-        <w:tc>
-          <w:tcPr>
-            <w:tcW w:type="dxa" w:w="1080"/>
+              <w:br/>
+              <w:t>[RESOURCE] +1 HP/sec Regeneration (4m)</w:t>
+            </w:r>
+          </w:p>
+        </w:tc>
+        <w:tc>
+          <w:tcPr>
+            <w:tcW w:type="dxa" w:w="1008"/>
             <w:shd w:fill="FFFFFF"/>
             <w:tcMar>
               <w:top w:w="80" w:type="dxa"/>
@@ -1466,7 +1476,7 @@
                 <w:color w:val="505050"/>
                 <w:sz w:val="16"/>
               </w:rPr>
-              <w:t>Slow-simmered beef shank marrow soup with sweet corn and peppercorns. Restores 120 HP.</w:t>
+              <w:t>Slow-simmered beef shank and bone marrow consommé enriched with sweet native corn and cabbage, releasing nourishing melted gelatin and rich aromatics.</w:t>
             </w:r>
           </w:p>
         </w:tc>
@@ -1530,7 +1540,7 @@
         </w:tc>
         <w:tc>
           <w:tcPr>
-            <w:tcW w:type="dxa" w:w="1944"/>
+            <w:tcW w:type="dxa" w:w="1872"/>
             <w:shd w:fill="FAF6F0"/>
             <w:tcMar>
               <w:top w:w="80" w:type="dxa"/>
@@ -1558,7 +1568,7 @@
         </w:tc>
         <w:tc>
           <w:tcPr>
-            <w:tcW w:type="dxa" w:w="1512"/>
+            <w:tcW w:type="dxa" w:w="1368"/>
             <w:shd w:fill="FAF6F0"/>
             <w:tcMar>
               <w:top w:w="80" w:type="dxa"/>
@@ -1586,7 +1596,7 @@
         </w:tc>
         <w:tc>
           <w:tcPr>
-            <w:tcW w:type="dxa" w:w="936"/>
+            <w:tcW w:type="dxa" w:w="1224"/>
             <w:shd w:fill="FAF6F0"/>
             <w:tcMar>
               <w:top w:w="80" w:type="dxa"/>
@@ -1606,15 +1616,17 @@
                 <w:rFonts w:ascii="Calibri" w:hAnsi="Calibri"/>
                 <w:b/>
                 <w:color w:val="228B22"/>
-                <w:sz w:val="17"/>
+                <w:sz w:val="15"/>
               </w:rPr>
               <w:t>+85 HP</w:t>
-            </w:r>
-          </w:p>
-        </w:tc>
-        <w:tc>
-          <w:tcPr>
-            <w:tcW w:type="dxa" w:w="1080"/>
+              <w:br/>
+              <w:t>[MOBILITY] +8% Movement Speed (3m)</w:t>
+            </w:r>
+          </w:p>
+        </w:tc>
+        <w:tc>
+          <w:tcPr>
+            <w:tcW w:type="dxa" w:w="1008"/>
             <w:shd w:fill="FAF6F0"/>
             <w:tcMar>
               <w:top w:w="80" w:type="dxa"/>
@@ -1693,7 +1705,7 @@
                 <w:color w:val="505050"/>
                 <w:sz w:val="16"/>
               </w:rPr>
-              <w:t>Comforting native chicken soup infused with warming ginger and onions. Restores 85 HP.</w:t>
+              <w:t>Fragrant clear chicken soup infused with young crushed ginger root, lemongrass, and sweet green papaya that imparts a gentle, invigorating warmth.</w:t>
             </w:r>
           </w:p>
         </w:tc>
@@ -1757,7 +1769,7 @@
         </w:tc>
         <w:tc>
           <w:tcPr>
-            <w:tcW w:type="dxa" w:w="1944"/>
+            <w:tcW w:type="dxa" w:w="1872"/>
             <w:shd w:fill="FFFFFF"/>
             <w:tcMar>
               <w:top w:w="80" w:type="dxa"/>
@@ -1785,7 +1797,7 @@
         </w:tc>
         <w:tc>
           <w:tcPr>
-            <w:tcW w:type="dxa" w:w="1512"/>
+            <w:tcW w:type="dxa" w:w="1368"/>
             <w:shd w:fill="FFFFFF"/>
             <w:tcMar>
               <w:top w:w="80" w:type="dxa"/>
@@ -1813,7 +1825,7 @@
         </w:tc>
         <w:tc>
           <w:tcPr>
-            <w:tcW w:type="dxa" w:w="936"/>
+            <w:tcW w:type="dxa" w:w="1224"/>
             <w:shd w:fill="FFFFFF"/>
             <w:tcMar>
               <w:top w:w="80" w:type="dxa"/>
@@ -1833,15 +1845,17 @@
                 <w:rFonts w:ascii="Calibri" w:hAnsi="Calibri"/>
                 <w:b/>
                 <w:color w:val="228B22"/>
-                <w:sz w:val="17"/>
+                <w:sz w:val="15"/>
               </w:rPr>
               <w:t>+110 HP</w:t>
-            </w:r>
-          </w:p>
-        </w:tc>
-        <w:tc>
-          <w:tcPr>
-            <w:tcW w:type="dxa" w:w="1080"/>
+              <w:br/>
+              <w:t>[OFFENSE] +8% Physical Damage (3m)</w:t>
+            </w:r>
+          </w:p>
+        </w:tc>
+        <w:tc>
+          <w:tcPr>
+            <w:tcW w:type="dxa" w:w="1008"/>
             <w:shd w:fill="FFFFFF"/>
             <w:tcMar>
               <w:top w:w="80" w:type="dxa"/>
@@ -1920,7 +1934,7 @@
                 <w:color w:val="505050"/>
                 <w:sz w:val="16"/>
               </w:rPr>
-              <w:t>Deep-fried pork belly slab with blistering crackling skin and juicy meat. Restores 110 HP.</w:t>
+              <w:t>Prime seasoned pork belly simmered until tender, then deep-fried until the rind blisters into an airy, shattering crisp encasing succulent meat.</w:t>
             </w:r>
           </w:p>
         </w:tc>
@@ -1984,7 +1998,7 @@
         </w:tc>
         <w:tc>
           <w:tcPr>
-            <w:tcW w:type="dxa" w:w="1944"/>
+            <w:tcW w:type="dxa" w:w="1872"/>
             <w:shd w:fill="FAF6F0"/>
             <w:tcMar>
               <w:top w:w="80" w:type="dxa"/>
@@ -2012,7 +2026,7 @@
         </w:tc>
         <w:tc>
           <w:tcPr>
-            <w:tcW w:type="dxa" w:w="1512"/>
+            <w:tcW w:type="dxa" w:w="1368"/>
             <w:shd w:fill="FAF6F0"/>
             <w:tcMar>
               <w:top w:w="80" w:type="dxa"/>
@@ -2040,7 +2054,7 @@
         </w:tc>
         <w:tc>
           <w:tcPr>
-            <w:tcW w:type="dxa" w:w="936"/>
+            <w:tcW w:type="dxa" w:w="1224"/>
             <w:shd w:fill="FAF6F0"/>
             <w:tcMar>
               <w:top w:w="80" w:type="dxa"/>
@@ -2060,15 +2074,17 @@
                 <w:rFonts w:ascii="Calibri" w:hAnsi="Calibri"/>
                 <w:b/>
                 <w:color w:val="228B22"/>
-                <w:sz w:val="17"/>
+                <w:sz w:val="15"/>
               </w:rPr>
               <w:t>+80 HP</w:t>
-            </w:r>
-          </w:p>
-        </w:tc>
-        <w:tc>
-          <w:tcPr>
-            <w:tcW w:type="dxa" w:w="1080"/>
+              <w:br/>
+              <w:t>[OFFENSE] +5% Attack Speed (3m)</w:t>
+            </w:r>
+          </w:p>
+        </w:tc>
+        <w:tc>
+          <w:tcPr>
+            <w:tcW w:type="dxa" w:w="1008"/>
             <w:shd w:fill="FAF6F0"/>
             <w:tcMar>
               <w:top w:w="80" w:type="dxa"/>
@@ -2147,7 +2163,7 @@
                 <w:color w:val="505050"/>
                 <w:sz w:val="16"/>
               </w:rPr>
-              <w:t>Stir-fried bihon noodles with savory meat slivers, garlic, and calamansi. Restores 80 HP.</w:t>
+              <w:t>Thin rice vermicelli stir-fried in a searing wok with julienned native vegetables, tender shredded poultry, and a spritz of tart calamansi juice.</w:t>
             </w:r>
           </w:p>
         </w:tc>
@@ -2211,7 +2227,7 @@
         </w:tc>
         <w:tc>
           <w:tcPr>
-            <w:tcW w:type="dxa" w:w="1944"/>
+            <w:tcW w:type="dxa" w:w="1872"/>
             <w:shd w:fill="FFFFFF"/>
             <w:tcMar>
               <w:top w:w="80" w:type="dxa"/>
@@ -2239,7 +2255,7 @@
         </w:tc>
         <w:tc>
           <w:tcPr>
-            <w:tcW w:type="dxa" w:w="1512"/>
+            <w:tcW w:type="dxa" w:w="1368"/>
             <w:shd w:fill="FFFFFF"/>
             <w:tcMar>
               <w:top w:w="80" w:type="dxa"/>
@@ -2267,7 +2283,7 @@
         </w:tc>
         <w:tc>
           <w:tcPr>
-            <w:tcW w:type="dxa" w:w="936"/>
+            <w:tcW w:type="dxa" w:w="1224"/>
             <w:shd w:fill="FFFFFF"/>
             <w:tcMar>
               <w:top w:w="80" w:type="dxa"/>
@@ -2287,15 +2303,17 @@
                 <w:rFonts w:ascii="Calibri" w:hAnsi="Calibri"/>
                 <w:b/>
                 <w:color w:val="228B22"/>
-                <w:sz w:val="17"/>
+                <w:sz w:val="15"/>
               </w:rPr>
               <w:t>+75 HP</w:t>
-            </w:r>
-          </w:p>
-        </w:tc>
-        <w:tc>
-          <w:tcPr>
-            <w:tcW w:type="dxa" w:w="1080"/>
+              <w:br/>
+              <w:t>[RESOURCE] +1 MP/sec Regeneration (3m)</w:t>
+            </w:r>
+          </w:p>
+        </w:tc>
+        <w:tc>
+          <w:tcPr>
+            <w:tcW w:type="dxa" w:w="1008"/>
             <w:shd w:fill="FFFFFF"/>
             <w:tcMar>
               <w:top w:w="80" w:type="dxa"/>
@@ -2374,7 +2392,7 @@
                 <w:color w:val="505050"/>
                 <w:sz w:val="16"/>
               </w:rPr>
-              <w:t>Thick chicken and rice porridge topped with toasted garlic and boiled egg. Restores 75 HP.</w:t>
+              <w:t>Thick, comforting glutinous rice porridge infused with crushed ginger and aromatic toasted garlic bits, topped with a soft-boiled farm egg.</w:t>
             </w:r>
           </w:p>
         </w:tc>
@@ -2438,7 +2456,7 @@
         </w:tc>
         <w:tc>
           <w:tcPr>
-            <w:tcW w:type="dxa" w:w="1944"/>
+            <w:tcW w:type="dxa" w:w="1872"/>
             <w:shd w:fill="FAF6F0"/>
             <w:tcMar>
               <w:top w:w="80" w:type="dxa"/>
@@ -2466,7 +2484,7 @@
         </w:tc>
         <w:tc>
           <w:tcPr>
-            <w:tcW w:type="dxa" w:w="1512"/>
+            <w:tcW w:type="dxa" w:w="1368"/>
             <w:shd w:fill="FAF6F0"/>
             <w:tcMar>
               <w:top w:w="80" w:type="dxa"/>
@@ -2494,7 +2512,7 @@
         </w:tc>
         <w:tc>
           <w:tcPr>
-            <w:tcW w:type="dxa" w:w="936"/>
+            <w:tcW w:type="dxa" w:w="1224"/>
             <w:shd w:fill="FAF6F0"/>
             <w:tcMar>
               <w:top w:w="80" w:type="dxa"/>
@@ -2514,15 +2532,17 @@
                 <w:rFonts w:ascii="Calibri" w:hAnsi="Calibri"/>
                 <w:b/>
                 <w:color w:val="228B22"/>
-                <w:sz w:val="17"/>
+                <w:sz w:val="15"/>
               </w:rPr>
               <w:t>+90 HP</w:t>
-            </w:r>
-          </w:p>
-        </w:tc>
-        <w:tc>
-          <w:tcPr>
-            <w:tcW w:type="dxa" w:w="1080"/>
+              <w:br/>
+              <w:t>[MOBILITY] +8% Movement Speed (3m), +8% Jump Force (3m)</w:t>
+            </w:r>
+          </w:p>
+        </w:tc>
+        <w:tc>
+          <w:tcPr>
+            <w:tcW w:type="dxa" w:w="1008"/>
             <w:shd w:fill="FAF6F0"/>
             <w:tcMar>
               <w:top w:w="80" w:type="dxa"/>
@@ -2601,7 +2621,7 @@
                 <w:color w:val="505050"/>
                 <w:sz w:val="16"/>
               </w:rPr>
-              <w:t>Towering shaved ice dessert with ube halaya, condensed milk, and sweet treats. Restores 90 HP.</w:t>
+              <w:t>Layered tropical parfait of shaved mountain ice, purple ube halaya, sweet preserves, and silky leche flan crowned with evaporated carabao cream.</w:t>
             </w:r>
           </w:p>
         </w:tc>
@@ -2665,7 +2685,7 @@
         </w:tc>
         <w:tc>
           <w:tcPr>
-            <w:tcW w:type="dxa" w:w="1944"/>
+            <w:tcW w:type="dxa" w:w="1872"/>
             <w:shd w:fill="FFFFFF"/>
             <w:tcMar>
               <w:top w:w="80" w:type="dxa"/>
@@ -2693,7 +2713,7 @@
         </w:tc>
         <w:tc>
           <w:tcPr>
-            <w:tcW w:type="dxa" w:w="1512"/>
+            <w:tcW w:type="dxa" w:w="1368"/>
             <w:shd w:fill="FFFFFF"/>
             <w:tcMar>
               <w:top w:w="80" w:type="dxa"/>
@@ -2721,7 +2741,7 @@
         </w:tc>
         <w:tc>
           <w:tcPr>
-            <w:tcW w:type="dxa" w:w="936"/>
+            <w:tcW w:type="dxa" w:w="1224"/>
             <w:shd w:fill="FFFFFF"/>
             <w:tcMar>
               <w:top w:w="80" w:type="dxa"/>
@@ -2741,15 +2761,17 @@
                 <w:rFonts w:ascii="Calibri" w:hAnsi="Calibri"/>
                 <w:b/>
                 <w:color w:val="228B22"/>
-                <w:sz w:val="17"/>
+                <w:sz w:val="15"/>
               </w:rPr>
               <w:t>+110 HP</w:t>
-            </w:r>
-          </w:p>
-        </w:tc>
-        <w:tc>
-          <w:tcPr>
-            <w:tcW w:type="dxa" w:w="1080"/>
+              <w:br/>
+              <w:t>[OFFENSE] +8% Critical Damage (3m)</w:t>
+            </w:r>
+          </w:p>
+        </w:tc>
+        <w:tc>
+          <w:tcPr>
+            <w:tcW w:type="dxa" w:w="1008"/>
             <w:shd w:fill="FFFFFF"/>
             <w:tcMar>
               <w:top w:w="80" w:type="dxa"/>
@@ -2828,7 +2850,7 @@
                 <w:color w:val="505050"/>
                 <w:sz w:val="16"/>
               </w:rPr>
-              <w:t>Hearty spiced stew of tender goat meat with tomatoes and sweet peppers. Restores 110 HP.</w:t>
+              <w:t>Mountain goat meat stewed until fork-tender in spiced tomato paste, rich liver spread, sweet bell peppers, and chili pods for deep spicy complexity.</w:t>
             </w:r>
           </w:p>
         </w:tc>
@@ -2892,7 +2914,7 @@
         </w:tc>
         <w:tc>
           <w:tcPr>
-            <w:tcW w:type="dxa" w:w="1944"/>
+            <w:tcW w:type="dxa" w:w="1872"/>
             <w:shd w:fill="FAF6F0"/>
             <w:tcMar>
               <w:top w:w="80" w:type="dxa"/>
@@ -2920,7 +2942,7 @@
         </w:tc>
         <w:tc>
           <w:tcPr>
-            <w:tcW w:type="dxa" w:w="1512"/>
+            <w:tcW w:type="dxa" w:w="1368"/>
             <w:shd w:fill="FAF6F0"/>
             <w:tcMar>
               <w:top w:w="80" w:type="dxa"/>
@@ -2948,7 +2970,7 @@
         </w:tc>
         <w:tc>
           <w:tcPr>
-            <w:tcW w:type="dxa" w:w="936"/>
+            <w:tcW w:type="dxa" w:w="1224"/>
             <w:shd w:fill="FAF6F0"/>
             <w:tcMar>
               <w:top w:w="80" w:type="dxa"/>
@@ -2968,15 +2990,17 @@
                 <w:rFonts w:ascii="Calibri" w:hAnsi="Calibri"/>
                 <w:b/>
                 <w:color w:val="228B22"/>
-                <w:sz w:val="17"/>
+                <w:sz w:val="15"/>
               </w:rPr>
               <w:t>+65 HP</w:t>
-            </w:r>
-          </w:p>
-        </w:tc>
-        <w:tc>
-          <w:tcPr>
-            <w:tcW w:type="dxa" w:w="1080"/>
+              <w:br/>
+              <w:t>[UTILITY] +8% Knockback Resistance (3m)</w:t>
+            </w:r>
+          </w:p>
+        </w:tc>
+        <w:tc>
+          <w:tcPr>
+            <w:tcW w:type="dxa" w:w="1008"/>
             <w:shd w:fill="FAF6F0"/>
             <w:tcMar>
               <w:top w:w="80" w:type="dxa"/>
@@ -3055,7 +3079,7 @@
                 <w:color w:val="505050"/>
                 <w:sz w:val="16"/>
               </w:rPr>
-              <w:t>Fertilized duck egg sipped hot with spiced vinegar and sea salt. Restores 65 HP.</w:t>
+              <w:t>Steamed incubated duck egg sipped piping hot from the shell with a dash of spiced cane vinegar and crushed sea salt crystals.</w:t>
             </w:r>
           </w:p>
         </w:tc>
@@ -3119,7 +3143,7 @@
         </w:tc>
         <w:tc>
           <w:tcPr>
-            <w:tcW w:type="dxa" w:w="1944"/>
+            <w:tcW w:type="dxa" w:w="1872"/>
             <w:shd w:fill="FFFFFF"/>
             <w:tcMar>
               <w:top w:w="80" w:type="dxa"/>
@@ -3147,7 +3171,7 @@
         </w:tc>
         <w:tc>
           <w:tcPr>
-            <w:tcW w:type="dxa" w:w="1512"/>
+            <w:tcW w:type="dxa" w:w="1368"/>
             <w:shd w:fill="FFFFFF"/>
             <w:tcMar>
               <w:top w:w="80" w:type="dxa"/>
@@ -3175,7 +3199,7 @@
         </w:tc>
         <w:tc>
           <w:tcPr>
-            <w:tcW w:type="dxa" w:w="936"/>
+            <w:tcW w:type="dxa" w:w="1224"/>
             <w:shd w:fill="FFFFFF"/>
             <w:tcMar>
               <w:top w:w="80" w:type="dxa"/>
@@ -3195,15 +3219,17 @@
                 <w:rFonts w:ascii="Calibri" w:hAnsi="Calibri"/>
                 <w:b/>
                 <w:color w:val="228B22"/>
-                <w:sz w:val="17"/>
+                <w:sz w:val="15"/>
               </w:rPr>
               <w:t>+45 HP</w:t>
-            </w:r>
-          </w:p>
-        </w:tc>
-        <w:tc>
-          <w:tcPr>
-            <w:tcW w:type="dxa" w:w="1080"/>
+              <w:br/>
+              <w:t>[OFFENSE] +3% Critical Chance (2m)</w:t>
+            </w:r>
+          </w:p>
+        </w:tc>
+        <w:tc>
+          <w:tcPr>
+            <w:tcW w:type="dxa" w:w="1008"/>
             <w:shd w:fill="FFFFFF"/>
             <w:tcMar>
               <w:top w:w="80" w:type="dxa"/>
@@ -3282,7 +3308,7 @@
                 <w:color w:val="505050"/>
                 <w:sz w:val="16"/>
               </w:rPr>
-              <w:t>Cured red-dyed salted duck egg paired with fresh tomatoes. Restores 45 HP.</w:t>
+              <w:t>Traditional cured duck egg encased in clay and brine, yielding a rich, buttery crimson yolk served alongside diced sun-ripened tomatoes.</w:t>
             </w:r>
           </w:p>
         </w:tc>
@@ -3346,7 +3372,7 @@
         </w:tc>
         <w:tc>
           <w:tcPr>
-            <w:tcW w:type="dxa" w:w="1944"/>
+            <w:tcW w:type="dxa" w:w="1872"/>
             <w:shd w:fill="FAF6F0"/>
             <w:tcMar>
               <w:top w:w="80" w:type="dxa"/>
@@ -3374,7 +3400,7 @@
         </w:tc>
         <w:tc>
           <w:tcPr>
-            <w:tcW w:type="dxa" w:w="1512"/>
+            <w:tcW w:type="dxa" w:w="1368"/>
             <w:shd w:fill="FAF6F0"/>
             <w:tcMar>
               <w:top w:w="80" w:type="dxa"/>
@@ -3402,7 +3428,7 @@
         </w:tc>
         <w:tc>
           <w:tcPr>
-            <w:tcW w:type="dxa" w:w="936"/>
+            <w:tcW w:type="dxa" w:w="1224"/>
             <w:shd w:fill="FAF6F0"/>
             <w:tcMar>
               <w:top w:w="80" w:type="dxa"/>
@@ -3422,15 +3448,17 @@
                 <w:rFonts w:ascii="Calibri" w:hAnsi="Calibri"/>
                 <w:b/>
                 <w:color w:val="228B22"/>
-                <w:sz w:val="17"/>
+                <w:sz w:val="15"/>
               </w:rPr>
               <w:t>+50 HP</w:t>
-            </w:r>
-          </w:p>
-        </w:tc>
-        <w:tc>
-          <w:tcPr>
-            <w:tcW w:type="dxa" w:w="1080"/>
+              <w:br/>
+              <w:t>[OFFENSE] +5% Attack Speed (2m)</w:t>
+            </w:r>
+          </w:p>
+        </w:tc>
+        <w:tc>
+          <w:tcPr>
+            <w:tcW w:type="dxa" w:w="1008"/>
             <w:shd w:fill="FAF6F0"/>
             <w:tcMar>
               <w:top w:w="80" w:type="dxa"/>
@@ -3509,7 +3537,7 @@
                 <w:color w:val="505050"/>
                 <w:sz w:val="16"/>
               </w:rPr>
-              <w:t>Wok-fried rice tossed with golden toasted garlic and sea salt. Restores 50 HP.</w:t>
+              <w:t>Day-old steamed rice tossed in a hot pan with crackling golden garlic slivers and a touch of sea salt, radiating a fragrant toasted bouquet.</w:t>
             </w:r>
           </w:p>
         </w:tc>
@@ -3573,7 +3601,7 @@
         </w:tc>
         <w:tc>
           <w:tcPr>
-            <w:tcW w:type="dxa" w:w="1944"/>
+            <w:tcW w:type="dxa" w:w="1872"/>
             <w:shd w:fill="FFFFFF"/>
             <w:tcMar>
               <w:top w:w="80" w:type="dxa"/>
@@ -3601,7 +3629,7 @@
         </w:tc>
         <w:tc>
           <w:tcPr>
-            <w:tcW w:type="dxa" w:w="1512"/>
+            <w:tcW w:type="dxa" w:w="1368"/>
             <w:shd w:fill="FFFFFF"/>
             <w:tcMar>
               <w:top w:w="80" w:type="dxa"/>
@@ -3629,7 +3657,7 @@
         </w:tc>
         <w:tc>
           <w:tcPr>
-            <w:tcW w:type="dxa" w:w="936"/>
+            <w:tcW w:type="dxa" w:w="1224"/>
             <w:shd w:fill="FFFFFF"/>
             <w:tcMar>
               <w:top w:w="80" w:type="dxa"/>
@@ -3649,15 +3677,17 @@
                 <w:rFonts w:ascii="Calibri" w:hAnsi="Calibri"/>
                 <w:b/>
                 <w:color w:val="228B22"/>
-                <w:sz w:val="17"/>
+                <w:sz w:val="15"/>
               </w:rPr>
               <w:t>+75 HP</w:t>
-            </w:r>
-          </w:p>
-        </w:tc>
-        <w:tc>
-          <w:tcPr>
-            <w:tcW w:type="dxa" w:w="1080"/>
+              <w:br/>
+              <w:t>[OFFENSE] +6% Ranged Damage (3m)</w:t>
+            </w:r>
+          </w:p>
+        </w:tc>
+        <w:tc>
+          <w:tcPr>
+            <w:tcW w:type="dxa" w:w="1008"/>
             <w:shd w:fill="FFFFFF"/>
             <w:tcMar>
               <w:top w:w="80" w:type="dxa"/>
@@ -3736,7 +3766,7 @@
                 <w:color w:val="505050"/>
                 <w:sz w:val="16"/>
               </w:rPr>
-              <w:t>Marinated split milkfish in garlic vinegar, fried to a golden crisp. Restores 75 HP.</w:t>
+              <w:t>Butterflied milkfish steeped in native garlic, crushed black pepper, and cane vinegar, then sun-dried and pan-fried until golden and crunchy.</w:t>
             </w:r>
           </w:p>
         </w:tc>
@@ -3800,7 +3830,7 @@
         </w:tc>
         <w:tc>
           <w:tcPr>
-            <w:tcW w:type="dxa" w:w="1944"/>
+            <w:tcW w:type="dxa" w:w="1872"/>
             <w:shd w:fill="FAF6F0"/>
             <w:tcMar>
               <w:top w:w="80" w:type="dxa"/>
@@ -3828,7 +3858,7 @@
         </w:tc>
         <w:tc>
           <w:tcPr>
-            <w:tcW w:type="dxa" w:w="1512"/>
+            <w:tcW w:type="dxa" w:w="1368"/>
             <w:shd w:fill="FAF6F0"/>
             <w:tcMar>
               <w:top w:w="80" w:type="dxa"/>
@@ -3856,7 +3886,7 @@
         </w:tc>
         <w:tc>
           <w:tcPr>
-            <w:tcW w:type="dxa" w:w="936"/>
+            <w:tcW w:type="dxa" w:w="1224"/>
             <w:shd w:fill="FAF6F0"/>
             <w:tcMar>
               <w:top w:w="80" w:type="dxa"/>
@@ -3876,15 +3906,17 @@
                 <w:rFonts w:ascii="Calibri" w:hAnsi="Calibri"/>
                 <w:b/>
                 <w:color w:val="228B22"/>
-                <w:sz w:val="17"/>
+                <w:sz w:val="15"/>
               </w:rPr>
               <w:t>+100 HP</w:t>
-            </w:r>
-          </w:p>
-        </w:tc>
-        <w:tc>
-          <w:tcPr>
-            <w:tcW w:type="dxa" w:w="1080"/>
+              <w:br/>
+              <w:t>[DEFENSE] +8% Magic Resistance (3m)</w:t>
+            </w:r>
+          </w:p>
+        </w:tc>
+        <w:tc>
+          <w:tcPr>
+            <w:tcW w:type="dxa" w:w="1008"/>
             <w:shd w:fill="FAF6F0"/>
             <w:tcMar>
               <w:top w:w="80" w:type="dxa"/>
@@ -3963,7 +3995,7 @@
                 <w:color w:val="505050"/>
                 <w:sz w:val="16"/>
               </w:rPr>
-              <w:t>Tamarind-sour soup with tender milkfish belly, eggplant, and onions. Restores 100 HP.</w:t>
+              <w:t>Plump milkfish belly simmered gently with tender swamp cabbage and sweet long peppers in a tart crushed tamarind broth.</w:t>
             </w:r>
           </w:p>
         </w:tc>
@@ -4027,7 +4059,7 @@
         </w:tc>
         <w:tc>
           <w:tcPr>
-            <w:tcW w:type="dxa" w:w="1944"/>
+            <w:tcW w:type="dxa" w:w="1872"/>
             <w:shd w:fill="FFFFFF"/>
             <w:tcMar>
               <w:top w:w="80" w:type="dxa"/>
@@ -4055,7 +4087,7 @@
         </w:tc>
         <w:tc>
           <w:tcPr>
-            <w:tcW w:type="dxa" w:w="1512"/>
+            <w:tcW w:type="dxa" w:w="1368"/>
             <w:shd w:fill="FFFFFF"/>
             <w:tcMar>
               <w:top w:w="80" w:type="dxa"/>
@@ -4083,7 +4115,7 @@
         </w:tc>
         <w:tc>
           <w:tcPr>
-            <w:tcW w:type="dxa" w:w="936"/>
+            <w:tcW w:type="dxa" w:w="1224"/>
             <w:shd w:fill="FFFFFF"/>
             <w:tcMar>
               <w:top w:w="80" w:type="dxa"/>
@@ -4103,15 +4135,17 @@
                 <w:rFonts w:ascii="Calibri" w:hAnsi="Calibri"/>
                 <w:b/>
                 <w:color w:val="228B22"/>
-                <w:sz w:val="17"/>
+                <w:sz w:val="15"/>
               </w:rPr>
               <w:t>+105 HP</w:t>
-            </w:r>
-          </w:p>
-        </w:tc>
-        <w:tc>
-          <w:tcPr>
-            <w:tcW w:type="dxa" w:w="1080"/>
+              <w:br/>
+              <w:t>[RESOURCE] -8% Mana Cost (3m)</w:t>
+            </w:r>
+          </w:p>
+        </w:tc>
+        <w:tc>
+          <w:tcPr>
+            <w:tcW w:type="dxa" w:w="1008"/>
             <w:shd w:fill="FFFFFF"/>
             <w:tcMar>
               <w:top w:w="80" w:type="dxa"/>
@@ -4190,7 +4224,7 @@
                 <w:color w:val="505050"/>
                 <w:sz w:val="16"/>
               </w:rPr>
-              <w:t>Fresh tilapia simmered in rich creamy coconut milk with ginger and spices. Restores 105 HP.</w:t>
+              <w:t>Fresh freshwater tilapia gently braised in thick pressed coconut cream with shredded ginger, garlic, and fresh leafy greens.</w:t>
             </w:r>
           </w:p>
         </w:tc>
@@ -4254,7 +4288,7 @@
         </w:tc>
         <w:tc>
           <w:tcPr>
-            <w:tcW w:type="dxa" w:w="1944"/>
+            <w:tcW w:type="dxa" w:w="1872"/>
             <w:shd w:fill="FAF6F0"/>
             <w:tcMar>
               <w:top w:w="80" w:type="dxa"/>
@@ -4282,7 +4316,7 @@
         </w:tc>
         <w:tc>
           <w:tcPr>
-            <w:tcW w:type="dxa" w:w="1512"/>
+            <w:tcW w:type="dxa" w:w="1368"/>
             <w:shd w:fill="FAF6F0"/>
             <w:tcMar>
               <w:top w:w="80" w:type="dxa"/>
@@ -4310,7 +4344,7 @@
         </w:tc>
         <w:tc>
           <w:tcPr>
-            <w:tcW w:type="dxa" w:w="936"/>
+            <w:tcW w:type="dxa" w:w="1224"/>
             <w:shd w:fill="FAF6F0"/>
             <w:tcMar>
               <w:top w:w="80" w:type="dxa"/>
@@ -4330,15 +4364,17 @@
                 <w:rFonts w:ascii="Calibri" w:hAnsi="Calibri"/>
                 <w:b/>
                 <w:color w:val="228B22"/>
-                <w:sz w:val="17"/>
+                <w:sz w:val="15"/>
               </w:rPr>
               <w:t>+110 HP</w:t>
-            </w:r>
-          </w:p>
-        </w:tc>
-        <w:tc>
-          <w:tcPr>
-            <w:tcW w:type="dxa" w:w="1080"/>
+              <w:br/>
+              <w:t>[MOBILITY] +12% Movement Speed (3m)</w:t>
+            </w:r>
+          </w:p>
+        </w:tc>
+        <w:tc>
+          <w:tcPr>
+            <w:tcW w:type="dxa" w:w="1008"/>
             <w:shd w:fill="FAF6F0"/>
             <w:tcMar>
               <w:top w:w="80" w:type="dxa"/>
@@ -4417,7 +4453,7 @@
                 <w:color w:val="505050"/>
                 <w:sz w:val="16"/>
               </w:rPr>
-              <w:t>Fresh Spanish mackerel cured in native vinegar, calamansi juice, ginger, and chili. Restores 110 HP and +15% Speed.</w:t>
+              <w:t>Pristine raw Spanish mackerel cubes cured cold in fermented coconut sap vinegar, infused with fresh calamansi, slivered ginger, and fiery chili.</w:t>
             </w:r>
           </w:p>
         </w:tc>
@@ -4461,10 +4497,10 @@
       </w:tblPr>
       <w:tblGrid>
         <w:gridCol w:w="648"/>
-        <w:gridCol w:w="1944"/>
-        <w:gridCol w:w="1512"/>
-        <w:gridCol w:w="936"/>
-        <w:gridCol w:w="1080"/>
+        <w:gridCol w:w="1872"/>
+        <w:gridCol w:w="1368"/>
+        <w:gridCol w:w="1224"/>
+        <w:gridCol w:w="1008"/>
         <w:gridCol w:w="2376"/>
         <w:gridCol w:w="1728"/>
       </w:tblGrid>
@@ -4501,7 +4537,7 @@
         </w:tc>
         <w:tc>
           <w:tcPr>
-            <w:tcW w:type="dxa" w:w="1944"/>
+            <w:tcW w:type="dxa" w:w="1872"/>
             <w:shd w:fill="7B1113"/>
             <w:tcMar>
               <w:top w:w="110" w:type="dxa"/>
@@ -4528,7 +4564,7 @@
         </w:tc>
         <w:tc>
           <w:tcPr>
-            <w:tcW w:type="dxa" w:w="1512"/>
+            <w:tcW w:type="dxa" w:w="1368"/>
             <w:shd w:fill="7B1113"/>
             <w:tcMar>
               <w:top w:w="110" w:type="dxa"/>
@@ -4555,7 +4591,7 @@
         </w:tc>
         <w:tc>
           <w:tcPr>
-            <w:tcW w:type="dxa" w:w="936"/>
+            <w:tcW w:type="dxa" w:w="1224"/>
             <w:shd w:fill="7B1113"/>
             <w:tcMar>
               <w:top w:w="110" w:type="dxa"/>
@@ -4582,7 +4618,7 @@
         </w:tc>
         <w:tc>
           <w:tcPr>
-            <w:tcW w:type="dxa" w:w="1080"/>
+            <w:tcW w:type="dxa" w:w="1008"/>
             <w:shd w:fill="7B1113"/>
             <w:tcMar>
               <w:top w:w="110" w:type="dxa"/>
@@ -4721,7 +4757,7 @@
         </w:tc>
         <w:tc>
           <w:tcPr>
-            <w:tcW w:type="dxa" w:w="1944"/>
+            <w:tcW w:type="dxa" w:w="1872"/>
             <w:shd w:fill="FFFFFF"/>
             <w:tcMar>
               <w:top w:w="80" w:type="dxa"/>
@@ -4749,7 +4785,7 @@
         </w:tc>
         <w:tc>
           <w:tcPr>
-            <w:tcW w:type="dxa" w:w="1512"/>
+            <w:tcW w:type="dxa" w:w="1368"/>
             <w:shd w:fill="FFFFFF"/>
             <w:tcMar>
               <w:top w:w="80" w:type="dxa"/>
@@ -4777,7 +4813,7 @@
         </w:tc>
         <w:tc>
           <w:tcPr>
-            <w:tcW w:type="dxa" w:w="936"/>
+            <w:tcW w:type="dxa" w:w="1224"/>
             <w:shd w:fill="FFFFFF"/>
             <w:tcMar>
               <w:top w:w="80" w:type="dxa"/>
@@ -4797,15 +4833,17 @@
                 <w:rFonts w:ascii="Calibri" w:hAnsi="Calibri"/>
                 <w:b/>
                 <w:color w:val="228B22"/>
-                <w:sz w:val="17"/>
+                <w:sz w:val="15"/>
               </w:rPr>
               <w:t>+65 HP</w:t>
-            </w:r>
-          </w:p>
-        </w:tc>
-        <w:tc>
-          <w:tcPr>
-            <w:tcW w:type="dxa" w:w="1080"/>
+              <w:br/>
+              <w:t>[OFFENSE] +6% Ranged Damage (3m)</w:t>
+            </w:r>
+          </w:p>
+        </w:tc>
+        <w:tc>
+          <w:tcPr>
+            <w:tcW w:type="dxa" w:w="1008"/>
             <w:shd w:fill="FFFFFF"/>
             <w:tcMar>
               <w:top w:w="80" w:type="dxa"/>
@@ -4884,7 +4922,7 @@
                 <w:color w:val="505050"/>
                 <w:sz w:val="16"/>
               </w:rPr>
-              <w:t>Charcoal-grilled milkfish stuffed with tomatoes and onions. Restores 65 HP.</w:t>
+              <w:t>Whole milkfish stuffed with fresh diced tomatoes and sweet red onions, wrapped in banana leaves and slow-grilled over coconut husk embers.</w:t>
             </w:r>
           </w:p>
         </w:tc>
@@ -4948,7 +4986,7 @@
         </w:tc>
         <w:tc>
           <w:tcPr>
-            <w:tcW w:type="dxa" w:w="1944"/>
+            <w:tcW w:type="dxa" w:w="1872"/>
             <w:shd w:fill="FAF6F0"/>
             <w:tcMar>
               <w:top w:w="80" w:type="dxa"/>
@@ -4976,7 +5014,7 @@
         </w:tc>
         <w:tc>
           <w:tcPr>
-            <w:tcW w:type="dxa" w:w="1512"/>
+            <w:tcW w:type="dxa" w:w="1368"/>
             <w:shd w:fill="FAF6F0"/>
             <w:tcMar>
               <w:top w:w="80" w:type="dxa"/>
@@ -5004,7 +5042,7 @@
         </w:tc>
         <w:tc>
           <w:tcPr>
-            <w:tcW w:type="dxa" w:w="936"/>
+            <w:tcW w:type="dxa" w:w="1224"/>
             <w:shd w:fill="FAF6F0"/>
             <w:tcMar>
               <w:top w:w="80" w:type="dxa"/>
@@ -5024,15 +5062,17 @@
                 <w:rFonts w:ascii="Calibri" w:hAnsi="Calibri"/>
                 <w:b/>
                 <w:color w:val="228B22"/>
-                <w:sz w:val="17"/>
+                <w:sz w:val="15"/>
               </w:rPr>
               <w:t>+50 HP</w:t>
-            </w:r>
-          </w:p>
-        </w:tc>
-        <w:tc>
-          <w:tcPr>
-            <w:tcW w:type="dxa" w:w="1080"/>
+              <w:br/>
+              <w:t>[OFFENSE] +5% Attack Speed (2m)</w:t>
+            </w:r>
+          </w:p>
+        </w:tc>
+        <w:tc>
+          <w:tcPr>
+            <w:tcW w:type="dxa" w:w="1008"/>
             <w:shd w:fill="FAF6F0"/>
             <w:tcMar>
               <w:top w:w="80" w:type="dxa"/>
@@ -5111,7 +5151,7 @@
                 <w:color w:val="505050"/>
                 <w:sz w:val="16"/>
               </w:rPr>
-              <w:t>Crispy fried whole tilapia seasoned with sea salt. Restores 50 HP.</w:t>
+              <w:t>Scored whole freshwater tilapia seasoned with coarse sea salt and flash-fried in boiling oil until the skin is blistered and crisp.</w:t>
             </w:r>
           </w:p>
         </w:tc>
@@ -5175,7 +5215,7 @@
         </w:tc>
         <w:tc>
           <w:tcPr>
-            <w:tcW w:type="dxa" w:w="1944"/>
+            <w:tcW w:type="dxa" w:w="1872"/>
             <w:shd w:fill="FFFFFF"/>
             <w:tcMar>
               <w:top w:w="80" w:type="dxa"/>
@@ -5203,7 +5243,7 @@
         </w:tc>
         <w:tc>
           <w:tcPr>
-            <w:tcW w:type="dxa" w:w="1512"/>
+            <w:tcW w:type="dxa" w:w="1368"/>
             <w:shd w:fill="FFFFFF"/>
             <w:tcMar>
               <w:top w:w="80" w:type="dxa"/>
@@ -5231,7 +5271,7 @@
         </w:tc>
         <w:tc>
           <w:tcPr>
-            <w:tcW w:type="dxa" w:w="936"/>
+            <w:tcW w:type="dxa" w:w="1224"/>
             <w:shd w:fill="FFFFFF"/>
             <w:tcMar>
               <w:top w:w="80" w:type="dxa"/>
@@ -5251,15 +5291,17 @@
                 <w:rFonts w:ascii="Calibri" w:hAnsi="Calibri"/>
                 <w:b/>
                 <w:color w:val="228B22"/>
-                <w:sz w:val="17"/>
+                <w:sz w:val="15"/>
               </w:rPr>
               <w:t>+45 HP</w:t>
-            </w:r>
-          </w:p>
-        </w:tc>
-        <w:tc>
-          <w:tcPr>
-            <w:tcW w:type="dxa" w:w="1080"/>
+              <w:br/>
+              <w:t>[MOBILITY] +8% Movement Speed (2m)</w:t>
+            </w:r>
+          </w:p>
+        </w:tc>
+        <w:tc>
+          <w:tcPr>
+            <w:tcW w:type="dxa" w:w="1008"/>
             <w:shd w:fill="FFFFFF"/>
             <w:tcMar>
               <w:top w:w="80" w:type="dxa"/>
@@ -5338,7 +5380,7 @@
                 <w:color w:val="505050"/>
                 <w:sz w:val="16"/>
               </w:rPr>
-              <w:t>Deep-fried round scad paired with spicy vinegar dipping. Restores 45 HP.</w:t>
+              <w:t>Deep-fried round scad fried to a dark golden crunch, paired with a spiced vinegar dip to highlight its rich oily meat.</w:t>
             </w:r>
           </w:p>
         </w:tc>
@@ -5402,7 +5444,7 @@
         </w:tc>
         <w:tc>
           <w:tcPr>
-            <w:tcW w:type="dxa" w:w="1944"/>
+            <w:tcW w:type="dxa" w:w="1872"/>
             <w:shd w:fill="FAF6F0"/>
             <w:tcMar>
               <w:top w:w="80" w:type="dxa"/>
@@ -5430,7 +5472,7 @@
         </w:tc>
         <w:tc>
           <w:tcPr>
-            <w:tcW w:type="dxa" w:w="1512"/>
+            <w:tcW w:type="dxa" w:w="1368"/>
             <w:shd w:fill="FAF6F0"/>
             <w:tcMar>
               <w:top w:w="80" w:type="dxa"/>
@@ -5458,7 +5500,7 @@
         </w:tc>
         <w:tc>
           <w:tcPr>
-            <w:tcW w:type="dxa" w:w="936"/>
+            <w:tcW w:type="dxa" w:w="1224"/>
             <w:shd w:fill="FAF6F0"/>
             <w:tcMar>
               <w:top w:w="80" w:type="dxa"/>
@@ -5478,15 +5520,17 @@
                 <w:rFonts w:ascii="Calibri" w:hAnsi="Calibri"/>
                 <w:b/>
                 <w:color w:val="228B22"/>
-                <w:sz w:val="17"/>
+                <w:sz w:val="15"/>
               </w:rPr>
               <w:t>+80 HP</w:t>
-            </w:r>
-          </w:p>
-        </w:tc>
-        <w:tc>
-          <w:tcPr>
-            <w:tcW w:type="dxa" w:w="1080"/>
+              <w:br/>
+              <w:t>[DEFENSE] +4% Damage Reduction (3m)</w:t>
+            </w:r>
+          </w:p>
+        </w:tc>
+        <w:tc>
+          <w:tcPr>
+            <w:tcW w:type="dxa" w:w="1008"/>
             <w:shd w:fill="FAF6F0"/>
             <w:tcMar>
               <w:top w:w="80" w:type="dxa"/>
@@ -5565,7 +5609,7 @@
                 <w:color w:val="505050"/>
                 <w:sz w:val="16"/>
               </w:rPr>
-              <w:t>Tamarind-sour savory soup with red snapper. Restores 80 HP.</w:t>
+              <w:t>Crimson red snapper simmered with native string beans and tomatoes in an authentic sour tamarind and tomato broth.</w:t>
             </w:r>
           </w:p>
         </w:tc>
@@ -5629,7 +5673,7 @@
         </w:tc>
         <w:tc>
           <w:tcPr>
-            <w:tcW w:type="dxa" w:w="1944"/>
+            <w:tcW w:type="dxa" w:w="1872"/>
             <w:shd w:fill="FFFFFF"/>
             <w:tcMar>
               <w:top w:w="80" w:type="dxa"/>
@@ -5651,13 +5695,13 @@
                 <w:color w:val="282828"/>
                 <w:sz w:val="17"/>
               </w:rPr>
-              <w:t>Kinilaw na Tanigue</w:t>
-            </w:r>
-          </w:p>
-        </w:tc>
-        <w:tc>
-          <w:tcPr>
-            <w:tcW w:type="dxa" w:w="1512"/>
+              <w:t>Inihaw na Tanigue</w:t>
+            </w:r>
+          </w:p>
+        </w:tc>
+        <w:tc>
+          <w:tcPr>
+            <w:tcW w:type="dxa" w:w="1368"/>
             <w:shd w:fill="FFFFFF"/>
             <w:tcMar>
               <w:top w:w="80" w:type="dxa"/>
@@ -5685,7 +5729,7 @@
         </w:tc>
         <w:tc>
           <w:tcPr>
-            <w:tcW w:type="dxa" w:w="936"/>
+            <w:tcW w:type="dxa" w:w="1224"/>
             <w:shd w:fill="FFFFFF"/>
             <w:tcMar>
               <w:top w:w="80" w:type="dxa"/>
@@ -5705,15 +5749,17 @@
                 <w:rFonts w:ascii="Calibri" w:hAnsi="Calibri"/>
                 <w:b/>
                 <w:color w:val="228B22"/>
-                <w:sz w:val="17"/>
+                <w:sz w:val="15"/>
               </w:rPr>
               <w:t>+90 HP</w:t>
-            </w:r>
-          </w:p>
-        </w:tc>
-        <w:tc>
-          <w:tcPr>
-            <w:tcW w:type="dxa" w:w="1080"/>
+              <w:br/>
+              <w:t>[MOBILITY] +8% Movement Speed (2m)</w:t>
+            </w:r>
+          </w:p>
+        </w:tc>
+        <w:tc>
+          <w:tcPr>
+            <w:tcW w:type="dxa" w:w="1008"/>
             <w:shd w:fill="FFFFFF"/>
             <w:tcMar>
               <w:top w:w="80" w:type="dxa"/>
@@ -5792,7 +5838,7 @@
                 <w:color w:val="505050"/>
                 <w:sz w:val="16"/>
               </w:rPr>
-              <w:t>Citrus and coconut vinegar cured Spanish mackerel ceviche. Restores 90 HP.</w:t>
+              <w:t>Thick Spanish mackerel steaks seasoned with sea salt, basted with calamansi juice, and flame-grilled over glowing coals.</w:t>
             </w:r>
           </w:p>
         </w:tc>
@@ -5856,7 +5902,7 @@
         </w:tc>
         <w:tc>
           <w:tcPr>
-            <w:tcW w:type="dxa" w:w="1944"/>
+            <w:tcW w:type="dxa" w:w="1872"/>
             <w:shd w:fill="FAF6F0"/>
             <w:tcMar>
               <w:top w:w="80" w:type="dxa"/>
@@ -5884,7 +5930,7 @@
         </w:tc>
         <w:tc>
           <w:tcPr>
-            <w:tcW w:type="dxa" w:w="1512"/>
+            <w:tcW w:type="dxa" w:w="1368"/>
             <w:shd w:fill="FAF6F0"/>
             <w:tcMar>
               <w:top w:w="80" w:type="dxa"/>
@@ -5912,7 +5958,7 @@
         </w:tc>
         <w:tc>
           <w:tcPr>
-            <w:tcW w:type="dxa" w:w="936"/>
+            <w:tcW w:type="dxa" w:w="1224"/>
             <w:shd w:fill="FAF6F0"/>
             <w:tcMar>
               <w:top w:w="80" w:type="dxa"/>
@@ -5932,15 +5978,17 @@
                 <w:rFonts w:ascii="Calibri" w:hAnsi="Calibri"/>
                 <w:b/>
                 <w:color w:val="228B22"/>
-                <w:sz w:val="17"/>
+                <w:sz w:val="15"/>
               </w:rPr>
               <w:t>+85 HP</w:t>
-            </w:r>
-          </w:p>
-        </w:tc>
-        <w:tc>
-          <w:tcPr>
-            <w:tcW w:type="dxa" w:w="1080"/>
+              <w:br/>
+              <w:t>[OFFENSE] +8% Critical Damage (3m)</w:t>
+            </w:r>
+          </w:p>
+        </w:tc>
+        <w:tc>
+          <w:tcPr>
+            <w:tcW w:type="dxa" w:w="1008"/>
             <w:shd w:fill="FAF6F0"/>
             <w:tcMar>
               <w:top w:w="80" w:type="dxa"/>
@@ -6019,7 +6067,7 @@
                 <w:color w:val="505050"/>
                 <w:sz w:val="16"/>
               </w:rPr>
-              <w:t>Flame-broiled yellowfin steaks basted in sweet soy glaze. Restores 85 HP.</w:t>
+              <w:t>Dense yellowfin tuna steaks brushed with sweet soy and calamansi marinade, seared rapidly over white-hot embers.</w:t>
             </w:r>
           </w:p>
         </w:tc>
@@ -6083,7 +6131,7 @@
         </w:tc>
         <w:tc>
           <w:tcPr>
-            <w:tcW w:type="dxa" w:w="1944"/>
+            <w:tcW w:type="dxa" w:w="1872"/>
             <w:shd w:fill="FFFFFF"/>
             <w:tcMar>
               <w:top w:w="80" w:type="dxa"/>
@@ -6111,7 +6159,7 @@
         </w:tc>
         <w:tc>
           <w:tcPr>
-            <w:tcW w:type="dxa" w:w="1512"/>
+            <w:tcW w:type="dxa" w:w="1368"/>
             <w:shd w:fill="FFFFFF"/>
             <w:tcMar>
               <w:top w:w="80" w:type="dxa"/>
@@ -6139,7 +6187,7 @@
         </w:tc>
         <w:tc>
           <w:tcPr>
-            <w:tcW w:type="dxa" w:w="936"/>
+            <w:tcW w:type="dxa" w:w="1224"/>
             <w:shd w:fill="FFFFFF"/>
             <w:tcMar>
               <w:top w:w="80" w:type="dxa"/>
@@ -6159,15 +6207,17 @@
                 <w:rFonts w:ascii="Calibri" w:hAnsi="Calibri"/>
                 <w:b/>
                 <w:color w:val="228B22"/>
-                <w:sz w:val="17"/>
+                <w:sz w:val="15"/>
               </w:rPr>
               <w:t>+110 HP</w:t>
-            </w:r>
-          </w:p>
-        </w:tc>
-        <w:tc>
-          <w:tcPr>
-            <w:tcW w:type="dxa" w:w="1080"/>
+              <w:br/>
+              <w:t>[DEFENSE] +3 Flat Defense (4m), +5% Knockback Resistance (4m)</w:t>
+            </w:r>
+          </w:p>
+        </w:tc>
+        <w:tc>
+          <w:tcPr>
+            <w:tcW w:type="dxa" w:w="1008"/>
             <w:shd w:fill="FFFFFF"/>
             <w:tcMar>
               <w:top w:w="80" w:type="dxa"/>
@@ -6246,7 +6296,7 @@
                 <w:color w:val="505050"/>
                 <w:sz w:val="16"/>
               </w:rPr>
-              <w:t>Ginger-steamed grouper dressed in sesame soy sauce. Restores 110 HP.</w:t>
+              <w:t>Whole spotted coral grouper delicately steamed with julienned ginger, spring scallions, sesame oil, and light savory soy broth.</w:t>
             </w:r>
           </w:p>
         </w:tc>
@@ -6310,7 +6360,7 @@
         </w:tc>
         <w:tc>
           <w:tcPr>
-            <w:tcW w:type="dxa" w:w="1944"/>
+            <w:tcW w:type="dxa" w:w="1872"/>
             <w:shd w:fill="FAF6F0"/>
             <w:tcMar>
               <w:top w:w="80" w:type="dxa"/>
@@ -6338,7 +6388,7 @@
         </w:tc>
         <w:tc>
           <w:tcPr>
-            <w:tcW w:type="dxa" w:w="1512"/>
+            <w:tcW w:type="dxa" w:w="1368"/>
             <w:shd w:fill="FAF6F0"/>
             <w:tcMar>
               <w:top w:w="80" w:type="dxa"/>
@@ -6366,7 +6416,7 @@
         </w:tc>
         <w:tc>
           <w:tcPr>
-            <w:tcW w:type="dxa" w:w="936"/>
+            <w:tcW w:type="dxa" w:w="1224"/>
             <w:shd w:fill="FAF6F0"/>
             <w:tcMar>
               <w:top w:w="80" w:type="dxa"/>
@@ -6386,15 +6436,17 @@
                 <w:rFonts w:ascii="Calibri" w:hAnsi="Calibri"/>
                 <w:b/>
                 <w:color w:val="228B22"/>
-                <w:sz w:val="17"/>
+                <w:sz w:val="15"/>
               </w:rPr>
               <w:t>+70 HP</w:t>
-            </w:r>
-          </w:p>
-        </w:tc>
-        <w:tc>
-          <w:tcPr>
-            <w:tcW w:type="dxa" w:w="1080"/>
+              <w:br/>
+              <w:t>[OFFENSE] +6% Physical Damage (3m)</w:t>
+            </w:r>
+          </w:p>
+        </w:tc>
+        <w:tc>
+          <w:tcPr>
+            <w:tcW w:type="dxa" w:w="1008"/>
             <w:shd w:fill="FAF6F0"/>
             <w:tcMar>
               <w:top w:w="80" w:type="dxa"/>
@@ -6473,7 +6525,7 @@
                 <w:color w:val="505050"/>
                 <w:sz w:val="16"/>
               </w:rPr>
-              <w:t>Catfish simmered in garlic, vinegar, and black peppercorns. Restores 70 HP.</w:t>
+              <w:t>Freshwater catfish chunks simmered gently in coconut vinegar, garlic cloves, bay leaves, and cracked black pepper until buttery and glazed.</w:t>
             </w:r>
           </w:p>
         </w:tc>
@@ -6537,7 +6589,7 @@
         </w:tc>
         <w:tc>
           <w:tcPr>
-            <w:tcW w:type="dxa" w:w="1944"/>
+            <w:tcW w:type="dxa" w:w="1872"/>
             <w:shd w:fill="FFFFFF"/>
             <w:tcMar>
               <w:top w:w="80" w:type="dxa"/>
@@ -6565,7 +6617,7 @@
         </w:tc>
         <w:tc>
           <w:tcPr>
-            <w:tcW w:type="dxa" w:w="1512"/>
+            <w:tcW w:type="dxa" w:w="1368"/>
             <w:shd w:fill="FFFFFF"/>
             <w:tcMar>
               <w:top w:w="80" w:type="dxa"/>
@@ -6593,7 +6645,7 @@
         </w:tc>
         <w:tc>
           <w:tcPr>
-            <w:tcW w:type="dxa" w:w="936"/>
+            <w:tcW w:type="dxa" w:w="1224"/>
             <w:shd w:fill="FFFFFF"/>
             <w:tcMar>
               <w:top w:w="80" w:type="dxa"/>
@@ -6613,15 +6665,17 @@
                 <w:rFonts w:ascii="Calibri" w:hAnsi="Calibri"/>
                 <w:b/>
                 <w:color w:val="228B22"/>
-                <w:sz w:val="17"/>
+                <w:sz w:val="15"/>
               </w:rPr>
               <w:t>+35 HP</w:t>
-            </w:r>
-          </w:p>
-        </w:tc>
-        <w:tc>
-          <w:tcPr>
-            <w:tcW w:type="dxa" w:w="1080"/>
+              <w:br/>
+              <w:t>[RESOURCE] +1 MP/sec Regeneration (2m)</w:t>
+            </w:r>
+          </w:p>
+        </w:tc>
+        <w:tc>
+          <w:tcPr>
+            <w:tcW w:type="dxa" w:w="1008"/>
             <w:shd w:fill="FFFFFF"/>
             <w:tcMar>
               <w:top w:w="80" w:type="dxa"/>
@@ -6700,7 +6754,7 @@
                 <w:color w:val="505050"/>
                 <w:sz w:val="16"/>
               </w:rPr>
-              <w:t>Glazed crunchy sweet-and-spicy dried anchovies. Restores 35 HP.</w:t>
+              <w:t>Sun-dried silver anchovies pan-fried with caramelized brown sugar and toasted chili flakes for an addictive sweet-spicy crunch.</w:t>
             </w:r>
           </w:p>
         </w:tc>
@@ -6764,7 +6818,7 @@
         </w:tc>
         <w:tc>
           <w:tcPr>
-            <w:tcW w:type="dxa" w:w="1944"/>
+            <w:tcW w:type="dxa" w:w="1872"/>
             <w:shd w:fill="FAF6F0"/>
             <w:tcMar>
               <w:top w:w="80" w:type="dxa"/>
@@ -6792,7 +6846,7 @@
         </w:tc>
         <w:tc>
           <w:tcPr>
-            <w:tcW w:type="dxa" w:w="1512"/>
+            <w:tcW w:type="dxa" w:w="1368"/>
             <w:shd w:fill="FAF6F0"/>
             <w:tcMar>
               <w:top w:w="80" w:type="dxa"/>
@@ -6820,7 +6874,7 @@
         </w:tc>
         <w:tc>
           <w:tcPr>
-            <w:tcW w:type="dxa" w:w="936"/>
+            <w:tcW w:type="dxa" w:w="1224"/>
             <w:shd w:fill="FAF6F0"/>
             <w:tcMar>
               <w:top w:w="80" w:type="dxa"/>
@@ -6840,15 +6894,17 @@
                 <w:rFonts w:ascii="Calibri" w:hAnsi="Calibri"/>
                 <w:b/>
                 <w:color w:val="228B22"/>
-                <w:sz w:val="17"/>
+                <w:sz w:val="15"/>
               </w:rPr>
               <w:t>+60 HP</w:t>
-            </w:r>
-          </w:p>
-        </w:tc>
-        <w:tc>
-          <w:tcPr>
-            <w:tcW w:type="dxa" w:w="1080"/>
+              <w:br/>
+              <w:t>[OFFENSE] +3% Critical Chance (3m)</w:t>
+            </w:r>
+          </w:p>
+        </w:tc>
+        <w:tc>
+          <w:tcPr>
+            <w:tcW w:type="dxa" w:w="1008"/>
             <w:shd w:fill="FAF6F0"/>
             <w:tcMar>
               <w:top w:w="80" w:type="dxa"/>
@@ -6927,7 +6983,7 @@
                 <w:color w:val="505050"/>
                 <w:sz w:val="16"/>
               </w:rPr>
-              <w:t>Crispy pan-fried yellowtail fusilier with golden crust. Restores 60 HP.</w:t>
+              <w:t>Vibrant yellowtail fusilier dredged lightly in spiced rice flour and pan-fried until its red-gold skin turns crackling crisp.</w:t>
             </w:r>
           </w:p>
         </w:tc>
@@ -6971,10 +7027,10 @@
       </w:tblPr>
       <w:tblGrid>
         <w:gridCol w:w="648"/>
-        <w:gridCol w:w="1944"/>
-        <w:gridCol w:w="1512"/>
-        <w:gridCol w:w="936"/>
-        <w:gridCol w:w="1080"/>
+        <w:gridCol w:w="1872"/>
+        <w:gridCol w:w="1368"/>
+        <w:gridCol w:w="1224"/>
+        <w:gridCol w:w="1008"/>
         <w:gridCol w:w="2376"/>
         <w:gridCol w:w="1728"/>
       </w:tblGrid>
@@ -7011,7 +7067,7 @@
         </w:tc>
         <w:tc>
           <w:tcPr>
-            <w:tcW w:type="dxa" w:w="1944"/>
+            <w:tcW w:type="dxa" w:w="1872"/>
             <w:shd w:fill="7B1113"/>
             <w:tcMar>
               <w:top w:w="110" w:type="dxa"/>
@@ -7038,7 +7094,7 @@
         </w:tc>
         <w:tc>
           <w:tcPr>
-            <w:tcW w:type="dxa" w:w="1512"/>
+            <w:tcW w:type="dxa" w:w="1368"/>
             <w:shd w:fill="7B1113"/>
             <w:tcMar>
               <w:top w:w="110" w:type="dxa"/>
@@ -7065,7 +7121,7 @@
         </w:tc>
         <w:tc>
           <w:tcPr>
-            <w:tcW w:type="dxa" w:w="936"/>
+            <w:tcW w:type="dxa" w:w="1224"/>
             <w:shd w:fill="7B1113"/>
             <w:tcMar>
               <w:top w:w="110" w:type="dxa"/>
@@ -7092,7 +7148,7 @@
         </w:tc>
         <w:tc>
           <w:tcPr>
-            <w:tcW w:type="dxa" w:w="1080"/>
+            <w:tcW w:type="dxa" w:w="1008"/>
             <w:shd w:fill="7B1113"/>
             <w:tcMar>
               <w:top w:w="110" w:type="dxa"/>
@@ -7231,7 +7287,7 @@
         </w:tc>
         <w:tc>
           <w:tcPr>
-            <w:tcW w:type="dxa" w:w="1944"/>
+            <w:tcW w:type="dxa" w:w="1872"/>
             <w:shd w:fill="FFFFFF"/>
             <w:tcMar>
               <w:top w:w="80" w:type="dxa"/>
@@ -7259,7 +7315,7 @@
         </w:tc>
         <w:tc>
           <w:tcPr>
-            <w:tcW w:type="dxa" w:w="1512"/>
+            <w:tcW w:type="dxa" w:w="1368"/>
             <w:shd w:fill="FFFFFF"/>
             <w:tcMar>
               <w:top w:w="80" w:type="dxa"/>
@@ -7287,7 +7343,7 @@
         </w:tc>
         <w:tc>
           <w:tcPr>
-            <w:tcW w:type="dxa" w:w="936"/>
+            <w:tcW w:type="dxa" w:w="1224"/>
             <w:shd w:fill="FFFFFF"/>
             <w:tcMar>
               <w:top w:w="80" w:type="dxa"/>
@@ -7307,15 +7363,17 @@
                 <w:rFonts w:ascii="Calibri" w:hAnsi="Calibri"/>
                 <w:b/>
                 <w:color w:val="228B22"/>
-                <w:sz w:val="17"/>
+                <w:sz w:val="15"/>
               </w:rPr>
               <w:t>+60 HP</w:t>
-            </w:r>
-          </w:p>
-        </w:tc>
-        <w:tc>
-          <w:tcPr>
-            <w:tcW w:type="dxa" w:w="1080"/>
+              <w:br/>
+              <w:t>[DEFENSE] +3 Flat Defense (3m)</w:t>
+            </w:r>
+          </w:p>
+        </w:tc>
+        <w:tc>
+          <w:tcPr>
+            <w:tcW w:type="dxa" w:w="1008"/>
             <w:shd w:fill="FFFFFF"/>
             <w:tcMar>
               <w:top w:w="80" w:type="dxa"/>
@@ -7365,7 +7423,7 @@
                 <w:color w:val="323232"/>
                 <w:sz w:val="17"/>
               </w:rPr>
-              <w:t>2x Raw Potato, 1x Wood</w:t>
+              <w:t>2x Raw Potato, 1x Oak Wood</w:t>
             </w:r>
           </w:p>
         </w:tc>
@@ -7394,7 +7452,7 @@
                 <w:color w:val="505050"/>
                 <w:sz w:val="16"/>
               </w:rPr>
-              <w:t>Cooked at a furnace. Hearty creamy meal that restores +60 HP.</w:t>
+              <w:t>Freshly harvested tubers boiled and mashed with churned carabao butter and sweet cream until velvety smooth.</w:t>
             </w:r>
           </w:p>
         </w:tc>
@@ -7458,7 +7516,7 @@
         </w:tc>
         <w:tc>
           <w:tcPr>
-            <w:tcW w:type="dxa" w:w="1944"/>
+            <w:tcW w:type="dxa" w:w="1872"/>
             <w:shd w:fill="FAF6F0"/>
             <w:tcMar>
               <w:top w:w="80" w:type="dxa"/>
@@ -7486,7 +7544,7 @@
         </w:tc>
         <w:tc>
           <w:tcPr>
-            <w:tcW w:type="dxa" w:w="1512"/>
+            <w:tcW w:type="dxa" w:w="1368"/>
             <w:shd w:fill="FAF6F0"/>
             <w:tcMar>
               <w:top w:w="80" w:type="dxa"/>
@@ -7514,7 +7572,7 @@
         </w:tc>
         <w:tc>
           <w:tcPr>
-            <w:tcW w:type="dxa" w:w="936"/>
+            <w:tcW w:type="dxa" w:w="1224"/>
             <w:shd w:fill="FAF6F0"/>
             <w:tcMar>
               <w:top w:w="80" w:type="dxa"/>
@@ -7534,15 +7592,17 @@
                 <w:rFonts w:ascii="Calibri" w:hAnsi="Calibri"/>
                 <w:b/>
                 <w:color w:val="228B22"/>
-                <w:sz w:val="17"/>
+                <w:sz w:val="15"/>
               </w:rPr>
               <w:t>+100 HP</w:t>
-            </w:r>
-          </w:p>
-        </w:tc>
-        <w:tc>
-          <w:tcPr>
-            <w:tcW w:type="dxa" w:w="1080"/>
+              <w:br/>
+              <w:t>[OFFENSE] +5% Attack Speed (3m)</w:t>
+            </w:r>
+          </w:p>
+        </w:tc>
+        <w:tc>
+          <w:tcPr>
+            <w:tcW w:type="dxa" w:w="1008"/>
             <w:shd w:fill="FAF6F0"/>
             <w:tcMar>
               <w:top w:w="80" w:type="dxa"/>
@@ -7621,7 +7681,7 @@
                 <w:color w:val="505050"/>
                 <w:sz w:val="16"/>
               </w:rPr>
-              <w:t>Crispy golden fry seasoned with gold dust. Restores +100 HP.</w:t>
+              <w:t>Crisp potato batons double-fried to a golden crunch and dusted with sea salt and shimmering edible gold flakes.</w:t>
             </w:r>
           </w:p>
         </w:tc>
@@ -7685,7 +7745,7 @@
         </w:tc>
         <w:tc>
           <w:tcPr>
-            <w:tcW w:type="dxa" w:w="1944"/>
+            <w:tcW w:type="dxa" w:w="1872"/>
             <w:shd w:fill="FFFFFF"/>
             <w:tcMar>
               <w:top w:w="80" w:type="dxa"/>
@@ -7713,7 +7773,7 @@
         </w:tc>
         <w:tc>
           <w:tcPr>
-            <w:tcW w:type="dxa" w:w="1512"/>
+            <w:tcW w:type="dxa" w:w="1368"/>
             <w:shd w:fill="FFFFFF"/>
             <w:tcMar>
               <w:top w:w="80" w:type="dxa"/>
@@ -7741,7 +7801,7 @@
         </w:tc>
         <w:tc>
           <w:tcPr>
-            <w:tcW w:type="dxa" w:w="936"/>
+            <w:tcW w:type="dxa" w:w="1224"/>
             <w:shd w:fill="FFFFFF"/>
             <w:tcMar>
               <w:top w:w="80" w:type="dxa"/>
@@ -7761,15 +7821,17 @@
                 <w:rFonts w:ascii="Calibri" w:hAnsi="Calibri"/>
                 <w:b/>
                 <w:color w:val="228B22"/>
-                <w:sz w:val="17"/>
+                <w:sz w:val="15"/>
               </w:rPr>
               <w:t>+60 HP</w:t>
-            </w:r>
-          </w:p>
-        </w:tc>
-        <w:tc>
-          <w:tcPr>
-            <w:tcW w:type="dxa" w:w="1080"/>
+              <w:br/>
+              <w:t>[RESOURCE] +1 HP/sec Regeneration (3m)</w:t>
+            </w:r>
+          </w:p>
+        </w:tc>
+        <w:tc>
+          <w:tcPr>
+            <w:tcW w:type="dxa" w:w="1008"/>
             <w:shd w:fill="FFFFFF"/>
             <w:tcMar>
               <w:top w:w="80" w:type="dxa"/>
@@ -7819,7 +7881,7 @@
                 <w:color w:val="323232"/>
                 <w:sz w:val="17"/>
               </w:rPr>
-              <w:t>3x Raw Potato, 1x Glowing Mushroom, 1x Wood</w:t>
+              <w:t>3x Raw Potato, 1x Glowing Mushroom, 1x Oak Wood</w:t>
             </w:r>
           </w:p>
         </w:tc>
@@ -7848,7 +7910,7 @@
                 <w:color w:val="505050"/>
                 <w:sz w:val="16"/>
               </w:rPr>
-              <w:t>Simmering rustic stew of cubed potatoes, glowing mushrooms, and savory wild herbs. Restores 60 Health.</w:t>
+              <w:t>Rustic cauldron stew of cubed russet potatoes, aromatic cavern mushrooms, and wild root vegetables simmered in herbal broth.</w:t>
             </w:r>
           </w:p>
         </w:tc>
@@ -7912,7 +7974,7 @@
         </w:tc>
         <w:tc>
           <w:tcPr>
-            <w:tcW w:type="dxa" w:w="1944"/>
+            <w:tcW w:type="dxa" w:w="1872"/>
             <w:shd w:fill="FAF6F0"/>
             <w:tcMar>
               <w:top w:w="80" w:type="dxa"/>
@@ -7940,7 +8002,7 @@
         </w:tc>
         <w:tc>
           <w:tcPr>
-            <w:tcW w:type="dxa" w:w="1512"/>
+            <w:tcW w:type="dxa" w:w="1368"/>
             <w:shd w:fill="FAF6F0"/>
             <w:tcMar>
               <w:top w:w="80" w:type="dxa"/>
@@ -7968,7 +8030,7 @@
         </w:tc>
         <w:tc>
           <w:tcPr>
-            <w:tcW w:type="dxa" w:w="936"/>
+            <w:tcW w:type="dxa" w:w="1224"/>
             <w:shd w:fill="FAF6F0"/>
             <w:tcMar>
               <w:top w:w="80" w:type="dxa"/>
@@ -7988,15 +8050,17 @@
                 <w:rFonts w:ascii="Calibri" w:hAnsi="Calibri"/>
                 <w:b/>
                 <w:color w:val="228B22"/>
-                <w:sz w:val="17"/>
+                <w:sz w:val="15"/>
               </w:rPr>
               <w:t>+100 HP</w:t>
-            </w:r>
-          </w:p>
-        </w:tc>
-        <w:tc>
-          <w:tcPr>
-            <w:tcW w:type="dxa" w:w="1080"/>
+              <w:br/>
+              <w:t>[RESOURCE] -8% Mana Cost (4m)</w:t>
+            </w:r>
+          </w:p>
+        </w:tc>
+        <w:tc>
+          <w:tcPr>
+            <w:tcW w:type="dxa" w:w="1008"/>
             <w:shd w:fill="FAF6F0"/>
             <w:tcMar>
               <w:top w:w="80" w:type="dxa"/>
@@ -8075,7 +8139,7 @@
                 <w:color w:val="505050"/>
                 <w:sz w:val="16"/>
               </w:rPr>
-              <w:t>Heirloom russet potato roasted in molten gold and clover nectar. Restores 100 Health and 30 Mana.</w:t>
+              <w:t>Heirloom golden tuber roasted slowly with clover nectar and wild honeycomb until glazed with a sweet, sticky crust.</w:t>
             </w:r>
           </w:p>
         </w:tc>
@@ -8139,7 +8203,7 @@
         </w:tc>
         <w:tc>
           <w:tcPr>
-            <w:tcW w:type="dxa" w:w="1944"/>
+            <w:tcW w:type="dxa" w:w="1872"/>
             <w:shd w:fill="FFFFFF"/>
             <w:tcMar>
               <w:top w:w="80" w:type="dxa"/>
@@ -8167,7 +8231,7 @@
         </w:tc>
         <w:tc>
           <w:tcPr>
-            <w:tcW w:type="dxa" w:w="1512"/>
+            <w:tcW w:type="dxa" w:w="1368"/>
             <w:shd w:fill="FFFFFF"/>
             <w:tcMar>
               <w:top w:w="80" w:type="dxa"/>
@@ -8195,7 +8259,7 @@
         </w:tc>
         <w:tc>
           <w:tcPr>
-            <w:tcW w:type="dxa" w:w="936"/>
+            <w:tcW w:type="dxa" w:w="1224"/>
             <w:shd w:fill="FFFFFF"/>
             <w:tcMar>
               <w:top w:w="80" w:type="dxa"/>
@@ -8215,15 +8279,17 @@
                 <w:rFonts w:ascii="Calibri" w:hAnsi="Calibri"/>
                 <w:b/>
                 <w:color w:val="228B22"/>
-                <w:sz w:val="17"/>
+                <w:sz w:val="15"/>
               </w:rPr>
               <w:t>+30 HP</w:t>
-            </w:r>
-          </w:p>
-        </w:tc>
-        <w:tc>
-          <w:tcPr>
-            <w:tcW w:type="dxa" w:w="1080"/>
+              <w:br/>
+              <w:t>[MOBILITY] +8% Movement Speed (2m)</w:t>
+            </w:r>
+          </w:p>
+        </w:tc>
+        <w:tc>
+          <w:tcPr>
+            <w:tcW w:type="dxa" w:w="1008"/>
             <w:shd w:fill="FFFFFF"/>
             <w:tcMar>
               <w:top w:w="80" w:type="dxa"/>
@@ -8273,7 +8339,7 @@
                 <w:color w:val="323232"/>
                 <w:sz w:val="17"/>
               </w:rPr>
-              <w:t>2x Raw Potato, 1x Wood</w:t>
+              <w:t>2x Raw Potato, 1x Oak Wood</w:t>
             </w:r>
           </w:p>
         </w:tc>
@@ -8302,7 +8368,7 @@
                 <w:color w:val="505050"/>
                 <w:sz w:val="16"/>
               </w:rPr>
-              <w:t>Hickory-cured salted potato jerky crisps that provide quick sustenance during expeditions.</w:t>
+              <w:t>Thin slices of spiced tuber cured over fragrant hickory smoke and seasoned with coarse sea salt for an enduring trail provision.</w:t>
             </w:r>
           </w:p>
         </w:tc>
@@ -8366,7 +8432,7 @@
         </w:tc>
         <w:tc>
           <w:tcPr>
-            <w:tcW w:type="dxa" w:w="1944"/>
+            <w:tcW w:type="dxa" w:w="1872"/>
             <w:shd w:fill="FAF6F0"/>
             <w:tcMar>
               <w:top w:w="80" w:type="dxa"/>
@@ -8394,7 +8460,7 @@
         </w:tc>
         <w:tc>
           <w:tcPr>
-            <w:tcW w:type="dxa" w:w="1512"/>
+            <w:tcW w:type="dxa" w:w="1368"/>
             <w:shd w:fill="FAF6F0"/>
             <w:tcMar>
               <w:top w:w="80" w:type="dxa"/>
@@ -8422,7 +8488,7 @@
         </w:tc>
         <w:tc>
           <w:tcPr>
-            <w:tcW w:type="dxa" w:w="936"/>
+            <w:tcW w:type="dxa" w:w="1224"/>
             <w:shd w:fill="FAF6F0"/>
             <w:tcMar>
               <w:top w:w="80" w:type="dxa"/>
@@ -8442,15 +8508,17 @@
                 <w:rFonts w:ascii="Calibri" w:hAnsi="Calibri"/>
                 <w:b/>
                 <w:color w:val="228B22"/>
-                <w:sz w:val="17"/>
+                <w:sz w:val="15"/>
               </w:rPr>
               <w:t>+140 HP</w:t>
-            </w:r>
-          </w:p>
-        </w:tc>
-        <w:tc>
-          <w:tcPr>
-            <w:tcW w:type="dxa" w:w="1080"/>
+              <w:br/>
+              <w:t>[DEFENSE] +4% Damage Reduction (4m)</w:t>
+            </w:r>
+          </w:p>
+        </w:tc>
+        <w:tc>
+          <w:tcPr>
+            <w:tcW w:type="dxa" w:w="1008"/>
             <w:shd w:fill="FAF6F0"/>
             <w:tcMar>
               <w:top w:w="80" w:type="dxa"/>
@@ -8529,7 +8597,7 @@
                 <w:color w:val="505050"/>
                 <w:sz w:val="16"/>
               </w:rPr>
-              <w:t>Supreme confection of candied royal root providing massive vitality recovery.</w:t>
+              <w:t>Supreme royal potato roasted in a hearth oven, drizzled with gold-infused truffle butter, and dusted with fragrant herbal salt.</w:t>
             </w:r>
           </w:p>
         </w:tc>
@@ -8593,7 +8661,7 @@
         </w:tc>
         <w:tc>
           <w:tcPr>
-            <w:tcW w:type="dxa" w:w="1944"/>
+            <w:tcW w:type="dxa" w:w="1872"/>
             <w:shd w:fill="FFFFFF"/>
             <w:tcMar>
               <w:top w:w="80" w:type="dxa"/>
@@ -8621,7 +8689,7 @@
         </w:tc>
         <w:tc>
           <w:tcPr>
-            <w:tcW w:type="dxa" w:w="1512"/>
+            <w:tcW w:type="dxa" w:w="1368"/>
             <w:shd w:fill="FFFFFF"/>
             <w:tcMar>
               <w:top w:w="80" w:type="dxa"/>
@@ -8649,7 +8717,7 @@
         </w:tc>
         <w:tc>
           <w:tcPr>
-            <w:tcW w:type="dxa" w:w="936"/>
+            <w:tcW w:type="dxa" w:w="1224"/>
             <w:shd w:fill="FFFFFF"/>
             <w:tcMar>
               <w:top w:w="80" w:type="dxa"/>
@@ -8669,15 +8737,17 @@
                 <w:rFonts w:ascii="Calibri" w:hAnsi="Calibri"/>
                 <w:b/>
                 <w:color w:val="228B22"/>
-                <w:sz w:val="17"/>
+                <w:sz w:val="15"/>
               </w:rPr>
               <w:t>+45 HP</w:t>
-            </w:r>
-          </w:p>
-        </w:tc>
-        <w:tc>
-          <w:tcPr>
-            <w:tcW w:type="dxa" w:w="1080"/>
+              <w:br/>
+              <w:t>[RESOURCE] +1 HP/sec Regeneration (2m)</w:t>
+            </w:r>
+          </w:p>
+        </w:tc>
+        <w:tc>
+          <w:tcPr>
+            <w:tcW w:type="dxa" w:w="1008"/>
             <w:shd w:fill="FFFFFF"/>
             <w:tcMar>
               <w:top w:w="80" w:type="dxa"/>
@@ -8727,7 +8797,7 @@
                 <w:color w:val="323232"/>
                 <w:sz w:val="17"/>
               </w:rPr>
-              <w:t>3x Raw Potato, 1x Wood</w:t>
+              <w:t>3x Raw Potato, 1x Oak Wood</w:t>
             </w:r>
           </w:p>
         </w:tc>
@@ -8756,7 +8826,7 @@
                 <w:color w:val="505050"/>
                 <w:sz w:val="16"/>
               </w:rPr>
-              <w:t>Warm crusty hearth bread baked from wholesome potato flour. Restores 45 Health.</w:t>
+              <w:t>Crusty golden bread baked with finely milled potato flour and yeast, yielding a dense, steaming loaf that retains hearth warmth.</w:t>
             </w:r>
           </w:p>
         </w:tc>
@@ -8820,7 +8890,7 @@
         </w:tc>
         <w:tc>
           <w:tcPr>
-            <w:tcW w:type="dxa" w:w="1944"/>
+            <w:tcW w:type="dxa" w:w="1872"/>
             <w:shd w:fill="FAF6F0"/>
             <w:tcMar>
               <w:top w:w="80" w:type="dxa"/>
@@ -8848,7 +8918,7 @@
         </w:tc>
         <w:tc>
           <w:tcPr>
-            <w:tcW w:type="dxa" w:w="1512"/>
+            <w:tcW w:type="dxa" w:w="1368"/>
             <w:shd w:fill="FAF6F0"/>
             <w:tcMar>
               <w:top w:w="80" w:type="dxa"/>
@@ -8876,7 +8946,7 @@
         </w:tc>
         <w:tc>
           <w:tcPr>
-            <w:tcW w:type="dxa" w:w="936"/>
+            <w:tcW w:type="dxa" w:w="1224"/>
             <w:shd w:fill="FAF6F0"/>
             <w:tcMar>
               <w:top w:w="80" w:type="dxa"/>
@@ -8896,15 +8966,17 @@
                 <w:rFonts w:ascii="Calibri" w:hAnsi="Calibri"/>
                 <w:b/>
                 <w:color w:val="228B22"/>
-                <w:sz w:val="17"/>
+                <w:sz w:val="15"/>
               </w:rPr>
               <w:t>+70 HP</w:t>
-            </w:r>
-          </w:p>
-        </w:tc>
-        <w:tc>
-          <w:tcPr>
-            <w:tcW w:type="dxa" w:w="1080"/>
+              <w:br/>
+              <w:t>[OFFENSE] +3% Critical Chance (3m)</w:t>
+            </w:r>
+          </w:p>
+        </w:tc>
+        <w:tc>
+          <w:tcPr>
+            <w:tcW w:type="dxa" w:w="1008"/>
             <w:shd w:fill="FAF6F0"/>
             <w:tcMar>
               <w:top w:w="80" w:type="dxa"/>
@@ -8954,7 +9026,7 @@
                 <w:color w:val="323232"/>
                 <w:sz w:val="17"/>
               </w:rPr>
-              <w:t>2x Raw Potato, 2x Spud Sap, 1x Wood</w:t>
+              <w:t>2x Raw Potato, 2x Spud Sap, 1x Oak Wood</w:t>
             </w:r>
           </w:p>
         </w:tc>
@@ -8983,7 +9055,7 @@
                 <w:color w:val="505050"/>
                 <w:sz w:val="16"/>
               </w:rPr>
-              <w:t>Caramelized tuber pie baked to golden perfection with sweet forest sap. Restores 70 Health.</w:t>
+              <w:t>Flaky butter pastry shell filled with spiced mashed sweet tubers, brown cane sugar, cinnamon bark, and fresh dairy cream.</w:t>
             </w:r>
           </w:p>
         </w:tc>
@@ -9047,7 +9119,7 @@
         </w:tc>
         <w:tc>
           <w:tcPr>
-            <w:tcW w:type="dxa" w:w="1944"/>
+            <w:tcW w:type="dxa" w:w="1872"/>
             <w:shd w:fill="FFFFFF"/>
             <w:tcMar>
               <w:top w:w="80" w:type="dxa"/>
@@ -9075,7 +9147,7 @@
         </w:tc>
         <w:tc>
           <w:tcPr>
-            <w:tcW w:type="dxa" w:w="1512"/>
+            <w:tcW w:type="dxa" w:w="1368"/>
             <w:shd w:fill="FFFFFF"/>
             <w:tcMar>
               <w:top w:w="80" w:type="dxa"/>
@@ -9103,7 +9175,7 @@
         </w:tc>
         <w:tc>
           <w:tcPr>
-            <w:tcW w:type="dxa" w:w="936"/>
+            <w:tcW w:type="dxa" w:w="1224"/>
             <w:shd w:fill="FFFFFF"/>
             <w:tcMar>
               <w:top w:w="80" w:type="dxa"/>
@@ -9123,7 +9195,7 @@
                 <w:rFonts w:ascii="Calibri" w:hAnsi="Calibri"/>
                 <w:b/>
                 <w:color w:val="228B22"/>
-                <w:sz w:val="17"/>
+                <w:sz w:val="15"/>
               </w:rPr>
               <w:t>+35 HP</w:t>
             </w:r>
@@ -9131,7 +9203,7 @@
         </w:tc>
         <w:tc>
           <w:tcPr>
-            <w:tcW w:type="dxa" w:w="1080"/>
+            <w:tcW w:type="dxa" w:w="1008"/>
             <w:shd w:fill="FFFFFF"/>
             <w:tcMar>
               <w:top w:w="80" w:type="dxa"/>
@@ -9210,7 +9282,7 @@
                 <w:color w:val="505050"/>
                 <w:sz w:val="16"/>
               </w:rPr>
-              <w:t>Quick-acting botanical poultice ground from mashed spud pulp and soothing sap. Restores 35 Health.</w:t>
+              <w:t>Cool botanical poultice blended from crushed tuber pulp, wild mint, and soothing tree sap to draw out inflammation.</w:t>
             </w:r>
           </w:p>
         </w:tc>
@@ -9254,10 +9326,10 @@
       </w:tblPr>
       <w:tblGrid>
         <w:gridCol w:w="648"/>
-        <w:gridCol w:w="1944"/>
-        <w:gridCol w:w="1512"/>
-        <w:gridCol w:w="936"/>
-        <w:gridCol w:w="1080"/>
+        <w:gridCol w:w="1872"/>
+        <w:gridCol w:w="1368"/>
+        <w:gridCol w:w="1224"/>
+        <w:gridCol w:w="1008"/>
         <w:gridCol w:w="2376"/>
         <w:gridCol w:w="1728"/>
       </w:tblGrid>
@@ -9294,7 +9366,7 @@
         </w:tc>
         <w:tc>
           <w:tcPr>
-            <w:tcW w:type="dxa" w:w="1944"/>
+            <w:tcW w:type="dxa" w:w="1872"/>
             <w:shd w:fill="7B1113"/>
             <w:tcMar>
               <w:top w:w="110" w:type="dxa"/>
@@ -9321,7 +9393,7 @@
         </w:tc>
         <w:tc>
           <w:tcPr>
-            <w:tcW w:type="dxa" w:w="1512"/>
+            <w:tcW w:type="dxa" w:w="1368"/>
             <w:shd w:fill="7B1113"/>
             <w:tcMar>
               <w:top w:w="110" w:type="dxa"/>
@@ -9348,7 +9420,7 @@
         </w:tc>
         <w:tc>
           <w:tcPr>
-            <w:tcW w:type="dxa" w:w="936"/>
+            <w:tcW w:type="dxa" w:w="1224"/>
             <w:shd w:fill="7B1113"/>
             <w:tcMar>
               <w:top w:w="110" w:type="dxa"/>
@@ -9375,7 +9447,7 @@
         </w:tc>
         <w:tc>
           <w:tcPr>
-            <w:tcW w:type="dxa" w:w="1080"/>
+            <w:tcW w:type="dxa" w:w="1008"/>
             <w:shd w:fill="7B1113"/>
             <w:tcMar>
               <w:top w:w="110" w:type="dxa"/>
@@ -9514,7 +9586,7 @@
         </w:tc>
         <w:tc>
           <w:tcPr>
-            <w:tcW w:type="dxa" w:w="1944"/>
+            <w:tcW w:type="dxa" w:w="1872"/>
             <w:shd w:fill="FFFFFF"/>
             <w:tcMar>
               <w:top w:w="80" w:type="dxa"/>
@@ -9542,7 +9614,7 @@
         </w:tc>
         <w:tc>
           <w:tcPr>
-            <w:tcW w:type="dxa" w:w="1512"/>
+            <w:tcW w:type="dxa" w:w="1368"/>
             <w:shd w:fill="FFFFFF"/>
             <w:tcMar>
               <w:top w:w="80" w:type="dxa"/>
@@ -9570,7 +9642,7 @@
         </w:tc>
         <w:tc>
           <w:tcPr>
-            <w:tcW w:type="dxa" w:w="936"/>
+            <w:tcW w:type="dxa" w:w="1224"/>
             <w:shd w:fill="FFFFFF"/>
             <w:tcMar>
               <w:top w:w="80" w:type="dxa"/>
@@ -9590,7 +9662,7 @@
                 <w:rFonts w:ascii="Calibri" w:hAnsi="Calibri"/>
                 <w:b/>
                 <w:color w:val="228B22"/>
-                <w:sz w:val="17"/>
+                <w:sz w:val="15"/>
               </w:rPr>
               <w:t>+15 HP</w:t>
             </w:r>
@@ -9598,7 +9670,7 @@
         </w:tc>
         <w:tc>
           <w:tcPr>
-            <w:tcW w:type="dxa" w:w="1080"/>
+            <w:tcW w:type="dxa" w:w="1008"/>
             <w:shd w:fill="FFFFFF"/>
             <w:tcMar>
               <w:top w:w="80" w:type="dxa"/>
@@ -9741,7 +9813,7 @@
         </w:tc>
         <w:tc>
           <w:tcPr>
-            <w:tcW w:type="dxa" w:w="1944"/>
+            <w:tcW w:type="dxa" w:w="1872"/>
             <w:shd w:fill="FAF6F0"/>
             <w:tcMar>
               <w:top w:w="80" w:type="dxa"/>
@@ -9769,7 +9841,7 @@
         </w:tc>
         <w:tc>
           <w:tcPr>
-            <w:tcW w:type="dxa" w:w="1512"/>
+            <w:tcW w:type="dxa" w:w="1368"/>
             <w:shd w:fill="FAF6F0"/>
             <w:tcMar>
               <w:top w:w="80" w:type="dxa"/>
@@ -9797,7 +9869,7 @@
         </w:tc>
         <w:tc>
           <w:tcPr>
-            <w:tcW w:type="dxa" w:w="936"/>
+            <w:tcW w:type="dxa" w:w="1224"/>
             <w:shd w:fill="FAF6F0"/>
             <w:tcMar>
               <w:top w:w="80" w:type="dxa"/>
@@ -9817,7 +9889,7 @@
                 <w:rFonts w:ascii="Calibri" w:hAnsi="Calibri"/>
                 <w:b/>
                 <w:color w:val="228B22"/>
-                <w:sz w:val="17"/>
+                <w:sz w:val="15"/>
               </w:rPr>
               <w:t>+12 HP</w:t>
             </w:r>
@@ -9825,7 +9897,7 @@
         </w:tc>
         <w:tc>
           <w:tcPr>
-            <w:tcW w:type="dxa" w:w="1080"/>
+            <w:tcW w:type="dxa" w:w="1008"/>
             <w:shd w:fill="FAF6F0"/>
             <w:tcMar>
               <w:top w:w="80" w:type="dxa"/>
@@ -9968,7 +10040,7 @@
         </w:tc>
         <w:tc>
           <w:tcPr>
-            <w:tcW w:type="dxa" w:w="1944"/>
+            <w:tcW w:type="dxa" w:w="1872"/>
             <w:shd w:fill="FFFFFF"/>
             <w:tcMar>
               <w:top w:w="80" w:type="dxa"/>
@@ -9996,7 +10068,7 @@
         </w:tc>
         <w:tc>
           <w:tcPr>
-            <w:tcW w:type="dxa" w:w="1512"/>
+            <w:tcW w:type="dxa" w:w="1368"/>
             <w:shd w:fill="FFFFFF"/>
             <w:tcMar>
               <w:top w:w="80" w:type="dxa"/>
@@ -10024,7 +10096,7 @@
         </w:tc>
         <w:tc>
           <w:tcPr>
-            <w:tcW w:type="dxa" w:w="936"/>
+            <w:tcW w:type="dxa" w:w="1224"/>
             <w:shd w:fill="FFFFFF"/>
             <w:tcMar>
               <w:top w:w="80" w:type="dxa"/>
@@ -10044,7 +10116,7 @@
                 <w:rFonts w:ascii="Calibri" w:hAnsi="Calibri"/>
                 <w:b/>
                 <w:color w:val="228B22"/>
-                <w:sz w:val="17"/>
+                <w:sz w:val="15"/>
               </w:rPr>
               <w:t>+10 HP</w:t>
             </w:r>
@@ -10052,7 +10124,7 @@
         </w:tc>
         <w:tc>
           <w:tcPr>
-            <w:tcW w:type="dxa" w:w="1080"/>
+            <w:tcW w:type="dxa" w:w="1008"/>
             <w:shd w:fill="FFFFFF"/>
             <w:tcMar>
               <w:top w:w="80" w:type="dxa"/>
@@ -10195,7 +10267,7 @@
         </w:tc>
         <w:tc>
           <w:tcPr>
-            <w:tcW w:type="dxa" w:w="1944"/>
+            <w:tcW w:type="dxa" w:w="1872"/>
             <w:shd w:fill="FAF6F0"/>
             <w:tcMar>
               <w:top w:w="80" w:type="dxa"/>
@@ -10223,7 +10295,7 @@
         </w:tc>
         <w:tc>
           <w:tcPr>
-            <w:tcW w:type="dxa" w:w="1512"/>
+            <w:tcW w:type="dxa" w:w="1368"/>
             <w:shd w:fill="FAF6F0"/>
             <w:tcMar>
               <w:top w:w="80" w:type="dxa"/>
@@ -10251,7 +10323,7 @@
         </w:tc>
         <w:tc>
           <w:tcPr>
-            <w:tcW w:type="dxa" w:w="936"/>
+            <w:tcW w:type="dxa" w:w="1224"/>
             <w:shd w:fill="FAF6F0"/>
             <w:tcMar>
               <w:top w:w="80" w:type="dxa"/>
@@ -10271,7 +10343,7 @@
                 <w:rFonts w:ascii="Calibri" w:hAnsi="Calibri"/>
                 <w:b/>
                 <w:color w:val="228B22"/>
-                <w:sz w:val="17"/>
+                <w:sz w:val="15"/>
               </w:rPr>
               <w:t>+20 HP</w:t>
             </w:r>
@@ -10279,7 +10351,7 @@
         </w:tc>
         <w:tc>
           <w:tcPr>
-            <w:tcW w:type="dxa" w:w="1080"/>
+            <w:tcW w:type="dxa" w:w="1008"/>
             <w:shd w:fill="FAF6F0"/>
             <w:tcMar>
               <w:top w:w="80" w:type="dxa"/>
@@ -10422,7 +10494,7 @@
         </w:tc>
         <w:tc>
           <w:tcPr>
-            <w:tcW w:type="dxa" w:w="1944"/>
+            <w:tcW w:type="dxa" w:w="1872"/>
             <w:shd w:fill="FFFFFF"/>
             <w:tcMar>
               <w:top w:w="80" w:type="dxa"/>
@@ -10450,7 +10522,7 @@
         </w:tc>
         <w:tc>
           <w:tcPr>
-            <w:tcW w:type="dxa" w:w="1512"/>
+            <w:tcW w:type="dxa" w:w="1368"/>
             <w:shd w:fill="FFFFFF"/>
             <w:tcMar>
               <w:top w:w="80" w:type="dxa"/>
@@ -10478,7 +10550,7 @@
         </w:tc>
         <w:tc>
           <w:tcPr>
-            <w:tcW w:type="dxa" w:w="936"/>
+            <w:tcW w:type="dxa" w:w="1224"/>
             <w:shd w:fill="FFFFFF"/>
             <w:tcMar>
               <w:top w:w="80" w:type="dxa"/>
@@ -10498,7 +10570,7 @@
                 <w:rFonts w:ascii="Calibri" w:hAnsi="Calibri"/>
                 <w:b/>
                 <w:color w:val="228B22"/>
-                <w:sz w:val="17"/>
+                <w:sz w:val="15"/>
               </w:rPr>
               <w:t>+25 HP</w:t>
             </w:r>
@@ -10506,7 +10578,7 @@
         </w:tc>
         <w:tc>
           <w:tcPr>
-            <w:tcW w:type="dxa" w:w="1080"/>
+            <w:tcW w:type="dxa" w:w="1008"/>
             <w:shd w:fill="FFFFFF"/>
             <w:tcMar>
               <w:top w:w="80" w:type="dxa"/>
@@ -10649,7 +10721,7 @@
         </w:tc>
         <w:tc>
           <w:tcPr>
-            <w:tcW w:type="dxa" w:w="1944"/>
+            <w:tcW w:type="dxa" w:w="1872"/>
             <w:shd w:fill="FAF6F0"/>
             <w:tcMar>
               <w:top w:w="80" w:type="dxa"/>
@@ -10677,7 +10749,7 @@
         </w:tc>
         <w:tc>
           <w:tcPr>
-            <w:tcW w:type="dxa" w:w="1512"/>
+            <w:tcW w:type="dxa" w:w="1368"/>
             <w:shd w:fill="FAF6F0"/>
             <w:tcMar>
               <w:top w:w="80" w:type="dxa"/>
@@ -10705,7 +10777,7 @@
         </w:tc>
         <w:tc>
           <w:tcPr>
-            <w:tcW w:type="dxa" w:w="936"/>
+            <w:tcW w:type="dxa" w:w="1224"/>
             <w:shd w:fill="FAF6F0"/>
             <w:tcMar>
               <w:top w:w="80" w:type="dxa"/>
@@ -10725,7 +10797,7 @@
                 <w:rFonts w:ascii="Calibri" w:hAnsi="Calibri"/>
                 <w:b/>
                 <w:color w:val="228B22"/>
-                <w:sz w:val="17"/>
+                <w:sz w:val="15"/>
               </w:rPr>
               <w:t>+22 HP</w:t>
             </w:r>
@@ -10733,7 +10805,7 @@
         </w:tc>
         <w:tc>
           <w:tcPr>
-            <w:tcW w:type="dxa" w:w="1080"/>
+            <w:tcW w:type="dxa" w:w="1008"/>
             <w:shd w:fill="FAF6F0"/>
             <w:tcMar>
               <w:top w:w="80" w:type="dxa"/>
@@ -10876,7 +10948,7 @@
         </w:tc>
         <w:tc>
           <w:tcPr>
-            <w:tcW w:type="dxa" w:w="1944"/>
+            <w:tcW w:type="dxa" w:w="1872"/>
             <w:shd w:fill="FFFFFF"/>
             <w:tcMar>
               <w:top w:w="80" w:type="dxa"/>
@@ -10904,7 +10976,7 @@
         </w:tc>
         <w:tc>
           <w:tcPr>
-            <w:tcW w:type="dxa" w:w="1512"/>
+            <w:tcW w:type="dxa" w:w="1368"/>
             <w:shd w:fill="FFFFFF"/>
             <w:tcMar>
               <w:top w:w="80" w:type="dxa"/>
@@ -10932,7 +11004,7 @@
         </w:tc>
         <w:tc>
           <w:tcPr>
-            <w:tcW w:type="dxa" w:w="936"/>
+            <w:tcW w:type="dxa" w:w="1224"/>
             <w:shd w:fill="FFFFFF"/>
             <w:tcMar>
               <w:top w:w="80" w:type="dxa"/>
@@ -10952,7 +11024,7 @@
                 <w:rFonts w:ascii="Calibri" w:hAnsi="Calibri"/>
                 <w:b/>
                 <w:color w:val="228B22"/>
-                <w:sz w:val="17"/>
+                <w:sz w:val="15"/>
               </w:rPr>
               <w:t>+28 HP</w:t>
             </w:r>
@@ -10960,7 +11032,7 @@
         </w:tc>
         <w:tc>
           <w:tcPr>
-            <w:tcW w:type="dxa" w:w="1080"/>
+            <w:tcW w:type="dxa" w:w="1008"/>
             <w:shd w:fill="FFFFFF"/>
             <w:tcMar>
               <w:top w:w="80" w:type="dxa"/>
@@ -11103,7 +11175,7 @@
         </w:tc>
         <w:tc>
           <w:tcPr>
-            <w:tcW w:type="dxa" w:w="1944"/>
+            <w:tcW w:type="dxa" w:w="1872"/>
             <w:shd w:fill="FAF6F0"/>
             <w:tcMar>
               <w:top w:w="80" w:type="dxa"/>
@@ -11131,7 +11203,7 @@
         </w:tc>
         <w:tc>
           <w:tcPr>
-            <w:tcW w:type="dxa" w:w="1512"/>
+            <w:tcW w:type="dxa" w:w="1368"/>
             <w:shd w:fill="FAF6F0"/>
             <w:tcMar>
               <w:top w:w="80" w:type="dxa"/>
@@ -11159,7 +11231,7 @@
         </w:tc>
         <w:tc>
           <w:tcPr>
-            <w:tcW w:type="dxa" w:w="936"/>
+            <w:tcW w:type="dxa" w:w="1224"/>
             <w:shd w:fill="FAF6F0"/>
             <w:tcMar>
               <w:top w:w="80" w:type="dxa"/>
@@ -11179,7 +11251,7 @@
                 <w:rFonts w:ascii="Calibri" w:hAnsi="Calibri"/>
                 <w:b/>
                 <w:color w:val="228B22"/>
-                <w:sz w:val="17"/>
+                <w:sz w:val="15"/>
               </w:rPr>
               <w:t>+16 HP</w:t>
             </w:r>
@@ -11187,7 +11259,7 @@
         </w:tc>
         <w:tc>
           <w:tcPr>
-            <w:tcW w:type="dxa" w:w="1080"/>
+            <w:tcW w:type="dxa" w:w="1008"/>
             <w:shd w:fill="FAF6F0"/>
             <w:tcMar>
               <w:top w:w="80" w:type="dxa"/>
@@ -11330,7 +11402,7 @@
         </w:tc>
         <w:tc>
           <w:tcPr>
-            <w:tcW w:type="dxa" w:w="1944"/>
+            <w:tcW w:type="dxa" w:w="1872"/>
             <w:shd w:fill="FFFFFF"/>
             <w:tcMar>
               <w:top w:w="80" w:type="dxa"/>
@@ -11358,7 +11430,7 @@
         </w:tc>
         <w:tc>
           <w:tcPr>
-            <w:tcW w:type="dxa" w:w="1512"/>
+            <w:tcW w:type="dxa" w:w="1368"/>
             <w:shd w:fill="FFFFFF"/>
             <w:tcMar>
               <w:top w:w="80" w:type="dxa"/>
@@ -11386,7 +11458,7 @@
         </w:tc>
         <w:tc>
           <w:tcPr>
-            <w:tcW w:type="dxa" w:w="936"/>
+            <w:tcW w:type="dxa" w:w="1224"/>
             <w:shd w:fill="FFFFFF"/>
             <w:tcMar>
               <w:top w:w="80" w:type="dxa"/>
@@ -11406,7 +11478,7 @@
                 <w:rFonts w:ascii="Calibri" w:hAnsi="Calibri"/>
                 <w:b/>
                 <w:color w:val="228B22"/>
-                <w:sz w:val="17"/>
+                <w:sz w:val="15"/>
               </w:rPr>
               <w:t>+8 HP</w:t>
             </w:r>
@@ -11414,7 +11486,7 @@
         </w:tc>
         <w:tc>
           <w:tcPr>
-            <w:tcW w:type="dxa" w:w="1080"/>
+            <w:tcW w:type="dxa" w:w="1008"/>
             <w:shd w:fill="FFFFFF"/>
             <w:tcMar>
               <w:top w:w="80" w:type="dxa"/>
@@ -11557,7 +11629,7 @@
         </w:tc>
         <w:tc>
           <w:tcPr>
-            <w:tcW w:type="dxa" w:w="1944"/>
+            <w:tcW w:type="dxa" w:w="1872"/>
             <w:shd w:fill="FAF6F0"/>
             <w:tcMar>
               <w:top w:w="80" w:type="dxa"/>
@@ -11585,7 +11657,7 @@
         </w:tc>
         <w:tc>
           <w:tcPr>
-            <w:tcW w:type="dxa" w:w="1512"/>
+            <w:tcW w:type="dxa" w:w="1368"/>
             <w:shd w:fill="FAF6F0"/>
             <w:tcMar>
               <w:top w:w="80" w:type="dxa"/>
@@ -11613,7 +11685,7 @@
         </w:tc>
         <w:tc>
           <w:tcPr>
-            <w:tcW w:type="dxa" w:w="936"/>
+            <w:tcW w:type="dxa" w:w="1224"/>
             <w:shd w:fill="FAF6F0"/>
             <w:tcMar>
               <w:top w:w="80" w:type="dxa"/>
@@ -11633,7 +11705,7 @@
                 <w:rFonts w:ascii="Calibri" w:hAnsi="Calibri"/>
                 <w:b/>
                 <w:color w:val="228B22"/>
-                <w:sz w:val="17"/>
+                <w:sz w:val="15"/>
               </w:rPr>
               <w:t>+15 HP</w:t>
             </w:r>
@@ -11641,7 +11713,7 @@
         </w:tc>
         <w:tc>
           <w:tcPr>
-            <w:tcW w:type="dxa" w:w="1080"/>
+            <w:tcW w:type="dxa" w:w="1008"/>
             <w:shd w:fill="FAF6F0"/>
             <w:tcMar>
               <w:top w:w="80" w:type="dxa"/>
@@ -11764,10 +11836,10 @@
       </w:tblPr>
       <w:tblGrid>
         <w:gridCol w:w="648"/>
-        <w:gridCol w:w="1944"/>
-        <w:gridCol w:w="1512"/>
-        <w:gridCol w:w="936"/>
-        <w:gridCol w:w="1080"/>
+        <w:gridCol w:w="1872"/>
+        <w:gridCol w:w="1368"/>
+        <w:gridCol w:w="1224"/>
+        <w:gridCol w:w="1008"/>
         <w:gridCol w:w="2376"/>
         <w:gridCol w:w="1728"/>
       </w:tblGrid>
@@ -11804,7 +11876,7 @@
         </w:tc>
         <w:tc>
           <w:tcPr>
-            <w:tcW w:type="dxa" w:w="1944"/>
+            <w:tcW w:type="dxa" w:w="1872"/>
             <w:shd w:fill="7B1113"/>
             <w:tcMar>
               <w:top w:w="110" w:type="dxa"/>
@@ -11831,7 +11903,7 @@
         </w:tc>
         <w:tc>
           <w:tcPr>
-            <w:tcW w:type="dxa" w:w="1512"/>
+            <w:tcW w:type="dxa" w:w="1368"/>
             <w:shd w:fill="7B1113"/>
             <w:tcMar>
               <w:top w:w="110" w:type="dxa"/>
@@ -11858,7 +11930,7 @@
         </w:tc>
         <w:tc>
           <w:tcPr>
-            <w:tcW w:type="dxa" w:w="936"/>
+            <w:tcW w:type="dxa" w:w="1224"/>
             <w:shd w:fill="7B1113"/>
             <w:tcMar>
               <w:top w:w="110" w:type="dxa"/>
@@ -11885,7 +11957,7 @@
         </w:tc>
         <w:tc>
           <w:tcPr>
-            <w:tcW w:type="dxa" w:w="1080"/>
+            <w:tcW w:type="dxa" w:w="1008"/>
             <w:shd w:fill="7B1113"/>
             <w:tcMar>
               <w:top w:w="110" w:type="dxa"/>
@@ -12024,7 +12096,7 @@
         </w:tc>
         <w:tc>
           <w:tcPr>
-            <w:tcW w:type="dxa" w:w="1944"/>
+            <w:tcW w:type="dxa" w:w="1872"/>
             <w:shd w:fill="FFFFFF"/>
             <w:tcMar>
               <w:top w:w="80" w:type="dxa"/>
@@ -12052,7 +12124,7 @@
         </w:tc>
         <w:tc>
           <w:tcPr>
-            <w:tcW w:type="dxa" w:w="1512"/>
+            <w:tcW w:type="dxa" w:w="1368"/>
             <w:shd w:fill="FFFFFF"/>
             <w:tcMar>
               <w:top w:w="80" w:type="dxa"/>
@@ -12080,7 +12152,7 @@
         </w:tc>
         <w:tc>
           <w:tcPr>
-            <w:tcW w:type="dxa" w:w="936"/>
+            <w:tcW w:type="dxa" w:w="1224"/>
             <w:shd w:fill="FFFFFF"/>
             <w:tcMar>
               <w:top w:w="80" w:type="dxa"/>
@@ -12100,7 +12172,7 @@
                 <w:rFonts w:ascii="Calibri" w:hAnsi="Calibri"/>
                 <w:b/>
                 <w:color w:val="228B22"/>
-                <w:sz w:val="17"/>
+                <w:sz w:val="15"/>
               </w:rPr>
               <w:t>+16 HP</w:t>
             </w:r>
@@ -12108,7 +12180,7 @@
         </w:tc>
         <w:tc>
           <w:tcPr>
-            <w:tcW w:type="dxa" w:w="1080"/>
+            <w:tcW w:type="dxa" w:w="1008"/>
             <w:shd w:fill="FFFFFF"/>
             <w:tcMar>
               <w:top w:w="80" w:type="dxa"/>
@@ -12251,7 +12323,7 @@
         </w:tc>
         <w:tc>
           <w:tcPr>
-            <w:tcW w:type="dxa" w:w="1944"/>
+            <w:tcW w:type="dxa" w:w="1872"/>
             <w:shd w:fill="FAF6F0"/>
             <w:tcMar>
               <w:top w:w="80" w:type="dxa"/>
@@ -12279,7 +12351,7 @@
         </w:tc>
         <w:tc>
           <w:tcPr>
-            <w:tcW w:type="dxa" w:w="1512"/>
+            <w:tcW w:type="dxa" w:w="1368"/>
             <w:shd w:fill="FAF6F0"/>
             <w:tcMar>
               <w:top w:w="80" w:type="dxa"/>
@@ -12307,7 +12379,7 @@
         </w:tc>
         <w:tc>
           <w:tcPr>
-            <w:tcW w:type="dxa" w:w="936"/>
+            <w:tcW w:type="dxa" w:w="1224"/>
             <w:shd w:fill="FAF6F0"/>
             <w:tcMar>
               <w:top w:w="80" w:type="dxa"/>
@@ -12327,7 +12399,7 @@
                 <w:rFonts w:ascii="Calibri" w:hAnsi="Calibri"/>
                 <w:b/>
                 <w:color w:val="228B22"/>
-                <w:sz w:val="17"/>
+                <w:sz w:val="15"/>
               </w:rPr>
               <w:t>+20 HP</w:t>
             </w:r>
@@ -12335,7 +12407,7 @@
         </w:tc>
         <w:tc>
           <w:tcPr>
-            <w:tcW w:type="dxa" w:w="1080"/>
+            <w:tcW w:type="dxa" w:w="1008"/>
             <w:shd w:fill="FAF6F0"/>
             <w:tcMar>
               <w:top w:w="80" w:type="dxa"/>
@@ -12478,7 +12550,7 @@
         </w:tc>
         <w:tc>
           <w:tcPr>
-            <w:tcW w:type="dxa" w:w="1944"/>
+            <w:tcW w:type="dxa" w:w="1872"/>
             <w:shd w:fill="FFFFFF"/>
             <w:tcMar>
               <w:top w:w="80" w:type="dxa"/>
@@ -12506,7 +12578,7 @@
         </w:tc>
         <w:tc>
           <w:tcPr>
-            <w:tcW w:type="dxa" w:w="1512"/>
+            <w:tcW w:type="dxa" w:w="1368"/>
             <w:shd w:fill="FFFFFF"/>
             <w:tcMar>
               <w:top w:w="80" w:type="dxa"/>
@@ -12534,7 +12606,7 @@
         </w:tc>
         <w:tc>
           <w:tcPr>
-            <w:tcW w:type="dxa" w:w="936"/>
+            <w:tcW w:type="dxa" w:w="1224"/>
             <w:shd w:fill="FFFFFF"/>
             <w:tcMar>
               <w:top w:w="80" w:type="dxa"/>
@@ -12554,7 +12626,7 @@
                 <w:rFonts w:ascii="Calibri" w:hAnsi="Calibri"/>
                 <w:b/>
                 <w:color w:val="228B22"/>
-                <w:sz w:val="17"/>
+                <w:sz w:val="15"/>
               </w:rPr>
               <w:t>+25 HP</w:t>
             </w:r>
@@ -12562,7 +12634,7 @@
         </w:tc>
         <w:tc>
           <w:tcPr>
-            <w:tcW w:type="dxa" w:w="1080"/>
+            <w:tcW w:type="dxa" w:w="1008"/>
             <w:shd w:fill="FFFFFF"/>
             <w:tcMar>
               <w:top w:w="80" w:type="dxa"/>
@@ -12705,7 +12777,7 @@
         </w:tc>
         <w:tc>
           <w:tcPr>
-            <w:tcW w:type="dxa" w:w="1944"/>
+            <w:tcW w:type="dxa" w:w="1872"/>
             <w:shd w:fill="FAF6F0"/>
             <w:tcMar>
               <w:top w:w="80" w:type="dxa"/>
@@ -12733,7 +12805,7 @@
         </w:tc>
         <w:tc>
           <w:tcPr>
-            <w:tcW w:type="dxa" w:w="1512"/>
+            <w:tcW w:type="dxa" w:w="1368"/>
             <w:shd w:fill="FAF6F0"/>
             <w:tcMar>
               <w:top w:w="80" w:type="dxa"/>
@@ -12761,7 +12833,7 @@
         </w:tc>
         <w:tc>
           <w:tcPr>
-            <w:tcW w:type="dxa" w:w="936"/>
+            <w:tcW w:type="dxa" w:w="1224"/>
             <w:shd w:fill="FAF6F0"/>
             <w:tcMar>
               <w:top w:w="80" w:type="dxa"/>
@@ -12781,7 +12853,7 @@
                 <w:rFonts w:ascii="Calibri" w:hAnsi="Calibri"/>
                 <w:b/>
                 <w:color w:val="228B22"/>
-                <w:sz w:val="17"/>
+                <w:sz w:val="15"/>
               </w:rPr>
               <w:t>+28 HP</w:t>
             </w:r>
@@ -12789,7 +12861,7 @@
         </w:tc>
         <w:tc>
           <w:tcPr>
-            <w:tcW w:type="dxa" w:w="1080"/>
+            <w:tcW w:type="dxa" w:w="1008"/>
             <w:shd w:fill="FAF6F0"/>
             <w:tcMar>
               <w:top w:w="80" w:type="dxa"/>
@@ -12868,7 +12940,7 @@
                 <w:color w:val="505050"/>
                 <w:sz w:val="16"/>
               </w:rPr>
-              <w:t>Meaty beef shank bone with rich marrow center from native carabao.</w:t>
+              <w:t>Meaty beef shank bone with rich marrow center from native cattle.</w:t>
             </w:r>
           </w:p>
         </w:tc>
@@ -12932,7 +13004,7 @@
         </w:tc>
         <w:tc>
           <w:tcPr>
-            <w:tcW w:type="dxa" w:w="1944"/>
+            <w:tcW w:type="dxa" w:w="1872"/>
             <w:shd w:fill="FFFFFF"/>
             <w:tcMar>
               <w:top w:w="80" w:type="dxa"/>
@@ -12960,7 +13032,7 @@
         </w:tc>
         <w:tc>
           <w:tcPr>
-            <w:tcW w:type="dxa" w:w="1512"/>
+            <w:tcW w:type="dxa" w:w="1368"/>
             <w:shd w:fill="FFFFFF"/>
             <w:tcMar>
               <w:top w:w="80" w:type="dxa"/>
@@ -12988,7 +13060,7 @@
         </w:tc>
         <w:tc>
           <w:tcPr>
-            <w:tcW w:type="dxa" w:w="936"/>
+            <w:tcW w:type="dxa" w:w="1224"/>
             <w:shd w:fill="FFFFFF"/>
             <w:tcMar>
               <w:top w:w="80" w:type="dxa"/>
@@ -13008,7 +13080,7 @@
                 <w:rFonts w:ascii="Calibri" w:hAnsi="Calibri"/>
                 <w:b/>
                 <w:color w:val="228B22"/>
-                <w:sz w:val="17"/>
+                <w:sz w:val="15"/>
               </w:rPr>
               <w:t>+24 HP</w:t>
             </w:r>
@@ -13016,7 +13088,7 @@
         </w:tc>
         <w:tc>
           <w:tcPr>
-            <w:tcW w:type="dxa" w:w="1080"/>
+            <w:tcW w:type="dxa" w:w="1008"/>
             <w:shd w:fill="FFFFFF"/>
             <w:tcMar>
               <w:top w:w="80" w:type="dxa"/>
@@ -13159,7 +13231,7 @@
         </w:tc>
         <w:tc>
           <w:tcPr>
-            <w:tcW w:type="dxa" w:w="1944"/>
+            <w:tcW w:type="dxa" w:w="1872"/>
             <w:shd w:fill="FAF6F0"/>
             <w:tcMar>
               <w:top w:w="80" w:type="dxa"/>
@@ -13187,7 +13259,7 @@
         </w:tc>
         <w:tc>
           <w:tcPr>
-            <w:tcW w:type="dxa" w:w="1512"/>
+            <w:tcW w:type="dxa" w:w="1368"/>
             <w:shd w:fill="FAF6F0"/>
             <w:tcMar>
               <w:top w:w="80" w:type="dxa"/>
@@ -13215,7 +13287,7 @@
         </w:tc>
         <w:tc>
           <w:tcPr>
-            <w:tcW w:type="dxa" w:w="936"/>
+            <w:tcW w:type="dxa" w:w="1224"/>
             <w:shd w:fill="FAF6F0"/>
             <w:tcMar>
               <w:top w:w="80" w:type="dxa"/>
@@ -13235,7 +13307,7 @@
                 <w:rFonts w:ascii="Calibri" w:hAnsi="Calibri"/>
                 <w:b/>
                 <w:color w:val="228B22"/>
-                <w:sz w:val="17"/>
+                <w:sz w:val="15"/>
               </w:rPr>
               <w:t>+12 HP</w:t>
             </w:r>
@@ -13243,7 +13315,7 @@
         </w:tc>
         <w:tc>
           <w:tcPr>
-            <w:tcW w:type="dxa" w:w="1080"/>
+            <w:tcW w:type="dxa" w:w="1008"/>
             <w:shd w:fill="FAF6F0"/>
             <w:tcMar>
               <w:top w:w="80" w:type="dxa"/>
@@ -13386,7 +13458,7 @@
         </w:tc>
         <w:tc>
           <w:tcPr>
-            <w:tcW w:type="dxa" w:w="1944"/>
+            <w:tcW w:type="dxa" w:w="1872"/>
             <w:shd w:fill="FFFFFF"/>
             <w:tcMar>
               <w:top w:w="80" w:type="dxa"/>
@@ -13414,7 +13486,7 @@
         </w:tc>
         <w:tc>
           <w:tcPr>
-            <w:tcW w:type="dxa" w:w="1512"/>
+            <w:tcW w:type="dxa" w:w="1368"/>
             <w:shd w:fill="FFFFFF"/>
             <w:tcMar>
               <w:top w:w="80" w:type="dxa"/>
@@ -13442,7 +13514,7 @@
         </w:tc>
         <w:tc>
           <w:tcPr>
-            <w:tcW w:type="dxa" w:w="936"/>
+            <w:tcW w:type="dxa" w:w="1224"/>
             <w:shd w:fill="FFFFFF"/>
             <w:tcMar>
               <w:top w:w="80" w:type="dxa"/>
@@ -13462,7 +13534,7 @@
                 <w:rFonts w:ascii="Calibri" w:hAnsi="Calibri"/>
                 <w:b/>
                 <w:color w:val="228B22"/>
-                <w:sz w:val="17"/>
+                <w:sz w:val="15"/>
               </w:rPr>
               <w:t>+35 HP</w:t>
             </w:r>
@@ -13470,7 +13542,7 @@
         </w:tc>
         <w:tc>
           <w:tcPr>
-            <w:tcW w:type="dxa" w:w="1080"/>
+            <w:tcW w:type="dxa" w:w="1008"/>
             <w:shd w:fill="FFFFFF"/>
             <w:tcMar>
               <w:top w:w="80" w:type="dxa"/>
@@ -13593,10 +13665,10 @@
       </w:tblPr>
       <w:tblGrid>
         <w:gridCol w:w="648"/>
-        <w:gridCol w:w="1944"/>
-        <w:gridCol w:w="1512"/>
-        <w:gridCol w:w="936"/>
-        <w:gridCol w:w="1080"/>
+        <w:gridCol w:w="1872"/>
+        <w:gridCol w:w="1368"/>
+        <w:gridCol w:w="1224"/>
+        <w:gridCol w:w="1008"/>
         <w:gridCol w:w="2376"/>
         <w:gridCol w:w="1728"/>
       </w:tblGrid>
@@ -13633,7 +13705,7 @@
         </w:tc>
         <w:tc>
           <w:tcPr>
-            <w:tcW w:type="dxa" w:w="1944"/>
+            <w:tcW w:type="dxa" w:w="1872"/>
             <w:shd w:fill="7B1113"/>
             <w:tcMar>
               <w:top w:w="110" w:type="dxa"/>
@@ -13660,7 +13732,7 @@
         </w:tc>
         <w:tc>
           <w:tcPr>
-            <w:tcW w:type="dxa" w:w="1512"/>
+            <w:tcW w:type="dxa" w:w="1368"/>
             <w:shd w:fill="7B1113"/>
             <w:tcMar>
               <w:top w:w="110" w:type="dxa"/>
@@ -13687,7 +13759,7 @@
         </w:tc>
         <w:tc>
           <w:tcPr>
-            <w:tcW w:type="dxa" w:w="936"/>
+            <w:tcW w:type="dxa" w:w="1224"/>
             <w:shd w:fill="7B1113"/>
             <w:tcMar>
               <w:top w:w="110" w:type="dxa"/>
@@ -13714,7 +13786,7 @@
         </w:tc>
         <w:tc>
           <w:tcPr>
-            <w:tcW w:type="dxa" w:w="1080"/>
+            <w:tcW w:type="dxa" w:w="1008"/>
             <w:shd w:fill="7B1113"/>
             <w:tcMar>
               <w:top w:w="110" w:type="dxa"/>
@@ -13853,7 +13925,7 @@
         </w:tc>
         <w:tc>
           <w:tcPr>
-            <w:tcW w:type="dxa" w:w="1944"/>
+            <w:tcW w:type="dxa" w:w="1872"/>
             <w:shd w:fill="FFFFFF"/>
             <w:tcMar>
               <w:top w:w="80" w:type="dxa"/>
@@ -13881,7 +13953,7 @@
         </w:tc>
         <w:tc>
           <w:tcPr>
-            <w:tcW w:type="dxa" w:w="1512"/>
+            <w:tcW w:type="dxa" w:w="1368"/>
             <w:shd w:fill="FFFFFF"/>
             <w:tcMar>
               <w:top w:w="80" w:type="dxa"/>
@@ -13909,7 +13981,7 @@
         </w:tc>
         <w:tc>
           <w:tcPr>
-            <w:tcW w:type="dxa" w:w="936"/>
+            <w:tcW w:type="dxa" w:w="1224"/>
             <w:shd w:fill="FFFFFF"/>
             <w:tcMar>
               <w:top w:w="80" w:type="dxa"/>
@@ -13929,7 +14001,7 @@
                 <w:rFonts w:ascii="Calibri" w:hAnsi="Calibri"/>
                 <w:b/>
                 <w:color w:val="228B22"/>
-                <w:sz w:val="17"/>
+                <w:sz w:val="15"/>
               </w:rPr>
               <w:t>+25 HP</w:t>
             </w:r>
@@ -13937,7 +14009,7 @@
         </w:tc>
         <w:tc>
           <w:tcPr>
-            <w:tcW w:type="dxa" w:w="1080"/>
+            <w:tcW w:type="dxa" w:w="1008"/>
             <w:shd w:fill="FFFFFF"/>
             <w:tcMar>
               <w:top w:w="80" w:type="dxa"/>
@@ -14016,7 +14088,7 @@
                 <w:color w:val="505050"/>
                 <w:sz w:val="16"/>
               </w:rPr>
-              <w:t>Crisp subterranean tuber. Right-click to consume for +25 HP or cook in a furnace.</w:t>
+              <w:t>Crisp subterranean tuber freshly dug from rich loam. Can be eaten raw in emergencies or cooked in a furnace.</w:t>
             </w:r>
           </w:p>
         </w:tc>
@@ -14080,7 +14152,7 @@
         </w:tc>
         <w:tc>
           <w:tcPr>
-            <w:tcW w:type="dxa" w:w="1944"/>
+            <w:tcW w:type="dxa" w:w="1872"/>
             <w:shd w:fill="FAF6F0"/>
             <w:tcMar>
               <w:top w:w="80" w:type="dxa"/>
@@ -14108,7 +14180,7 @@
         </w:tc>
         <w:tc>
           <w:tcPr>
-            <w:tcW w:type="dxa" w:w="1512"/>
+            <w:tcW w:type="dxa" w:w="1368"/>
             <w:shd w:fill="FAF6F0"/>
             <w:tcMar>
               <w:top w:w="80" w:type="dxa"/>
@@ -14136,7 +14208,7 @@
         </w:tc>
         <w:tc>
           <w:tcPr>
-            <w:tcW w:type="dxa" w:w="936"/>
+            <w:tcW w:type="dxa" w:w="1224"/>
             <w:shd w:fill="FAF6F0"/>
             <w:tcMar>
               <w:top w:w="80" w:type="dxa"/>
@@ -14156,7 +14228,7 @@
                 <w:rFonts w:ascii="Calibri" w:hAnsi="Calibri"/>
                 <w:b w:val="0"/>
                 <w:color w:val="323232"/>
-                <w:sz w:val="17"/>
+                <w:sz w:val="15"/>
               </w:rPr>
               <w:t>Base</w:t>
             </w:r>
@@ -14164,7 +14236,7 @@
         </w:tc>
         <w:tc>
           <w:tcPr>
-            <w:tcW w:type="dxa" w:w="1080"/>
+            <w:tcW w:type="dxa" w:w="1008"/>
             <w:shd w:fill="FAF6F0"/>
             <w:tcMar>
               <w:top w:w="80" w:type="dxa"/>
@@ -14307,7 +14379,7 @@
         </w:tc>
         <w:tc>
           <w:tcPr>
-            <w:tcW w:type="dxa" w:w="1944"/>
+            <w:tcW w:type="dxa" w:w="1872"/>
             <w:shd w:fill="FFFFFF"/>
             <w:tcMar>
               <w:top w:w="80" w:type="dxa"/>
@@ -14335,7 +14407,7 @@
         </w:tc>
         <w:tc>
           <w:tcPr>
-            <w:tcW w:type="dxa" w:w="1512"/>
+            <w:tcW w:type="dxa" w:w="1368"/>
             <w:shd w:fill="FFFFFF"/>
             <w:tcMar>
               <w:top w:w="80" w:type="dxa"/>
@@ -14363,7 +14435,7 @@
         </w:tc>
         <w:tc>
           <w:tcPr>
-            <w:tcW w:type="dxa" w:w="936"/>
+            <w:tcW w:type="dxa" w:w="1224"/>
             <w:shd w:fill="FFFFFF"/>
             <w:tcMar>
               <w:top w:w="80" w:type="dxa"/>
@@ -14383,7 +14455,7 @@
                 <w:rFonts w:ascii="Calibri" w:hAnsi="Calibri"/>
                 <w:b w:val="0"/>
                 <w:color w:val="323232"/>
-                <w:sz w:val="17"/>
+                <w:sz w:val="15"/>
               </w:rPr>
               <w:t>Base</w:t>
             </w:r>
@@ -14391,7 +14463,7 @@
         </w:tc>
         <w:tc>
           <w:tcPr>
-            <w:tcW w:type="dxa" w:w="1080"/>
+            <w:tcW w:type="dxa" w:w="1008"/>
             <w:shd w:fill="FFFFFF"/>
             <w:tcMar>
               <w:top w:w="80" w:type="dxa"/>
@@ -14534,7 +14606,7 @@
         </w:tc>
         <w:tc>
           <w:tcPr>
-            <w:tcW w:type="dxa" w:w="1944"/>
+            <w:tcW w:type="dxa" w:w="1872"/>
             <w:shd w:fill="FAF6F0"/>
             <w:tcMar>
               <w:top w:w="80" w:type="dxa"/>
@@ -14562,7 +14634,7 @@
         </w:tc>
         <w:tc>
           <w:tcPr>
-            <w:tcW w:type="dxa" w:w="1512"/>
+            <w:tcW w:type="dxa" w:w="1368"/>
             <w:shd w:fill="FAF6F0"/>
             <w:tcMar>
               <w:top w:w="80" w:type="dxa"/>
@@ -14590,7 +14662,7 @@
         </w:tc>
         <w:tc>
           <w:tcPr>
-            <w:tcW w:type="dxa" w:w="936"/>
+            <w:tcW w:type="dxa" w:w="1224"/>
             <w:shd w:fill="FAF6F0"/>
             <w:tcMar>
               <w:top w:w="80" w:type="dxa"/>
@@ -14610,7 +14682,7 @@
                 <w:rFonts w:ascii="Calibri" w:hAnsi="Calibri"/>
                 <w:b w:val="0"/>
                 <w:color w:val="323232"/>
-                <w:sz w:val="17"/>
+                <w:sz w:val="15"/>
               </w:rPr>
               <w:t>Base</w:t>
             </w:r>
@@ -14618,7 +14690,7 @@
         </w:tc>
         <w:tc>
           <w:tcPr>
-            <w:tcW w:type="dxa" w:w="1080"/>
+            <w:tcW w:type="dxa" w:w="1008"/>
             <w:shd w:fill="FAF6F0"/>
             <w:tcMar>
               <w:top w:w="80" w:type="dxa"/>
@@ -14761,7 +14833,7 @@
         </w:tc>
         <w:tc>
           <w:tcPr>
-            <w:tcW w:type="dxa" w:w="1944"/>
+            <w:tcW w:type="dxa" w:w="1872"/>
             <w:shd w:fill="FFFFFF"/>
             <w:tcMar>
               <w:top w:w="80" w:type="dxa"/>
@@ -14789,7 +14861,7 @@
         </w:tc>
         <w:tc>
           <w:tcPr>
-            <w:tcW w:type="dxa" w:w="1512"/>
+            <w:tcW w:type="dxa" w:w="1368"/>
             <w:shd w:fill="FFFFFF"/>
             <w:tcMar>
               <w:top w:w="80" w:type="dxa"/>
@@ -14817,7 +14889,7 @@
         </w:tc>
         <w:tc>
           <w:tcPr>
-            <w:tcW w:type="dxa" w:w="936"/>
+            <w:tcW w:type="dxa" w:w="1224"/>
             <w:shd w:fill="FFFFFF"/>
             <w:tcMar>
               <w:top w:w="80" w:type="dxa"/>
@@ -14837,7 +14909,7 @@
                 <w:rFonts w:ascii="Calibri" w:hAnsi="Calibri"/>
                 <w:b w:val="0"/>
                 <w:color w:val="323232"/>
-                <w:sz w:val="17"/>
+                <w:sz w:val="15"/>
               </w:rPr>
               <w:t>Base</w:t>
             </w:r>
@@ -14845,7 +14917,7 @@
         </w:tc>
         <w:tc>
           <w:tcPr>
-            <w:tcW w:type="dxa" w:w="1080"/>
+            <w:tcW w:type="dxa" w:w="1008"/>
             <w:shd w:fill="FFFFFF"/>
             <w:tcMar>
               <w:top w:w="80" w:type="dxa"/>
@@ -14988,7 +15060,7 @@
         </w:tc>
         <w:tc>
           <w:tcPr>
-            <w:tcW w:type="dxa" w:w="1944"/>
+            <w:tcW w:type="dxa" w:w="1872"/>
             <w:shd w:fill="FAF6F0"/>
             <w:tcMar>
               <w:top w:w="80" w:type="dxa"/>
@@ -15016,7 +15088,7 @@
         </w:tc>
         <w:tc>
           <w:tcPr>
-            <w:tcW w:type="dxa" w:w="1512"/>
+            <w:tcW w:type="dxa" w:w="1368"/>
             <w:shd w:fill="FAF6F0"/>
             <w:tcMar>
               <w:top w:w="80" w:type="dxa"/>
@@ -15044,7 +15116,7 @@
         </w:tc>
         <w:tc>
           <w:tcPr>
-            <w:tcW w:type="dxa" w:w="936"/>
+            <w:tcW w:type="dxa" w:w="1224"/>
             <w:shd w:fill="FAF6F0"/>
             <w:tcMar>
               <w:top w:w="80" w:type="dxa"/>
@@ -15064,7 +15136,7 @@
                 <w:rFonts w:ascii="Calibri" w:hAnsi="Calibri"/>
                 <w:b w:val="0"/>
                 <w:color w:val="323232"/>
-                <w:sz w:val="17"/>
+                <w:sz w:val="15"/>
               </w:rPr>
               <w:t>Base</w:t>
             </w:r>
@@ -15072,7 +15144,7 @@
         </w:tc>
         <w:tc>
           <w:tcPr>
-            <w:tcW w:type="dxa" w:w="1080"/>
+            <w:tcW w:type="dxa" w:w="1008"/>
             <w:shd w:fill="FAF6F0"/>
             <w:tcMar>
               <w:top w:w="80" w:type="dxa"/>
@@ -15215,7 +15287,7 @@
         </w:tc>
         <w:tc>
           <w:tcPr>
-            <w:tcW w:type="dxa" w:w="1944"/>
+            <w:tcW w:type="dxa" w:w="1872"/>
             <w:shd w:fill="FFFFFF"/>
             <w:tcMar>
               <w:top w:w="80" w:type="dxa"/>
@@ -15243,7 +15315,7 @@
         </w:tc>
         <w:tc>
           <w:tcPr>
-            <w:tcW w:type="dxa" w:w="1512"/>
+            <w:tcW w:type="dxa" w:w="1368"/>
             <w:shd w:fill="FFFFFF"/>
             <w:tcMar>
               <w:top w:w="80" w:type="dxa"/>
@@ -15271,7 +15343,7 @@
         </w:tc>
         <w:tc>
           <w:tcPr>
-            <w:tcW w:type="dxa" w:w="936"/>
+            <w:tcW w:type="dxa" w:w="1224"/>
             <w:shd w:fill="FFFFFF"/>
             <w:tcMar>
               <w:top w:w="80" w:type="dxa"/>
@@ -15291,7 +15363,7 @@
                 <w:rFonts w:ascii="Calibri" w:hAnsi="Calibri"/>
                 <w:b/>
                 <w:color w:val="228B22"/>
-                <w:sz w:val="17"/>
+                <w:sz w:val="15"/>
               </w:rPr>
               <w:t>+12 HP</w:t>
             </w:r>
@@ -15299,7 +15371,7 @@
         </w:tc>
         <w:tc>
           <w:tcPr>
-            <w:tcW w:type="dxa" w:w="1080"/>
+            <w:tcW w:type="dxa" w:w="1008"/>
             <w:shd w:fill="FFFFFF"/>
             <w:tcMar>
               <w:top w:w="80" w:type="dxa"/>
@@ -15442,7 +15514,7 @@
         </w:tc>
         <w:tc>
           <w:tcPr>
-            <w:tcW w:type="dxa" w:w="1944"/>
+            <w:tcW w:type="dxa" w:w="1872"/>
             <w:shd w:fill="FAF6F0"/>
             <w:tcMar>
               <w:top w:w="80" w:type="dxa"/>
@@ -15470,7 +15542,7 @@
         </w:tc>
         <w:tc>
           <w:tcPr>
-            <w:tcW w:type="dxa" w:w="1512"/>
+            <w:tcW w:type="dxa" w:w="1368"/>
             <w:shd w:fill="FAF6F0"/>
             <w:tcMar>
               <w:top w:w="80" w:type="dxa"/>
@@ -15498,7 +15570,7 @@
         </w:tc>
         <w:tc>
           <w:tcPr>
-            <w:tcW w:type="dxa" w:w="936"/>
+            <w:tcW w:type="dxa" w:w="1224"/>
             <w:shd w:fill="FAF6F0"/>
             <w:tcMar>
               <w:top w:w="80" w:type="dxa"/>
@@ -15518,7 +15590,7 @@
                 <w:rFonts w:ascii="Calibri" w:hAnsi="Calibri"/>
                 <w:b/>
                 <w:color w:val="228B22"/>
-                <w:sz w:val="17"/>
+                <w:sz w:val="15"/>
               </w:rPr>
               <w:t>+12 HP</w:t>
             </w:r>
@@ -15526,7 +15598,7 @@
         </w:tc>
         <w:tc>
           <w:tcPr>
-            <w:tcW w:type="dxa" w:w="1080"/>
+            <w:tcW w:type="dxa" w:w="1008"/>
             <w:shd w:fill="FAF6F0"/>
             <w:tcMar>
               <w:top w:w="80" w:type="dxa"/>
@@ -15669,7 +15741,7 @@
         </w:tc>
         <w:tc>
           <w:tcPr>
-            <w:tcW w:type="dxa" w:w="1944"/>
+            <w:tcW w:type="dxa" w:w="1872"/>
             <w:shd w:fill="FFFFFF"/>
             <w:tcMar>
               <w:top w:w="80" w:type="dxa"/>
@@ -15697,7 +15769,7 @@
         </w:tc>
         <w:tc>
           <w:tcPr>
-            <w:tcW w:type="dxa" w:w="1512"/>
+            <w:tcW w:type="dxa" w:w="1368"/>
             <w:shd w:fill="FFFFFF"/>
             <w:tcMar>
               <w:top w:w="80" w:type="dxa"/>
@@ -15725,7 +15797,7 @@
         </w:tc>
         <w:tc>
           <w:tcPr>
-            <w:tcW w:type="dxa" w:w="936"/>
+            <w:tcW w:type="dxa" w:w="1224"/>
             <w:shd w:fill="FFFFFF"/>
             <w:tcMar>
               <w:top w:w="80" w:type="dxa"/>
@@ -15745,7 +15817,7 @@
                 <w:rFonts w:ascii="Calibri" w:hAnsi="Calibri"/>
                 <w:b w:val="0"/>
                 <w:color w:val="323232"/>
-                <w:sz w:val="17"/>
+                <w:sz w:val="15"/>
               </w:rPr>
               <w:t>Base</w:t>
             </w:r>
@@ -15753,7 +15825,7 @@
         </w:tc>
         <w:tc>
           <w:tcPr>
-            <w:tcW w:type="dxa" w:w="1080"/>
+            <w:tcW w:type="dxa" w:w="1008"/>
             <w:shd w:fill="FFFFFF"/>
             <w:tcMar>
               <w:top w:w="80" w:type="dxa"/>
@@ -15896,7 +15968,7 @@
         </w:tc>
         <w:tc>
           <w:tcPr>
-            <w:tcW w:type="dxa" w:w="1944"/>
+            <w:tcW w:type="dxa" w:w="1872"/>
             <w:shd w:fill="FAF6F0"/>
             <w:tcMar>
               <w:top w:w="80" w:type="dxa"/>
@@ -15924,7 +15996,7 @@
         </w:tc>
         <w:tc>
           <w:tcPr>
-            <w:tcW w:type="dxa" w:w="1512"/>
+            <w:tcW w:type="dxa" w:w="1368"/>
             <w:shd w:fill="FAF6F0"/>
             <w:tcMar>
               <w:top w:w="80" w:type="dxa"/>
@@ -15952,7 +16024,7 @@
         </w:tc>
         <w:tc>
           <w:tcPr>
-            <w:tcW w:type="dxa" w:w="936"/>
+            <w:tcW w:type="dxa" w:w="1224"/>
             <w:shd w:fill="FAF6F0"/>
             <w:tcMar>
               <w:top w:w="80" w:type="dxa"/>
@@ -15972,7 +16044,7 @@
                 <w:rFonts w:ascii="Calibri" w:hAnsi="Calibri"/>
                 <w:b/>
                 <w:color w:val="228B22"/>
-                <w:sz w:val="17"/>
+                <w:sz w:val="15"/>
               </w:rPr>
               <w:t>+10 HP</w:t>
             </w:r>
@@ -15980,7 +16052,7 @@
         </w:tc>
         <w:tc>
           <w:tcPr>
-            <w:tcW w:type="dxa" w:w="1080"/>
+            <w:tcW w:type="dxa" w:w="1008"/>
             <w:shd w:fill="FAF6F0"/>
             <w:tcMar>
               <w:top w:w="80" w:type="dxa"/>
@@ -16123,7 +16195,7 @@
         </w:tc>
         <w:tc>
           <w:tcPr>
-            <w:tcW w:type="dxa" w:w="1944"/>
+            <w:tcW w:type="dxa" w:w="1872"/>
             <w:shd w:fill="FFFFFF"/>
             <w:tcMar>
               <w:top w:w="80" w:type="dxa"/>
@@ -16151,7 +16223,7 @@
         </w:tc>
         <w:tc>
           <w:tcPr>
-            <w:tcW w:type="dxa" w:w="1512"/>
+            <w:tcW w:type="dxa" w:w="1368"/>
             <w:shd w:fill="FFFFFF"/>
             <w:tcMar>
               <w:top w:w="80" w:type="dxa"/>
@@ -16179,7 +16251,7 @@
         </w:tc>
         <w:tc>
           <w:tcPr>
-            <w:tcW w:type="dxa" w:w="936"/>
+            <w:tcW w:type="dxa" w:w="1224"/>
             <w:shd w:fill="FFFFFF"/>
             <w:tcMar>
               <w:top w:w="80" w:type="dxa"/>
@@ -16199,7 +16271,7 @@
                 <w:rFonts w:ascii="Calibri" w:hAnsi="Calibri"/>
                 <w:b w:val="0"/>
                 <w:color w:val="323232"/>
-                <w:sz w:val="17"/>
+                <w:sz w:val="15"/>
               </w:rPr>
               <w:t>Base</w:t>
             </w:r>
@@ -16207,7 +16279,7 @@
         </w:tc>
         <w:tc>
           <w:tcPr>
-            <w:tcW w:type="dxa" w:w="1080"/>
+            <w:tcW w:type="dxa" w:w="1008"/>
             <w:shd w:fill="FFFFFF"/>
             <w:tcMar>
               <w:top w:w="80" w:type="dxa"/>
@@ -16350,7 +16422,7 @@
         </w:tc>
         <w:tc>
           <w:tcPr>
-            <w:tcW w:type="dxa" w:w="1944"/>
+            <w:tcW w:type="dxa" w:w="1872"/>
             <w:shd w:fill="FAF6F0"/>
             <w:tcMar>
               <w:top w:w="80" w:type="dxa"/>
@@ -16378,7 +16450,7 @@
         </w:tc>
         <w:tc>
           <w:tcPr>
-            <w:tcW w:type="dxa" w:w="1512"/>
+            <w:tcW w:type="dxa" w:w="1368"/>
             <w:shd w:fill="FAF6F0"/>
             <w:tcMar>
               <w:top w:w="80" w:type="dxa"/>
@@ -16406,7 +16478,7 @@
         </w:tc>
         <w:tc>
           <w:tcPr>
-            <w:tcW w:type="dxa" w:w="936"/>
+            <w:tcW w:type="dxa" w:w="1224"/>
             <w:shd w:fill="FAF6F0"/>
             <w:tcMar>
               <w:top w:w="80" w:type="dxa"/>
@@ -16426,7 +16498,7 @@
                 <w:rFonts w:ascii="Calibri" w:hAnsi="Calibri"/>
                 <w:b w:val="0"/>
                 <w:color w:val="323232"/>
-                <w:sz w:val="17"/>
+                <w:sz w:val="15"/>
               </w:rPr>
               <w:t>Base</w:t>
             </w:r>
@@ -16434,7 +16506,7 @@
         </w:tc>
         <w:tc>
           <w:tcPr>
-            <w:tcW w:type="dxa" w:w="1080"/>
+            <w:tcW w:type="dxa" w:w="1008"/>
             <w:shd w:fill="FAF6F0"/>
             <w:tcMar>
               <w:top w:w="80" w:type="dxa"/>
@@ -16577,7 +16649,7 @@
         </w:tc>
         <w:tc>
           <w:tcPr>
-            <w:tcW w:type="dxa" w:w="1944"/>
+            <w:tcW w:type="dxa" w:w="1872"/>
             <w:shd w:fill="FFFFFF"/>
             <w:tcMar>
               <w:top w:w="80" w:type="dxa"/>
@@ -16605,7 +16677,7 @@
         </w:tc>
         <w:tc>
           <w:tcPr>
-            <w:tcW w:type="dxa" w:w="1512"/>
+            <w:tcW w:type="dxa" w:w="1368"/>
             <w:shd w:fill="FFFFFF"/>
             <w:tcMar>
               <w:top w:w="80" w:type="dxa"/>
@@ -16633,7 +16705,7 @@
         </w:tc>
         <w:tc>
           <w:tcPr>
-            <w:tcW w:type="dxa" w:w="936"/>
+            <w:tcW w:type="dxa" w:w="1224"/>
             <w:shd w:fill="FFFFFF"/>
             <w:tcMar>
               <w:top w:w="80" w:type="dxa"/>
@@ -16653,7 +16725,7 @@
                 <w:rFonts w:ascii="Calibri" w:hAnsi="Calibri"/>
                 <w:b w:val="0"/>
                 <w:color w:val="323232"/>
-                <w:sz w:val="17"/>
+                <w:sz w:val="15"/>
               </w:rPr>
               <w:t>Base</w:t>
             </w:r>
@@ -16661,7 +16733,7 @@
         </w:tc>
         <w:tc>
           <w:tcPr>
-            <w:tcW w:type="dxa" w:w="1080"/>
+            <w:tcW w:type="dxa" w:w="1008"/>
             <w:shd w:fill="FFFFFF"/>
             <w:tcMar>
               <w:top w:w="80" w:type="dxa"/>
@@ -16804,7 +16876,7 @@
         </w:tc>
         <w:tc>
           <w:tcPr>
-            <w:tcW w:type="dxa" w:w="1944"/>
+            <w:tcW w:type="dxa" w:w="1872"/>
             <w:shd w:fill="FAF6F0"/>
             <w:tcMar>
               <w:top w:w="80" w:type="dxa"/>
@@ -16832,7 +16904,7 @@
         </w:tc>
         <w:tc>
           <w:tcPr>
-            <w:tcW w:type="dxa" w:w="1512"/>
+            <w:tcW w:type="dxa" w:w="1368"/>
             <w:shd w:fill="FAF6F0"/>
             <w:tcMar>
               <w:top w:w="80" w:type="dxa"/>
@@ -16860,7 +16932,7 @@
         </w:tc>
         <w:tc>
           <w:tcPr>
-            <w:tcW w:type="dxa" w:w="936"/>
+            <w:tcW w:type="dxa" w:w="1224"/>
             <w:shd w:fill="FAF6F0"/>
             <w:tcMar>
               <w:top w:w="80" w:type="dxa"/>
@@ -16880,7 +16952,7 @@
                 <w:rFonts w:ascii="Calibri" w:hAnsi="Calibri"/>
                 <w:b w:val="0"/>
                 <w:color w:val="323232"/>
-                <w:sz w:val="17"/>
+                <w:sz w:val="15"/>
               </w:rPr>
               <w:t>Base</w:t>
             </w:r>
@@ -16888,7 +16960,7 @@
         </w:tc>
         <w:tc>
           <w:tcPr>
-            <w:tcW w:type="dxa" w:w="1080"/>
+            <w:tcW w:type="dxa" w:w="1008"/>
             <w:shd w:fill="FAF6F0"/>
             <w:tcMar>
               <w:top w:w="80" w:type="dxa"/>
@@ -17031,7 +17103,7 @@
         </w:tc>
         <w:tc>
           <w:tcPr>
-            <w:tcW w:type="dxa" w:w="1944"/>
+            <w:tcW w:type="dxa" w:w="1872"/>
             <w:shd w:fill="FFFFFF"/>
             <w:tcMar>
               <w:top w:w="80" w:type="dxa"/>
@@ -17059,7 +17131,7 @@
         </w:tc>
         <w:tc>
           <w:tcPr>
-            <w:tcW w:type="dxa" w:w="1512"/>
+            <w:tcW w:type="dxa" w:w="1368"/>
             <w:shd w:fill="FFFFFF"/>
             <w:tcMar>
               <w:top w:w="80" w:type="dxa"/>
@@ -17087,7 +17159,7 @@
         </w:tc>
         <w:tc>
           <w:tcPr>
-            <w:tcW w:type="dxa" w:w="936"/>
+            <w:tcW w:type="dxa" w:w="1224"/>
             <w:shd w:fill="FFFFFF"/>
             <w:tcMar>
               <w:top w:w="80" w:type="dxa"/>
@@ -17107,7 +17179,7 @@
                 <w:rFonts w:ascii="Calibri" w:hAnsi="Calibri"/>
                 <w:b/>
                 <w:color w:val="228B22"/>
-                <w:sz w:val="17"/>
+                <w:sz w:val="15"/>
               </w:rPr>
               <w:t>+25 HP</w:t>
             </w:r>
@@ -17115,7 +17187,7 @@
         </w:tc>
         <w:tc>
           <w:tcPr>
-            <w:tcW w:type="dxa" w:w="1080"/>
+            <w:tcW w:type="dxa" w:w="1008"/>
             <w:shd w:fill="FFFFFF"/>
             <w:tcMar>
               <w:top w:w="80" w:type="dxa"/>
@@ -17258,7 +17330,7 @@
         </w:tc>
         <w:tc>
           <w:tcPr>
-            <w:tcW w:type="dxa" w:w="1944"/>
+            <w:tcW w:type="dxa" w:w="1872"/>
             <w:shd w:fill="FAF6F0"/>
             <w:tcMar>
               <w:top w:w="80" w:type="dxa"/>
@@ -17286,7 +17358,7 @@
         </w:tc>
         <w:tc>
           <w:tcPr>
-            <w:tcW w:type="dxa" w:w="1512"/>
+            <w:tcW w:type="dxa" w:w="1368"/>
             <w:shd w:fill="FAF6F0"/>
             <w:tcMar>
               <w:top w:w="80" w:type="dxa"/>
@@ -17314,7 +17386,7 @@
         </w:tc>
         <w:tc>
           <w:tcPr>
-            <w:tcW w:type="dxa" w:w="936"/>
+            <w:tcW w:type="dxa" w:w="1224"/>
             <w:shd w:fill="FAF6F0"/>
             <w:tcMar>
               <w:top w:w="80" w:type="dxa"/>
@@ -17334,7 +17406,7 @@
                 <w:rFonts w:ascii="Calibri" w:hAnsi="Calibri"/>
                 <w:b/>
                 <w:color w:val="228B22"/>
-                <w:sz w:val="17"/>
+                <w:sz w:val="15"/>
               </w:rPr>
               <w:t>+35 HP</w:t>
             </w:r>
@@ -17342,7 +17414,7 @@
         </w:tc>
         <w:tc>
           <w:tcPr>
-            <w:tcW w:type="dxa" w:w="1080"/>
+            <w:tcW w:type="dxa" w:w="1008"/>
             <w:shd w:fill="FAF6F0"/>
             <w:tcMar>
               <w:top w:w="80" w:type="dxa"/>
@@ -17421,7 +17493,7 @@
                 <w:color w:val="505050"/>
                 <w:sz w:val="16"/>
               </w:rPr>
-              <w:t>Decadent purple yam jam simmered slowly with butter and milk.</w:t>
+              <w:t>Decadent purple yam jam simmered slowly with butter and milk until thick and glossy.</w:t>
             </w:r>
           </w:p>
         </w:tc>
@@ -17485,7 +17557,7 @@
         </w:tc>
         <w:tc>
           <w:tcPr>
-            <w:tcW w:type="dxa" w:w="1944"/>
+            <w:tcW w:type="dxa" w:w="1872"/>
             <w:shd w:fill="FFFFFF"/>
             <w:tcMar>
               <w:top w:w="80" w:type="dxa"/>
@@ -17513,7 +17585,7 @@
         </w:tc>
         <w:tc>
           <w:tcPr>
-            <w:tcW w:type="dxa" w:w="1512"/>
+            <w:tcW w:type="dxa" w:w="1368"/>
             <w:shd w:fill="FFFFFF"/>
             <w:tcMar>
               <w:top w:w="80" w:type="dxa"/>
@@ -17541,7 +17613,7 @@
         </w:tc>
         <w:tc>
           <w:tcPr>
-            <w:tcW w:type="dxa" w:w="936"/>
+            <w:tcW w:type="dxa" w:w="1224"/>
             <w:shd w:fill="FFFFFF"/>
             <w:tcMar>
               <w:top w:w="80" w:type="dxa"/>
@@ -17561,7 +17633,7 @@
                 <w:rFonts w:ascii="Calibri" w:hAnsi="Calibri"/>
                 <w:b w:val="0"/>
                 <w:color w:val="323232"/>
-                <w:sz w:val="17"/>
+                <w:sz w:val="15"/>
               </w:rPr>
               <w:t>Base</w:t>
             </w:r>
@@ -17569,7 +17641,7 @@
         </w:tc>
         <w:tc>
           <w:tcPr>
-            <w:tcW w:type="dxa" w:w="1080"/>
+            <w:tcW w:type="dxa" w:w="1008"/>
             <w:shd w:fill="FFFFFF"/>
             <w:tcMar>
               <w:top w:w="80" w:type="dxa"/>
@@ -17712,7 +17784,7 @@
         </w:tc>
         <w:tc>
           <w:tcPr>
-            <w:tcW w:type="dxa" w:w="1944"/>
+            <w:tcW w:type="dxa" w:w="1872"/>
             <w:shd w:fill="FAF6F0"/>
             <w:tcMar>
               <w:top w:w="80" w:type="dxa"/>
@@ -17740,7 +17812,7 @@
         </w:tc>
         <w:tc>
           <w:tcPr>
-            <w:tcW w:type="dxa" w:w="1512"/>
+            <w:tcW w:type="dxa" w:w="1368"/>
             <w:shd w:fill="FAF6F0"/>
             <w:tcMar>
               <w:top w:w="80" w:type="dxa"/>
@@ -17768,7 +17840,7 @@
         </w:tc>
         <w:tc>
           <w:tcPr>
-            <w:tcW w:type="dxa" w:w="936"/>
+            <w:tcW w:type="dxa" w:w="1224"/>
             <w:shd w:fill="FAF6F0"/>
             <w:tcMar>
               <w:top w:w="80" w:type="dxa"/>
@@ -17788,7 +17860,7 @@
                 <w:rFonts w:ascii="Calibri" w:hAnsi="Calibri"/>
                 <w:b/>
                 <w:color w:val="228B22"/>
-                <w:sz w:val="17"/>
+                <w:sz w:val="15"/>
               </w:rPr>
               <w:t>+22 HP</w:t>
             </w:r>
@@ -17796,7 +17868,7 @@
         </w:tc>
         <w:tc>
           <w:tcPr>
-            <w:tcW w:type="dxa" w:w="1080"/>
+            <w:tcW w:type="dxa" w:w="1008"/>
             <w:shd w:fill="FAF6F0"/>
             <w:tcMar>
               <w:top w:w="80" w:type="dxa"/>
@@ -17939,7 +18011,7 @@
         </w:tc>
         <w:tc>
           <w:tcPr>
-            <w:tcW w:type="dxa" w:w="1944"/>
+            <w:tcW w:type="dxa" w:w="1872"/>
             <w:shd w:fill="FFFFFF"/>
             <w:tcMar>
               <w:top w:w="80" w:type="dxa"/>
@@ -17967,7 +18039,7 @@
         </w:tc>
         <w:tc>
           <w:tcPr>
-            <w:tcW w:type="dxa" w:w="1512"/>
+            <w:tcW w:type="dxa" w:w="1368"/>
             <w:shd w:fill="FFFFFF"/>
             <w:tcMar>
               <w:top w:w="80" w:type="dxa"/>
@@ -17995,7 +18067,7 @@
         </w:tc>
         <w:tc>
           <w:tcPr>
-            <w:tcW w:type="dxa" w:w="936"/>
+            <w:tcW w:type="dxa" w:w="1224"/>
             <w:shd w:fill="FFFFFF"/>
             <w:tcMar>
               <w:top w:w="80" w:type="dxa"/>
@@ -18015,7 +18087,7 @@
                 <w:rFonts w:ascii="Calibri" w:hAnsi="Calibri"/>
                 <w:b/>
                 <w:color w:val="228B22"/>
-                <w:sz w:val="17"/>
+                <w:sz w:val="15"/>
               </w:rPr>
               <w:t>+20 HP</w:t>
             </w:r>
@@ -18023,7 +18095,7 @@
         </w:tc>
         <w:tc>
           <w:tcPr>
-            <w:tcW w:type="dxa" w:w="1080"/>
+            <w:tcW w:type="dxa" w:w="1008"/>
             <w:shd w:fill="FFFFFF"/>
             <w:tcMar>
               <w:top w:w="80" w:type="dxa"/>
@@ -18073,7 +18145,7 @@
                 <w:color w:val="323232"/>
                 <w:sz w:val="17"/>
               </w:rPr>
-              <w:t>2x Wood, 1x Spud Sap</w:t>
+              <w:t>2x Oak Wood, 1x Spud Sap</w:t>
             </w:r>
           </w:p>
         </w:tc>
@@ -18166,7 +18238,7 @@
         </w:tc>
         <w:tc>
           <w:tcPr>
-            <w:tcW w:type="dxa" w:w="1944"/>
+            <w:tcW w:type="dxa" w:w="1872"/>
             <w:shd w:fill="FAF6F0"/>
             <w:tcMar>
               <w:top w:w="80" w:type="dxa"/>
@@ -18194,7 +18266,7 @@
         </w:tc>
         <w:tc>
           <w:tcPr>
-            <w:tcW w:type="dxa" w:w="1512"/>
+            <w:tcW w:type="dxa" w:w="1368"/>
             <w:shd w:fill="FAF6F0"/>
             <w:tcMar>
               <w:top w:w="80" w:type="dxa"/>
@@ -18222,7 +18294,7 @@
         </w:tc>
         <w:tc>
           <w:tcPr>
-            <w:tcW w:type="dxa" w:w="936"/>
+            <w:tcW w:type="dxa" w:w="1224"/>
             <w:shd w:fill="FAF6F0"/>
             <w:tcMar>
               <w:top w:w="80" w:type="dxa"/>
@@ -18242,7 +18314,7 @@
                 <w:rFonts w:ascii="Calibri" w:hAnsi="Calibri"/>
                 <w:b w:val="0"/>
                 <w:color w:val="323232"/>
-                <w:sz w:val="17"/>
+                <w:sz w:val="15"/>
               </w:rPr>
               <w:t>Base</w:t>
             </w:r>
@@ -18250,7 +18322,7 @@
         </w:tc>
         <w:tc>
           <w:tcPr>
-            <w:tcW w:type="dxa" w:w="1080"/>
+            <w:tcW w:type="dxa" w:w="1008"/>
             <w:shd w:fill="FAF6F0"/>
             <w:tcMar>
               <w:top w:w="80" w:type="dxa"/>
@@ -18393,7 +18465,7 @@
         </w:tc>
         <w:tc>
           <w:tcPr>
-            <w:tcW w:type="dxa" w:w="1944"/>
+            <w:tcW w:type="dxa" w:w="1872"/>
             <w:shd w:fill="FFFFFF"/>
             <w:tcMar>
               <w:top w:w="80" w:type="dxa"/>
@@ -18421,7 +18493,7 @@
         </w:tc>
         <w:tc>
           <w:tcPr>
-            <w:tcW w:type="dxa" w:w="1512"/>
+            <w:tcW w:type="dxa" w:w="1368"/>
             <w:shd w:fill="FFFFFF"/>
             <w:tcMar>
               <w:top w:w="80" w:type="dxa"/>
@@ -18449,7 +18521,7 @@
         </w:tc>
         <w:tc>
           <w:tcPr>
-            <w:tcW w:type="dxa" w:w="936"/>
+            <w:tcW w:type="dxa" w:w="1224"/>
             <w:shd w:fill="FFFFFF"/>
             <w:tcMar>
               <w:top w:w="80" w:type="dxa"/>
@@ -18469,7 +18541,7 @@
                 <w:rFonts w:ascii="Calibri" w:hAnsi="Calibri"/>
                 <w:b w:val="0"/>
                 <w:color w:val="323232"/>
-                <w:sz w:val="17"/>
+                <w:sz w:val="15"/>
               </w:rPr>
               <w:t>Base</w:t>
             </w:r>
@@ -18477,7 +18549,7 @@
         </w:tc>
         <w:tc>
           <w:tcPr>
-            <w:tcW w:type="dxa" w:w="1080"/>
+            <w:tcW w:type="dxa" w:w="1008"/>
             <w:shd w:fill="FFFFFF"/>
             <w:tcMar>
               <w:top w:w="80" w:type="dxa"/>
@@ -18620,7 +18692,7 @@
         </w:tc>
         <w:tc>
           <w:tcPr>
-            <w:tcW w:type="dxa" w:w="1944"/>
+            <w:tcW w:type="dxa" w:w="1872"/>
             <w:shd w:fill="FAF6F0"/>
             <w:tcMar>
               <w:top w:w="80" w:type="dxa"/>
@@ -18648,7 +18720,7 @@
         </w:tc>
         <w:tc>
           <w:tcPr>
-            <w:tcW w:type="dxa" w:w="1512"/>
+            <w:tcW w:type="dxa" w:w="1368"/>
             <w:shd w:fill="FAF6F0"/>
             <w:tcMar>
               <w:top w:w="80" w:type="dxa"/>
@@ -18676,7 +18748,7 @@
         </w:tc>
         <w:tc>
           <w:tcPr>
-            <w:tcW w:type="dxa" w:w="936"/>
+            <w:tcW w:type="dxa" w:w="1224"/>
             <w:shd w:fill="FAF6F0"/>
             <w:tcMar>
               <w:top w:w="80" w:type="dxa"/>
@@ -18696,7 +18768,7 @@
                 <w:rFonts w:ascii="Calibri" w:hAnsi="Calibri"/>
                 <w:b w:val="0"/>
                 <w:color w:val="323232"/>
-                <w:sz w:val="17"/>
+                <w:sz w:val="15"/>
               </w:rPr>
               <w:t>Base</w:t>
             </w:r>
@@ -18704,7 +18776,7 @@
         </w:tc>
         <w:tc>
           <w:tcPr>
-            <w:tcW w:type="dxa" w:w="1080"/>
+            <w:tcW w:type="dxa" w:w="1008"/>
             <w:shd w:fill="FAF6F0"/>
             <w:tcMar>
               <w:top w:w="80" w:type="dxa"/>
@@ -18847,7 +18919,7 @@
         </w:tc>
         <w:tc>
           <w:tcPr>
-            <w:tcW w:type="dxa" w:w="1944"/>
+            <w:tcW w:type="dxa" w:w="1872"/>
             <w:shd w:fill="FFFFFF"/>
             <w:tcMar>
               <w:top w:w="80" w:type="dxa"/>
@@ -18869,13 +18941,13 @@
                 <w:color w:val="282828"/>
                 <w:sz w:val="17"/>
               </w:rPr>
-              <w:t>Wood</w:t>
-            </w:r>
-          </w:p>
-        </w:tc>
-        <w:tc>
-          <w:tcPr>
-            <w:tcW w:type="dxa" w:w="1512"/>
+              <w:t>Oak Wood</w:t>
+            </w:r>
+          </w:p>
+        </w:tc>
+        <w:tc>
+          <w:tcPr>
+            <w:tcW w:type="dxa" w:w="1368"/>
             <w:shd w:fill="FFFFFF"/>
             <w:tcMar>
               <w:top w:w="80" w:type="dxa"/>
@@ -18903,7 +18975,7 @@
         </w:tc>
         <w:tc>
           <w:tcPr>
-            <w:tcW w:type="dxa" w:w="936"/>
+            <w:tcW w:type="dxa" w:w="1224"/>
             <w:shd w:fill="FFFFFF"/>
             <w:tcMar>
               <w:top w:w="80" w:type="dxa"/>
@@ -18923,7 +18995,7 @@
                 <w:rFonts w:ascii="Calibri" w:hAnsi="Calibri"/>
                 <w:b w:val="0"/>
                 <w:color w:val="323232"/>
-                <w:sz w:val="17"/>
+                <w:sz w:val="15"/>
               </w:rPr>
               <w:t>Base</w:t>
             </w:r>
@@ -18931,7 +19003,7 @@
         </w:tc>
         <w:tc>
           <w:tcPr>
-            <w:tcW w:type="dxa" w:w="1080"/>
+            <w:tcW w:type="dxa" w:w="1008"/>
             <w:shd w:fill="FFFFFF"/>
             <w:tcMar>
               <w:top w:w="80" w:type="dxa"/>
@@ -19010,7 +19082,7 @@
                 <w:color w:val="505050"/>
                 <w:sz w:val="16"/>
               </w:rPr>
-              <w:t>Lumber harvested from surface trees. Right-click to place or craft into workbench.</w:t>
+              <w:t>Classic timber harvested from oak trees. Right-click to place or craft into workbench.</w:t>
             </w:r>
           </w:p>
         </w:tc>
@@ -19074,7 +19146,7 @@
         </w:tc>
         <w:tc>
           <w:tcPr>
-            <w:tcW w:type="dxa" w:w="1944"/>
+            <w:tcW w:type="dxa" w:w="1872"/>
             <w:shd w:fill="FAF6F0"/>
             <w:tcMar>
               <w:top w:w="80" w:type="dxa"/>
@@ -19102,7 +19174,7 @@
         </w:tc>
         <w:tc>
           <w:tcPr>
-            <w:tcW w:type="dxa" w:w="1512"/>
+            <w:tcW w:type="dxa" w:w="1368"/>
             <w:shd w:fill="FAF6F0"/>
             <w:tcMar>
               <w:top w:w="80" w:type="dxa"/>
@@ -19130,7 +19202,7 @@
         </w:tc>
         <w:tc>
           <w:tcPr>
-            <w:tcW w:type="dxa" w:w="936"/>
+            <w:tcW w:type="dxa" w:w="1224"/>
             <w:shd w:fill="FAF6F0"/>
             <w:tcMar>
               <w:top w:w="80" w:type="dxa"/>
@@ -19150,7 +19222,7 @@
                 <w:rFonts w:ascii="Calibri" w:hAnsi="Calibri"/>
                 <w:b w:val="0"/>
                 <w:color w:val="323232"/>
-                <w:sz w:val="17"/>
+                <w:sz w:val="15"/>
               </w:rPr>
               <w:t>Base</w:t>
             </w:r>
@@ -19158,7 +19230,7 @@
         </w:tc>
         <w:tc>
           <w:tcPr>
-            <w:tcW w:type="dxa" w:w="1080"/>
+            <w:tcW w:type="dxa" w:w="1008"/>
             <w:shd w:fill="FAF6F0"/>
             <w:tcMar>
               <w:top w:w="80" w:type="dxa"/>
@@ -19301,7 +19373,7 @@
         </w:tc>
         <w:tc>
           <w:tcPr>
-            <w:tcW w:type="dxa" w:w="1944"/>
+            <w:tcW w:type="dxa" w:w="1872"/>
             <w:shd w:fill="FFFFFF"/>
             <w:tcMar>
               <w:top w:w="80" w:type="dxa"/>
@@ -19329,7 +19401,7 @@
         </w:tc>
         <w:tc>
           <w:tcPr>
-            <w:tcW w:type="dxa" w:w="1512"/>
+            <w:tcW w:type="dxa" w:w="1368"/>
             <w:shd w:fill="FFFFFF"/>
             <w:tcMar>
               <w:top w:w="80" w:type="dxa"/>
@@ -19357,7 +19429,7 @@
         </w:tc>
         <w:tc>
           <w:tcPr>
-            <w:tcW w:type="dxa" w:w="936"/>
+            <w:tcW w:type="dxa" w:w="1224"/>
             <w:shd w:fill="FFFFFF"/>
             <w:tcMar>
               <w:top w:w="80" w:type="dxa"/>
@@ -19377,7 +19449,7 @@
                 <w:rFonts w:ascii="Calibri" w:hAnsi="Calibri"/>
                 <w:b w:val="0"/>
                 <w:color w:val="323232"/>
-                <w:sz w:val="17"/>
+                <w:sz w:val="15"/>
               </w:rPr>
               <w:t>Base</w:t>
             </w:r>
@@ -19385,7 +19457,7 @@
         </w:tc>
         <w:tc>
           <w:tcPr>
-            <w:tcW w:type="dxa" w:w="1080"/>
+            <w:tcW w:type="dxa" w:w="1008"/>
             <w:shd w:fill="FFFFFF"/>
             <w:tcMar>
               <w:top w:w="80" w:type="dxa"/>

</xml_diff>

<commit_message>
Scrub weapon defense, fix UI overlaps and bounds, purify culinary lore, and rebuild cookbook
</commit_message>
<xml_diff>
--- a/Potaria_Cookbook.docx
+++ b/Potaria_Cookbook.docx
@@ -331,7 +331,7 @@
                 <w:color w:val="FFFFFF"/>
                 <w:sz w:val="19"/>
               </w:rPr>
-              <w:t>Lore Notes</w:t>
+              <w:t>Culinary Notes</w:t>
             </w:r>
           </w:p>
         </w:tc>
@@ -4693,7 +4693,7 @@
                 <w:color w:val="FFFFFF"/>
                 <w:sz w:val="19"/>
               </w:rPr>
-              <w:t>Lore Notes</w:t>
+              <w:t>Culinary Notes</w:t>
             </w:r>
           </w:p>
         </w:tc>
@@ -7223,7 +7223,7 @@
                 <w:color w:val="FFFFFF"/>
                 <w:sz w:val="19"/>
               </w:rPr>
-              <w:t>Lore Notes</w:t>
+              <w:t>Culinary Notes</w:t>
             </w:r>
           </w:p>
         </w:tc>
@@ -9522,7 +9522,7 @@
                 <w:color w:val="FFFFFF"/>
                 <w:sz w:val="19"/>
               </w:rPr>
-              <w:t>Lore Notes</w:t>
+              <w:t>Culinary Notes</w:t>
             </w:r>
           </w:p>
         </w:tc>
@@ -12032,7 +12032,7 @@
                 <w:color w:val="FFFFFF"/>
                 <w:sz w:val="19"/>
               </w:rPr>
-              <w:t>Lore Notes</w:t>
+              <w:t>Culinary Notes</w:t>
             </w:r>
           </w:p>
         </w:tc>
@@ -13861,7 +13861,7 @@
                 <w:color w:val="FFFFFF"/>
                 <w:sz w:val="19"/>
               </w:rPr>
-              <w:t>Lore Notes</w:t>
+              <w:t>Culinary Notes</w:t>
             </w:r>
           </w:p>
         </w:tc>

</xml_diff>

<commit_message>
feat(ui): add side-by-side equipment tooltips, fix death fade HUD corruption, update concise food lore, and rebuild cookbooks
</commit_message>
<xml_diff>
--- a/Potaria_Cookbook.docx
+++ b/Potaria_Cookbook.docx
@@ -560,7 +560,7 @@
                 <w:color w:val="505050"/>
                 <w:sz w:val="16"/>
               </w:rPr>
-              <w:t>Native chicken cuts slowly braised in cane vinegar, dark soy sauce, crushed garlic, whole black peppercorns, and bay leaves until savory and tender.</w:t>
+              <w:t>Chicken stewed in vinegar, soy sauce, garlic, black peppercorns, and bay leaves.</w:t>
             </w:r>
           </w:p>
         </w:tc>
@@ -789,7 +789,7 @@
                 <w:color w:val="505050"/>
                 <w:sz w:val="16"/>
               </w:rPr>
-              <w:t>Succulent pork belly braised gently in aged sugarcane vinegar and aromatic garlic, producing a rich, unctuous sauce that intensifies overnight.</w:t>
+              <w:t>Pork belly braised in vinegar, soy sauce, garlic, and black peppercorns.</w:t>
             </w:r>
           </w:p>
         </w:tc>
@@ -1018,7 +1018,7 @@
                 <w:color w:val="505050"/>
                 <w:sz w:val="16"/>
               </w:rPr>
-              <w:t>Tender pork ribs simmered in an invigorating crushed green tamarind broth with crisp water spinach, radish, and finger peppers for a sour, cleansing finish.</w:t>
+              <w:t>Sour tamarind soup with pork ribs, kangkong, radish, and green chili.</w:t>
             </w:r>
           </w:p>
         </w:tc>
@@ -1247,7 +1247,7 @@
                 <w:color w:val="505050"/>
                 <w:sz w:val="16"/>
               </w:rPr>
-              <w:t>Rich, velvety peanut and toasted rice stew colored with annatto oil, loaded with tender braised beef shank, banana blossom, and long beans.</w:t>
+              <w:t>Peanut and toasted rice stew with beef shank, eggplant, and string beans.</w:t>
             </w:r>
           </w:p>
         </w:tc>
@@ -1476,7 +1476,7 @@
                 <w:color w:val="505050"/>
                 <w:sz w:val="16"/>
               </w:rPr>
-              <w:t>Slow-simmered beef shank and bone marrow consommé enriched with sweet native corn and cabbage, releasing nourishing melted gelatin and rich aromatics.</w:t>
+              <w:t>Beef shank and bone marrow soup with sweet corn and cabbage.</w:t>
             </w:r>
           </w:p>
         </w:tc>
@@ -1705,7 +1705,7 @@
                 <w:color w:val="505050"/>
                 <w:sz w:val="16"/>
               </w:rPr>
-              <w:t>Fragrant clear chicken soup infused with young crushed ginger root, lemongrass, and sweet green papaya that imparts a gentle, invigorating warmth.</w:t>
+              <w:t>Chicken ginger broth soup with green papaya and chili leaves.</w:t>
             </w:r>
           </w:p>
         </w:tc>
@@ -1934,7 +1934,7 @@
                 <w:color w:val="505050"/>
                 <w:sz w:val="16"/>
               </w:rPr>
-              <w:t>Prime seasoned pork belly simmered until tender, then deep-fried until the rind blisters into an airy, shattering crisp encasing succulent meat.</w:t>
+              <w:t>Deep-fried pork belly boiled tender then fried until crispy.</w:t>
             </w:r>
           </w:p>
         </w:tc>
@@ -2163,7 +2163,7 @@
                 <w:color w:val="505050"/>
                 <w:sz w:val="16"/>
               </w:rPr>
-              <w:t>Thin rice vermicelli stir-fried in a searing wok with julienned native vegetables, tender shredded poultry, and a spritz of tart calamansi juice.</w:t>
+              <w:t>Stir-fried rice noodles with chicken, vegetables, and calamansi.</w:t>
             </w:r>
           </w:p>
         </w:tc>
@@ -2392,7 +2392,7 @@
                 <w:color w:val="505050"/>
                 <w:sz w:val="16"/>
               </w:rPr>
-              <w:t>Thick, comforting glutinous rice porridge infused with crushed ginger and aromatic toasted garlic bits, topped with a soft-boiled farm egg.</w:t>
+              <w:t>Warm rice porridge cooked with chicken, ginger, toasted garlic, and a boiled egg.</w:t>
             </w:r>
           </w:p>
         </w:tc>
@@ -2621,7 +2621,7 @@
                 <w:color w:val="505050"/>
                 <w:sz w:val="16"/>
               </w:rPr>
-              <w:t>Layered tropical parfait of shaved mountain ice, purple ube halaya, sweet preserves, and silky leche flan crowned with evaporated carabao cream.</w:t>
+              <w:t>Shaved ice dessert layered with ube halaya, sweet preserves, and evaporated milk.</w:t>
             </w:r>
           </w:p>
         </w:tc>
@@ -2850,7 +2850,7 @@
                 <w:color w:val="505050"/>
                 <w:sz w:val="16"/>
               </w:rPr>
-              <w:t>Mountain goat meat stewed until fork-tender in spiced tomato paste, rich liver spread, sweet bell peppers, and chili pods for deep spicy complexity.</w:t>
+              <w:t>Spicy goat meat stew in rich tomato sauce, liver spread, and bell peppers.</w:t>
             </w:r>
           </w:p>
         </w:tc>
@@ -3079,7 +3079,7 @@
                 <w:color w:val="505050"/>
                 <w:sz w:val="16"/>
               </w:rPr>
-              <w:t>Steamed incubated duck egg sipped piping hot from the shell with a dash of spiced cane vinegar and crushed sea salt crystals.</w:t>
+              <w:t>Steamed fertilized duck egg seasoned with salt and spiced vinegar.</w:t>
             </w:r>
           </w:p>
         </w:tc>
@@ -3308,7 +3308,7 @@
                 <w:color w:val="505050"/>
                 <w:sz w:val="16"/>
               </w:rPr>
-              <w:t>Traditional cured duck egg encased in clay and brine, yielding a rich, buttery crimson yolk served alongside diced sun-ripened tomatoes.</w:t>
+              <w:t>Brined salted duck egg served with sliced fresh tomatoes.</w:t>
             </w:r>
           </w:p>
         </w:tc>
@@ -3537,7 +3537,7 @@
                 <w:color w:val="505050"/>
                 <w:sz w:val="16"/>
               </w:rPr>
-              <w:t>Day-old steamed rice tossed in a hot pan with crackling golden garlic slivers and a touch of sea salt, radiating a fragrant toasted bouquet.</w:t>
+              <w:t>Fried rice sauteed with toasted garlic and sea salt.</w:t>
             </w:r>
           </w:p>
         </w:tc>
@@ -3766,7 +3766,7 @@
                 <w:color w:val="505050"/>
                 <w:sz w:val="16"/>
               </w:rPr>
-              <w:t>Butterflied milkfish steeped in native garlic, crushed black pepper, and cane vinegar, then sun-dried and pan-fried until golden and crunchy.</w:t>
+              <w:t>Marinated butterflied milkfish in vinegar and garlic, pan-fried until crisp.</w:t>
             </w:r>
           </w:p>
         </w:tc>
@@ -3995,7 +3995,7 @@
                 <w:color w:val="505050"/>
                 <w:sz w:val="16"/>
               </w:rPr>
-              <w:t>Plump milkfish belly simmered gently with tender swamp cabbage and sweet long peppers in a tart crushed tamarind broth.</w:t>
+              <w:t>Sour tamarind soup with milkfish belly, kangkong, and long green peppers.</w:t>
             </w:r>
           </w:p>
         </w:tc>
@@ -4224,7 +4224,7 @@
                 <w:color w:val="505050"/>
                 <w:sz w:val="16"/>
               </w:rPr>
-              <w:t>Fresh freshwater tilapia gently braised in thick pressed coconut cream with shredded ginger, garlic, and fresh leafy greens.</w:t>
+              <w:t>Tilapia simmered in rich coconut milk with ginger and leafy greens.</w:t>
             </w:r>
           </w:p>
         </w:tc>
@@ -4453,7 +4453,7 @@
                 <w:color w:val="505050"/>
                 <w:sz w:val="16"/>
               </w:rPr>
-              <w:t>Pristine raw Spanish mackerel cubes cured cold in fermented coconut sap vinegar, infused with fresh calamansi, slivered ginger, and fiery chili.</w:t>
+              <w:t>Raw Spanish mackerel cured in vinegar and calamansi with ginger, onions, and chili.</w:t>
             </w:r>
           </w:p>
         </w:tc>
@@ -4922,7 +4922,7 @@
                 <w:color w:val="505050"/>
                 <w:sz w:val="16"/>
               </w:rPr>
-              <w:t>Whole milkfish stuffed with fresh diced tomatoes and sweet red onions, wrapped in banana leaves and slow-grilled over coconut husk embers.</w:t>
+              <w:t>Grilled milkfish stuffed with tomatoes, onions, and wrapped in banana leaves.</w:t>
             </w:r>
           </w:p>
         </w:tc>
@@ -5151,7 +5151,7 @@
                 <w:color w:val="505050"/>
                 <w:sz w:val="16"/>
               </w:rPr>
-              <w:t>Scored whole freshwater tilapia seasoned with coarse sea salt and flash-fried in boiling oil until the skin is blistered and crisp.</w:t>
+              <w:t>Whole tilapia seasoned with sea salt and pan-fried until crisp.</w:t>
             </w:r>
           </w:p>
         </w:tc>
@@ -5380,7 +5380,7 @@
                 <w:color w:val="505050"/>
                 <w:sz w:val="16"/>
               </w:rPr>
-              <w:t>Deep-fried round scad fried to a dark golden crunch, paired with a spiced vinegar dip to highlight its rich oily meat.</w:t>
+              <w:t>Pan-fried round scad served with a spiced vinegar dip.</w:t>
             </w:r>
           </w:p>
         </w:tc>
@@ -5609,7 +5609,7 @@
                 <w:color w:val="505050"/>
                 <w:sz w:val="16"/>
               </w:rPr>
-              <w:t>Crimson red snapper simmered with native string beans and tomatoes in an authentic sour tamarind and tomato broth.</w:t>
+              <w:t>Red snapper simmered with tomatoes and string beans in sour tamarind broth.</w:t>
             </w:r>
           </w:p>
         </w:tc>
@@ -5838,7 +5838,7 @@
                 <w:color w:val="505050"/>
                 <w:sz w:val="16"/>
               </w:rPr>
-              <w:t>Thick Spanish mackerel steaks seasoned with sea salt, basted with calamansi juice, and flame-grilled over glowing coals.</w:t>
+              <w:t>Grilled Spanish mackerel steaks basted with calamansi and seasoned with salt.</w:t>
             </w:r>
           </w:p>
         </w:tc>
@@ -6067,7 +6067,7 @@
                 <w:color w:val="505050"/>
                 <w:sz w:val="16"/>
               </w:rPr>
-              <w:t>Dense yellowfin tuna steaks brushed with sweet soy and calamansi marinade, seared rapidly over white-hot embers.</w:t>
+              <w:t>Seared tuna steaks marinated in soy sauce, calamansi, and black pepper.</w:t>
             </w:r>
           </w:p>
         </w:tc>
@@ -6296,7 +6296,7 @@
                 <w:color w:val="505050"/>
                 <w:sz w:val="16"/>
               </w:rPr>
-              <w:t>Whole spotted coral grouper delicately steamed with julienned ginger, spring scallions, sesame oil, and light savory soy broth.</w:t>
+              <w:t>Steamed grouper topped with ginger, scallions, and light soy sauce.</w:t>
             </w:r>
           </w:p>
         </w:tc>
@@ -6525,7 +6525,7 @@
                 <w:color w:val="505050"/>
                 <w:sz w:val="16"/>
               </w:rPr>
-              <w:t>Freshwater catfish chunks simmered gently in coconut vinegar, garlic cloves, bay leaves, and cracked black pepper until buttery and glazed.</w:t>
+              <w:t>Catfish braised in vinegar, soy sauce, garlic, and bay leaves.</w:t>
             </w:r>
           </w:p>
         </w:tc>
@@ -6754,7 +6754,7 @@
                 <w:color w:val="505050"/>
                 <w:sz w:val="16"/>
               </w:rPr>
-              <w:t>Sun-dried silver anchovies pan-fried with caramelized brown sugar and toasted chili flakes for an addictive sweet-spicy crunch.</w:t>
+              <w:t>Crispy pan-fried dried anchovies glazed with brown sugar and chili flakes.</w:t>
             </w:r>
           </w:p>
         </w:tc>
@@ -6983,7 +6983,7 @@
                 <w:color w:val="505050"/>
                 <w:sz w:val="16"/>
               </w:rPr>
-              <w:t>Vibrant yellowtail fusilier dredged lightly in spiced rice flour and pan-fried until its red-gold skin turns crackling crisp.</w:t>
+              <w:t>Pan-fried yellowtail fusilier dredged in flour until crispy.</w:t>
             </w:r>
           </w:p>
         </w:tc>
@@ -7452,7 +7452,7 @@
                 <w:color w:val="505050"/>
                 <w:sz w:val="16"/>
               </w:rPr>
-              <w:t>Freshly harvested tubers boiled and mashed with churned carabao butter and sweet cream until velvety smooth.</w:t>
+              <w:t>Boiled potatoes mashed with carabao butter, cream, and salt.</w:t>
             </w:r>
           </w:p>
         </w:tc>
@@ -7681,7 +7681,7 @@
                 <w:color w:val="505050"/>
                 <w:sz w:val="16"/>
               </w:rPr>
-              <w:t>Crisp potato batons double-fried to a golden crunch and dusted with sea salt and shimmering edible gold flakes.</w:t>
+              <w:t>French-fried potato strips seasoned with sea salt and gold flakes.</w:t>
             </w:r>
           </w:p>
         </w:tc>
@@ -7910,7 +7910,7 @@
                 <w:color w:val="505050"/>
                 <w:sz w:val="16"/>
               </w:rPr>
-              <w:t>Rustic cauldron stew of cubed russet potatoes, aromatic cavern mushrooms, and wild root vegetables simmered in herbal broth.</w:t>
+              <w:t>Thick stew cooked with diced potatoes, mushrooms, and root vegetables.</w:t>
             </w:r>
           </w:p>
         </w:tc>
@@ -8139,7 +8139,7 @@
                 <w:color w:val="505050"/>
                 <w:sz w:val="16"/>
               </w:rPr>
-              <w:t>Heirloom golden tuber roasted slowly with clover nectar and wild honeycomb until glazed with a sweet, sticky crust.</w:t>
+              <w:t>Roasted golden potato glazed with honey and nectar.</w:t>
             </w:r>
           </w:p>
         </w:tc>
@@ -8368,7 +8368,7 @@
                 <w:color w:val="505050"/>
                 <w:sz w:val="16"/>
               </w:rPr>
-              <w:t>Thin slices of spiced tuber cured over fragrant hickory smoke and seasoned with coarse sea salt for an enduring trail provision.</w:t>
+              <w:t>Thin slices of potato smoked with wood and seasoned with salt.</w:t>
             </w:r>
           </w:p>
         </w:tc>
@@ -8597,7 +8597,7 @@
                 <w:color w:val="505050"/>
                 <w:sz w:val="16"/>
               </w:rPr>
-              <w:t>Supreme royal potato roasted in a hearth oven, drizzled with gold-infused truffle butter, and dusted with fragrant herbal salt.</w:t>
+              <w:t>Baked potato seasoned with butter, gold flakes, and herbs.</w:t>
             </w:r>
           </w:p>
         </w:tc>
@@ -8826,7 +8826,7 @@
                 <w:color w:val="505050"/>
                 <w:sz w:val="16"/>
               </w:rPr>
-              <w:t>Crusty golden bread baked with finely milled potato flour and yeast, yielding a dense, steaming loaf that retains hearth warmth.</w:t>
+              <w:t>Loaf of crusty bread baked with potato flour.</w:t>
             </w:r>
           </w:p>
         </w:tc>
@@ -9055,7 +9055,7 @@
                 <w:color w:val="505050"/>
                 <w:sz w:val="16"/>
               </w:rPr>
-              <w:t>Flaky butter pastry shell filled with spiced mashed sweet tubers, brown cane sugar, cinnamon bark, and fresh dairy cream.</w:t>
+              <w:t>Pastry pie baked with spiced mashed sweet tubers, sugar, and cream.</w:t>
             </w:r>
           </w:p>
         </w:tc>
@@ -9282,7 +9282,7 @@
                 <w:color w:val="505050"/>
                 <w:sz w:val="16"/>
               </w:rPr>
-              <w:t>Cool botanical poultice blended from crushed tuber pulp, wild mint, and soothing tree sap to draw out inflammation.</w:t>
+              <w:t>Soothing paste made from mashed potato, wild mint, and tree sap.</w:t>
             </w:r>
           </w:p>
         </w:tc>
@@ -17039,7 +17039,7 @@
                 <w:color w:val="505050"/>
                 <w:sz w:val="16"/>
               </w:rPr>
-              <w:t>Fine snowy ice flakes scooped to create the ultimate tropical cooling treat.</w:t>
+              <w:t>Crushed ice flakes for desserts.</w:t>
             </w:r>
           </w:p>
         </w:tc>
@@ -17266,7 +17266,7 @@
                 <w:color w:val="505050"/>
                 <w:sz w:val="16"/>
               </w:rPr>
-              <w:t>Sweet, golden thick milk syrup poured lavishly over shaved ice desserts.</w:t>
+              <w:t>Sweet condensed milk syrup for desserts.</w:t>
             </w:r>
           </w:p>
         </w:tc>
@@ -17493,7 +17493,7 @@
                 <w:color w:val="505050"/>
                 <w:sz w:val="16"/>
               </w:rPr>
-              <w:t>Decadent purple yam jam simmered slowly with butter and milk until thick and glossy.</w:t>
+              <w:t>Purple yam jam cooked with butter and milk until thick.</w:t>
             </w:r>
           </w:p>
         </w:tc>
@@ -17720,7 +17720,7 @@
                 <w:color w:val="505050"/>
                 <w:sz w:val="16"/>
               </w:rPr>
-              <w:t>Delicate sun-dried translucent rice noodles. Symbolizes long life and health.</w:t>
+              <w:t>Thin dried rice noodles for stir-frying.</w:t>
             </w:r>
           </w:p>
         </w:tc>
@@ -17947,7 +17947,7 @@
                 <w:color w:val="505050"/>
                 <w:sz w:val="16"/>
               </w:rPr>
-              <w:t>Savory roasted peanut paste that thickens luscious Kare-Kare sauce.</w:t>
+              <w:t>Roasted ground peanut paste for cooking and sauces.</w:t>
             </w:r>
           </w:p>
         </w:tc>
@@ -18174,7 +18174,7 @@
                 <w:color w:val="505050"/>
                 <w:sz w:val="16"/>
               </w:rPr>
-              <w:t>Rich, velvety cream pressed from freshly grated mature coconut meat.</w:t>
+              <w:t>Cream pressed from grated mature coconut meat.</w:t>
             </w:r>
           </w:p>
         </w:tc>

</xml_diff>

<commit_message>
refactor(ui): streamline culinary descriptions, enhance equipment comparison deduplication, and harden health HUD contrast
</commit_message>
<xml_diff>
--- a/Potaria_Cookbook.docx
+++ b/Potaria_Cookbook.docx
@@ -123,7 +123,7 @@
         <w:rPr>
           <w:i/>
         </w:rPr>
-        <w:t>Signature traditional dishes featuring rich savory, sour, and aromatic flavor profiles. Highly effective for major health restoration during perilous explorations.</w:t>
+        <w:t>Traditional Filipino dishes that restore health and grant specialized meal buffs.</w:t>
       </w:r>
     </w:p>
     <w:tbl>
@@ -4485,7 +4485,7 @@
         <w:rPr>
           <w:i/>
         </w:rPr>
-        <w:t>Fresh marine and freshwater catches cooked over embers to maximize nutritional and healing value.</w:t>
+        <w:t>Cooked freshwater and marine fish that restore health and provide combat stat buffs.</w:t>
       </w:r>
     </w:p>
     <w:tbl>
@@ -7015,7 +7015,7 @@
         <w:rPr>
           <w:i/>
         </w:rPr>
-        <w:t>Artisanal root-based dishes, energy-dense pastries, and restorative tuber salves crafted from the sacred spuds of Potaria.</w:t>
+        <w:t>Potato dishes, breads, and restorative salves crafted from farm tubers.</w:t>
       </w:r>
     </w:p>
     <w:tbl>
@@ -9314,7 +9314,7 @@
         <w:rPr>
           <w:i/>
         </w:rPr>
-        <w:t>Wild aquatic species caught with fishing rods across estuaries, lakes, coral reefs, and deep ocean waters.</w:t>
+        <w:t>Fresh raw fish caught using fishing rods across freshwater and saltwater biomes.</w:t>
       </w:r>
     </w:p>
     <w:tbl>
@@ -9720,7 +9720,7 @@
                 <w:color w:val="323232"/>
                 <w:sz w:val="17"/>
               </w:rPr>
-              <w:t>Caught with fishing rod in brackish estuaries and calm lagoons.</w:t>
+              <w:t>Caught in brackish estuaries with a fishing rod.</w:t>
             </w:r>
           </w:p>
         </w:tc>
@@ -9749,7 +9749,7 @@
                 <w:color w:val="505050"/>
                 <w:sz w:val="16"/>
               </w:rPr>
-              <w:t>National silvery fish of Potaria, prized for its tender belly. Best cooked before eating.</w:t>
+              <w:t>Fresh raw milkfish. Best cooked before eating.</w:t>
             </w:r>
           </w:p>
         </w:tc>
@@ -9947,7 +9947,7 @@
                 <w:color w:val="323232"/>
                 <w:sz w:val="17"/>
               </w:rPr>
-              <w:t>Caught in freshwater rivers, inland lakes, and ponds.</w:t>
+              <w:t>Caught in freshwater rivers and lakes with a fishing rod.</w:t>
             </w:r>
           </w:p>
         </w:tc>
@@ -9976,7 +9976,7 @@
                 <w:color w:val="505050"/>
                 <w:sz w:val="16"/>
               </w:rPr>
-              <w:t>Freshwater cichlid with hardy scales, thriving in inland streams. Cook over fire.</w:t>
+              <w:t>Fresh raw tilapia. Cook over fire.</w:t>
             </w:r>
           </w:p>
         </w:tc>
@@ -10174,7 +10174,7 @@
                 <w:color w:val="323232"/>
                 <w:sz w:val="17"/>
               </w:rPr>
-              <w:t>Caught in open sea waters and ocean shores.</w:t>
+              <w:t>Caught in coastal ocean waters with a fishing rod.</w:t>
             </w:r>
           </w:p>
         </w:tc>
@@ -10203,7 +10203,7 @@
                 <w:color w:val="505050"/>
                 <w:sz w:val="16"/>
               </w:rPr>
-              <w:t>Round scad, the beloved everyday staple fish with rich flavor.</w:t>
+              <w:t>Fresh raw round scad fish. Best cooked before eating.</w:t>
             </w:r>
           </w:p>
         </w:tc>
@@ -10401,7 +10401,7 @@
                 <w:color w:val="323232"/>
                 <w:sz w:val="17"/>
               </w:rPr>
-              <w:t>Caught around deep offshore coral drop-offs.</w:t>
+              <w:t>Caught near deep coral reefs with a fishing rod.</w:t>
             </w:r>
           </w:p>
         </w:tc>
@@ -10430,7 +10430,7 @@
                 <w:color w:val="505050"/>
                 <w:sz w:val="16"/>
               </w:rPr>
-              <w:t>Vibrant red snapper found patrolling deep rocky reefs.</w:t>
+              <w:t>Fresh raw red snapper fish. Best cooked before eating.</w:t>
             </w:r>
           </w:p>
         </w:tc>
@@ -10628,7 +10628,7 @@
                 <w:color w:val="323232"/>
                 <w:sz w:val="17"/>
               </w:rPr>
-              <w:t>Prized game fish hooked in open ocean waters using advanced rods.</w:t>
+              <w:t>Caught in open ocean waters with a fishing rod.</w:t>
             </w:r>
           </w:p>
         </w:tc>
@@ -10657,7 +10657,7 @@
                 <w:color w:val="505050"/>
                 <w:sz w:val="16"/>
               </w:rPr>
-              <w:t>Sleek Spanish mackerel with firm, prized steaks.</w:t>
+              <w:t>Fresh raw Spanish mackerel. Best grilled or cured.</w:t>
             </w:r>
           </w:p>
         </w:tc>
@@ -10855,7 +10855,7 @@
                 <w:color w:val="323232"/>
                 <w:sz w:val="17"/>
               </w:rPr>
-              <w:t>Hooked in deep ocean currents with sturdy fishing tackle.</w:t>
+              <w:t>Caught in deep ocean waters with a fishing rod.</w:t>
             </w:r>
           </w:p>
         </w:tc>
@@ -10884,7 +10884,7 @@
                 <w:color w:val="505050"/>
                 <w:sz w:val="16"/>
               </w:rPr>
-              <w:t>Yellowfin tuna relative with deep crimson flesh and powerful fins.</w:t>
+              <w:t>Fresh raw yellowfin tuna. Best seared or grilled.</w:t>
             </w:r>
           </w:p>
         </w:tc>
@@ -11082,7 +11082,7 @@
                 <w:color w:val="323232"/>
                 <w:sz w:val="17"/>
               </w:rPr>
-              <w:t>Rare catch landed around rocky sea caves and deep ocean reefs.</w:t>
+              <w:t>Caught around rocky reefs and sea caves with a fishing rod.</w:t>
             </w:r>
           </w:p>
         </w:tc>
@@ -11111,7 +11111,7 @@
                 <w:color w:val="505050"/>
                 <w:sz w:val="16"/>
               </w:rPr>
-              <w:t>Esteemed spotted reef grouper named after the brave chieftain warrior.</w:t>
+              <w:t>Fresh raw reef grouper fish. Best steamed or simmered.</w:t>
             </w:r>
           </w:p>
         </w:tc>
@@ -11309,7 +11309,7 @@
                 <w:color w:val="323232"/>
                 <w:sz w:val="17"/>
               </w:rPr>
-              <w:t>Hooked in muddy swamps, marshy pools, and murky riverbeds.</w:t>
+              <w:t>Caught in muddy freshwater ponds and riverbeds with a fishing rod.</w:t>
             </w:r>
           </w:p>
         </w:tc>
@@ -11338,7 +11338,7 @@
                 <w:color w:val="505050"/>
                 <w:sz w:val="16"/>
               </w:rPr>
-              <w:t>Whiskered freshwater catfish dwelling in muddy bottoms and waterways.</w:t>
+              <w:t>Fresh raw freshwater catfish. Best braised or fried.</w:t>
             </w:r>
           </w:p>
         </w:tc>
@@ -11536,7 +11536,7 @@
                 <w:color w:val="323232"/>
                 <w:sz w:val="17"/>
               </w:rPr>
-              <w:t>Netted or caught with light tackle along shallow coastal shores.</w:t>
+              <w:t>Caught in shallow coastal waters with light tackle or nets.</w:t>
             </w:r>
           </w:p>
         </w:tc>
@@ -11565,7 +11565,7 @@
                 <w:color w:val="505050"/>
                 <w:sz w:val="16"/>
               </w:rPr>
-              <w:t>Tiny anchovies swimming in shimmering schools along shores.</w:t>
+              <w:t>Small fresh raw anchovies. Best pan-fried.</w:t>
             </w:r>
           </w:p>
         </w:tc>
@@ -11763,7 +11763,7 @@
                 <w:color w:val="323232"/>
                 <w:sz w:val="17"/>
               </w:rPr>
-              <w:t>Vibrant reef fish hooked near sunlit coral gardens.</w:t>
+              <w:t>Caught around coral reefs with a fishing rod.</w:t>
             </w:r>
           </w:p>
         </w:tc>
@@ -11792,7 +11792,7 @@
                 <w:color w:val="505050"/>
                 <w:sz w:val="16"/>
               </w:rPr>
-              <w:t>Yellowtail fusilier with radiant crimson-gold scales.</w:t>
+              <w:t>Fresh raw yellowtail fusilier fish. Best pan-fried until crisp.</w:t>
             </w:r>
           </w:p>
         </w:tc>
@@ -11824,7 +11824,7 @@
         <w:rPr>
           <w:i/>
         </w:rPr>
-        <w:t>Nutrient-rich animal cuts, eggs, and farm milks gathered from native domestic animals and livestock.</w:t>
+        <w:t>Raw meats, poultry, eggs, and fresh milk gathered from domestic animals.</w:t>
       </w:r>
     </w:p>
     <w:tbl>
@@ -12230,7 +12230,7 @@
                 <w:color w:val="323232"/>
                 <w:sz w:val="17"/>
               </w:rPr>
-              <w:t>Obtained from native free-range poultry in grassy meadows.</w:t>
+              <w:t>Obtained from poultry in meadows and farms.</w:t>
             </w:r>
           </w:p>
         </w:tc>
@@ -12259,7 +12259,7 @@
                 <w:color w:val="505050"/>
                 <w:sz w:val="16"/>
               </w:rPr>
-              <w:t>Fresh native poultry cut. Lean and flavorful, best stewed in adobo or tinola.</w:t>
+              <w:t>Raw chicken meat for cooking.</w:t>
             </w:r>
           </w:p>
         </w:tc>
@@ -12457,7 +12457,7 @@
                 <w:color w:val="323232"/>
                 <w:sz w:val="17"/>
               </w:rPr>
-              <w:t>Obtained from native wild boars and domesticated pigs.</w:t>
+              <w:t>Obtained from pigs and wild boars.</w:t>
             </w:r>
           </w:p>
         </w:tc>
@@ -12486,7 +12486,7 @@
                 <w:color w:val="505050"/>
                 <w:sz w:val="16"/>
               </w:rPr>
-              <w:t>Succulent cut of native black pig. Essential for classic pork adobo and sinigang.</w:t>
+              <w:t>Raw pork meat for cooking.</w:t>
             </w:r>
           </w:p>
         </w:tc>
@@ -12684,7 +12684,7 @@
                 <w:color w:val="323232"/>
                 <w:sz w:val="17"/>
               </w:rPr>
-              <w:t>Choice cut harvested from prime livestock or rural butchers.</w:t>
+              <w:t>Cut of pork belly from pigs or livestock traders.</w:t>
             </w:r>
           </w:p>
         </w:tc>
@@ -12713,7 +12713,7 @@
                 <w:color w:val="505050"/>
                 <w:sz w:val="16"/>
               </w:rPr>
-              <w:t>Layered fatty pork belly slab, prime cut for crispy lechon kawali.</w:t>
+              <w:t>Raw pork belly slab for roasting and frying.</w:t>
             </w:r>
           </w:p>
         </w:tc>
@@ -12911,7 +12911,7 @@
                 <w:color w:val="323232"/>
                 <w:sz w:val="17"/>
               </w:rPr>
-              <w:t>Harvested from pastoral cattle in highland pasturelands.</w:t>
+              <w:t>Obtained from cattle in pasturelands.</w:t>
             </w:r>
           </w:p>
         </w:tc>
@@ -12940,7 +12940,7 @@
                 <w:color w:val="505050"/>
                 <w:sz w:val="16"/>
               </w:rPr>
-              <w:t>Meaty beef shank bone with rich marrow center from native cattle.</w:t>
+              <w:t>Beef shank with bone marrow for cooking.</w:t>
             </w:r>
           </w:p>
         </w:tc>
@@ -13138,7 +13138,7 @@
                 <w:color w:val="323232"/>
                 <w:sz w:val="17"/>
               </w:rPr>
-              <w:t>Sourced from agile mountain goats navigating cliffside crags.</w:t>
+              <w:t>Obtained from mountain goats.</w:t>
             </w:r>
           </w:p>
         </w:tc>
@@ -13167,7 +13167,7 @@
                 <w:color w:val="505050"/>
                 <w:sz w:val="16"/>
               </w:rPr>
-              <w:t>Lean, aromatic goat meat cut, traditional centerpiece for Kaldereta.</w:t>
+              <w:t>Raw goat meat for stews.</w:t>
             </w:r>
           </w:p>
         </w:tc>
@@ -13365,7 +13365,7 @@
                 <w:color w:val="323232"/>
                 <w:sz w:val="17"/>
               </w:rPr>
-              <w:t>Gathered from riverside duck nesting grounds and farm coops.</w:t>
+              <w:t>Gathered from duck nests and farm coops.</w:t>
             </w:r>
           </w:p>
         </w:tc>
@@ -13394,7 +13394,7 @@
                 <w:color w:val="505050"/>
                 <w:sz w:val="16"/>
               </w:rPr>
-              <w:t>Thick-shelled duck egg, key ingredient for Balut and Itlog na Maalat.</w:t>
+              <w:t>Duck egg used for Balut, salted egg, or cooking.</w:t>
             </w:r>
           </w:p>
         </w:tc>
@@ -13592,7 +13592,7 @@
                 <w:color w:val="323232"/>
                 <w:sz w:val="17"/>
               </w:rPr>
-              <w:t>Gently milked from docile carabaos resting near mud wallows.</w:t>
+              <w:t>Milked from water buffalo.</w:t>
             </w:r>
           </w:p>
         </w:tc>
@@ -13621,7 +13621,7 @@
                 <w:color w:val="505050"/>
                 <w:sz w:val="16"/>
               </w:rPr>
-              <w:t>Rich, creamy milk from Philippine water buffalo. High in butterfat.</w:t>
+              <w:t>Fresh milk from water buffalo.</w:t>
             </w:r>
           </w:p>
         </w:tc>
@@ -13653,7 +13653,7 @@
         <w:rPr>
           <w:i/>
         </w:rPr>
-        <w:t>Foundational crops, milled grains, seasonings, and binding agents essential for preparing the realm's finest dishes.</w:t>
+        <w:t>Grains, seasonings, and basic ingredients used for cooking recipes.</w:t>
       </w:r>
     </w:p>
     <w:tbl>
@@ -14059,7 +14059,7 @@
                 <w:color w:val="323232"/>
                 <w:sz w:val="17"/>
               </w:rPr>
-              <w:t>Cultivated from Tilled Soil or harvested from wild Spud patches.</w:t>
+              <w:t>Harvested from tilled soil or wild potato plants.</w:t>
             </w:r>
           </w:p>
         </w:tc>
@@ -14088,7 +14088,7 @@
                 <w:color w:val="505050"/>
                 <w:sz w:val="16"/>
               </w:rPr>
-              <w:t>Crisp subterranean tuber freshly dug from rich loam. Can be eaten raw in emergencies or cooked in a furnace.</w:t>
+              <w:t>Raw harvested potato. Can be eaten raw or cooked in a furnace.</w:t>
             </w:r>
           </w:p>
         </w:tc>
@@ -14286,7 +14286,7 @@
                 <w:color w:val="323232"/>
                 <w:sz w:val="17"/>
               </w:rPr>
-              <w:t>Harvested from flooded paddy tiles or purchased from rural traders.</w:t>
+              <w:t>Harvested from flooded paddy fields or purchased from traders.</w:t>
             </w:r>
           </w:p>
         </w:tc>
@@ -14315,7 +14315,7 @@
                 <w:color w:val="505050"/>
                 <w:sz w:val="16"/>
               </w:rPr>
-              <w:t>Fragrant polished grain. A meal in Potaria is never complete without rice.</w:t>
+              <w:t>White rice grains for boiling or frying.</w:t>
             </w:r>
           </w:p>
         </w:tc>
@@ -14513,7 +14513,7 @@
                 <w:color w:val="323232"/>
                 <w:sz w:val="17"/>
               </w:rPr>
-              <w:t>Foraged in lowland grassy meadows or cultivated in home gardens.</w:t>
+              <w:t>Foraged in grassy meadows or grown in garden plots.</w:t>
             </w:r>
           </w:p>
         </w:tc>
@@ -14542,7 +14542,7 @@
                 <w:color w:val="505050"/>
                 <w:sz w:val="16"/>
               </w:rPr>
-              <w:t>Pungent native garlic cloves. The aromatic foundation of Filipino cuisine.</w:t>
+              <w:t>Garlic cloves used for sauteing and seasoning.</w:t>
             </w:r>
           </w:p>
         </w:tc>
@@ -14740,7 +14740,7 @@
                 <w:color w:val="323232"/>
                 <w:sz w:val="17"/>
               </w:rPr>
-              <w:t>Cultivated from vegetable seeds or found in agricultural crates.</w:t>
+              <w:t>Grown from seeds or found in crates.</w:t>
             </w:r>
           </w:p>
         </w:tc>
@@ -14769,7 +14769,7 @@
                 <w:color w:val="505050"/>
                 <w:sz w:val="16"/>
               </w:rPr>
-              <w:t>Sweet, vibrant red onion bulbs essential for sauteing.</w:t>
+              <w:t>Red onion bulbs used for sauteing and seasoning.</w:t>
             </w:r>
           </w:p>
         </w:tc>
@@ -14967,7 +14967,7 @@
                 <w:color w:val="323232"/>
                 <w:sz w:val="17"/>
               </w:rPr>
-              <w:t>Harvested from root patches in forest clearings and riverbanks.</w:t>
+              <w:t>Harvested from root patches along riverbanks.</w:t>
             </w:r>
           </w:p>
         </w:tc>
@@ -14996,7 +14996,7 @@
                 <w:color w:val="505050"/>
                 <w:sz w:val="16"/>
               </w:rPr>
-              <w:t>Zesty, warming ginger root that infuses tinola and arroz caldo broth.</w:t>
+              <w:t>Fresh ginger root used for flavoring soups and broths.</w:t>
             </w:r>
           </w:p>
         </w:tc>
@@ -15194,7 +15194,7 @@
                 <w:color w:val="323232"/>
                 <w:sz w:val="17"/>
               </w:rPr>
-              <w:t>Gathered from tropical wild tamarind trees.</w:t>
+              <w:t>Gathered from wild tamarind trees.</w:t>
             </w:r>
           </w:p>
         </w:tc>
@@ -15223,7 +15223,7 @@
                 <w:color w:val="505050"/>
                 <w:sz w:val="16"/>
               </w:rPr>
-              <w:t>Tangy tamarind pods that give Sinigang its signature appetizing sourness.</w:t>
+              <w:t>Sour tamarind pods used for soup broths.</w:t>
             </w:r>
           </w:p>
         </w:tc>
@@ -15421,7 +15421,7 @@
                 <w:color w:val="323232"/>
                 <w:sz w:val="17"/>
               </w:rPr>
-              <w:t>Farmed in fertile soil patches or collected from wild flora.</w:t>
+              <w:t>Harvested from farm soil or wild plants.</w:t>
             </w:r>
           </w:p>
         </w:tc>
@@ -15450,7 +15450,7 @@
                 <w:color w:val="505050"/>
                 <w:sz w:val="16"/>
               </w:rPr>
-              <w:t>Glossy purple tender eggplant, key vegetable for Sinigang and Tortang Talong.</w:t>
+              <w:t>Purple eggplant used for stews and frying.</w:t>
             </w:r>
           </w:p>
         </w:tc>
@@ -15648,7 +15648,7 @@
                 <w:color w:val="323232"/>
                 <w:sz w:val="17"/>
               </w:rPr>
-              <w:t>Cultivated along crop trellises or foraged in bushlands.</w:t>
+              <w:t>Harvested from crop trellises or wild bushes.</w:t>
             </w:r>
           </w:p>
         </w:tc>
@@ -15677,7 +15677,7 @@
                 <w:color w:val="505050"/>
                 <w:sz w:val="16"/>
               </w:rPr>
-              <w:t>Crisp green yardlong beans harvested fresh from farm trellises.</w:t>
+              <w:t>Fresh green string beans for vegetable dishes.</w:t>
             </w:r>
           </w:p>
         </w:tc>
@@ -15875,7 +15875,7 @@
                 <w:color w:val="323232"/>
                 <w:sz w:val="17"/>
               </w:rPr>
-              <w:t>Harvested from pepper vines in deep forest groves.</w:t>
+              <w:t>Harvested from pepper vines in forests.</w:t>
             </w:r>
           </w:p>
         </w:tc>
@@ -15904,7 +15904,7 @@
                 <w:color w:val="505050"/>
                 <w:sz w:val="16"/>
               </w:rPr>
-              <w:t>Whole black peppercorns from aromatic spice groves.</w:t>
+              <w:t>Whole dried black peppercorns.</w:t>
             </w:r>
           </w:p>
         </w:tc>
@@ -16102,7 +16102,7 @@
                 <w:color w:val="323232"/>
                 <w:sz w:val="17"/>
               </w:rPr>
-              <w:t>Picked from native citrus shrubs found near coastal settlements.</w:t>
+              <w:t>Picked from native citrus shrubs near coasts.</w:t>
             </w:r>
           </w:p>
         </w:tc>
@@ -16131,7 +16131,7 @@
                 <w:color w:val="505050"/>
                 <w:sz w:val="16"/>
               </w:rPr>
-              <w:t>Tart and aromatic Philippine lime. Adds bright acidity to dipping sauces.</w:t>
+              <w:t>Sour citrus fruit used for marinades and dipping sauces.</w:t>
             </w:r>
           </w:p>
         </w:tc>
@@ -16329,7 +16329,7 @@
                 <w:color w:val="323232"/>
                 <w:sz w:val="17"/>
               </w:rPr>
-              <w:t>Brewed condiment obtained from general goods traders or fermented cellars.</w:t>
+              <w:t>Purchased from goods traders or crafted from fermented soybeans.</w:t>
             </w:r>
           </w:p>
         </w:tc>
@@ -16358,7 +16358,7 @@
                 <w:color w:val="505050"/>
                 <w:sz w:val="16"/>
               </w:rPr>
-              <w:t>Fermented rich black soy sauce. Savory cornerstone of adobo.</w:t>
+              <w:t>Fermented soy sauce used for seasoning.</w:t>
             </w:r>
           </w:p>
         </w:tc>
@@ -16585,7 +16585,7 @@
                 <w:color w:val="505050"/>
                 <w:sz w:val="16"/>
               </w:rPr>
-              <w:t>Traditional cane and palm vinegar with sharp, clean tartness.</w:t>
+              <w:t>Cane vinegar with a sharp, sour flavor.</w:t>
             </w:r>
           </w:p>
         </w:tc>
@@ -16812,7 +16812,7 @@
                 <w:color w:val="505050"/>
                 <w:sz w:val="16"/>
               </w:rPr>
-              <w:t>Pure crystallized white sea salt harvested from coastal pans.</w:t>
+              <w:t>Coarse white sea salt.</w:t>
             </w:r>
           </w:p>
         </w:tc>
@@ -18372,7 +18372,7 @@
                 <w:color w:val="323232"/>
                 <w:sz w:val="17"/>
               </w:rPr>
-              <w:t>Extracted by tapping mature wild tuber roots and sacred trees.</w:t>
+              <w:t>Extracted by tapping mature potato roots.</w:t>
             </w:r>
           </w:p>
         </w:tc>
@@ -18599,7 +18599,7 @@
                 <w:color w:val="323232"/>
                 <w:sz w:val="17"/>
               </w:rPr>
-              <w:t>Dived and foraged along shallow coastal waters and coral reefs.</w:t>
+              <w:t>Gathered from shallow coastal waters.</w:t>
             </w:r>
           </w:p>
         </w:tc>
@@ -18826,7 +18826,7 @@
                 <w:color w:val="323232"/>
                 <w:sz w:val="17"/>
               </w:rPr>
-              <w:t>Quarried from the frosty peaks of the sub-zero alpine biome.</w:t>
+              <w:t>Quarried from snowy mountain peaks.</w:t>
             </w:r>
           </w:p>
         </w:tc>
@@ -19053,7 +19053,7 @@
                 <w:color w:val="323232"/>
                 <w:sz w:val="17"/>
               </w:rPr>
-              <w:t>Chopped from forest trees using any woodcutting axe.</w:t>
+              <w:t>Chopped from trees using an axe.</w:t>
             </w:r>
           </w:p>
         </w:tc>
@@ -19280,7 +19280,7 @@
                 <w:color w:val="323232"/>
                 <w:sz w:val="17"/>
               </w:rPr>
-              <w:t>Harvested from bioluminescent deep cavern biomes.</w:t>
+              <w:t>Harvested from cavern biomes.</w:t>
             </w:r>
           </w:p>
         </w:tc>

</xml_diff>

<commit_message>
Implement whole-game balance overhaul, 5-active-meal buff system, and equipment tuning
</commit_message>
<xml_diff>
--- a/Potaria_Cookbook.docx
+++ b/Potaria_Cookbook.docx
@@ -63,7 +63,10 @@
         <w:spacing w:line="276" w:lineRule="auto" w:after="160"/>
       </w:pPr>
       <w:r>
-        <w:t>Culinary craft in the world of Potaria represents one of the most vital disciplines for survival, exploration, and legendary triumph. While potions offer instantaneous medicinal alchemy, prepared meals provide profound vitality, replenishing substantial Health Points (HP) to keep adventurers thriving through unforgiving boss battles and deep cavern descents.</w:t>
+        <w:t>Culinary craft in the world of Potaria represents one of the most vital disciplines for survival, exploration, and legendary triumph. While potions offer instantaneous medicinal alchemy, prepared meals provide profound vitality, replenishing substantial Health Points (HP) and conferring tactical nourishment through the 5-Active-Meal-Buff Architecture.</w:t>
+        <w:br/>
+        <w:br/>
+        <w:t>Under this gastronomic discipline, adventurers may maintain up to five distinct active food buffs simultaneously—strictly one meal per category: Offense, Defense, Mobility, Resource, and Utility. Consuming a subsequent dish within an already occupied category cleanly replaces the existing buff with the new recipe's full authored duration, preventing runaway magnitude or duration stacking while empowering deliberate, strategic feast crafting.</w:t>
       </w:r>
     </w:p>
     <w:p>
@@ -4366,7 +4369,7 @@
                 <w:color w:val="228B22"/>
                 <w:sz w:val="15"/>
               </w:rPr>
-              <w:t>+110 HP</w:t>
+              <w:t>+90 HP</w:t>
               <w:br/>
               <w:t>[MOBILITY] +12% Movement Speed (3m)</w:t>
             </w:r>

</xml_diff>